<commit_message>
Proofread Norwegian edition: 420 fixes applied, 11 decisions logged
Co-Authored-By: Claude Opus 5.5 <noreply@anthropic.com>
Claude-Session: https://claude.ai/code/session_015bGU9R5VguxHZDVriTWnnq
</commit_message>
<xml_diff>
--- a/corrected/Inn Trouble - ASSEMBLED - FORMATTED_Norwegian.docx
+++ b/corrected/Inn Trouble - ASSEMBLED - FORMATTED_Norwegian.docx
@@ -127,7 +127,7 @@
     <w:p/>
     <w:p>
       <w:r>
-        <w:t>Jessica Claus begynner der kunnskapen kan ha kommet fra, heller enn der byen gjerne vil at den skal lede. En smed skyldte tjue dollar og nektet å gi et rett svar. En fremmed som deler ut kort om en savnet brosje til alle som vil ha et. En historiker som sover på en feltseng ved siden av en kjele han ikke har råd til å fikse.</w:t>
+        <w:t xml:space="preserve">Jessica Claus begynner der kunnskapen kan ha kommet fra, heller enn der byen gjerne vil at den skal lede. En smed skyldte tjue dollar og nektet å gi et rett svar. En fremmed som deler ut kort om en savnet brosje til alle som vil ha et. En historiker som sover på en feltseng ved siden av en fyrkjele han ikke har råd til å fikse.</w:t>
       </w:r>
     </w:p>
     <w:p/>
@@ -168,7 +168,7 @@
     </w:p>
     <w:p>
       <w:r>
-        <w:t>Jeg elsket det. Spinnvettet hadde kommet opp med den første kalde morgenen, og jeg har tilbrakt en hel del år av mitt lange liv på et sted der de eneste naboene var alver og reinsdyr, med en ektemann som nynnet for seg selv i verkstedet, så jeg kommer aldri til å ta en gate full av gresskar for gitt. Mr. Kim hadde skåret ut en hel rad av dem utenfor bilverkstedet, og hver og en bar en liten mekanikklue av papir. Lokalaviskontoret hadde et skjelett i vinduet som leste en avis. Noen, og jeg mistenkte Olivia, hadde strikket en oransje lue til brannhydranten utenfor Yarn Tales.</w:t>
+        <w:t xml:space="preserve">Jeg elsket det. Spinnvevet hadde kommet opp med den første kalde morgenen, og jeg har tilbrakt en hel del år av mitt lange liv på et sted der de eneste naboene var alver og reinsdyr, med en ektemann som nynnet for seg selv i verkstedet, så jeg kommer aldri til å ta en gate full av gresskar for gitt. Herr Kim hadde skåret ut en hel rad av dem utenfor bilverkstedet, og hver og en bar en liten mekanikklue av papir. Lokalaviskontoret hadde et skjelett i vinduet som leste en avis. Noen, og jeg mistenkte Olivia, hadde strikket en oransje lue til brannhydranten utenfor Yarn Tales.</w:t>
       </w:r>
     </w:p>
     <w:p>
@@ -178,7 +178,7 @@
     </w:p>
     <w:p>
       <w:r>
-        <w:t>Winter Wonderland Inn lå der Evergreen Avenue utvidet seg mot bygdetunet, et høyt hus med gavler malt i den myke grågrønne fargen til en vinterhimmel, med en veranda som slynget seg rundt to sider av det som en arm lagt rundt skuldrene på en venn. Det så ut som om det hadde grodd opp der heller enn å være bygd. Fiona hadde hengt en krans på ytterdøren, og jeg stanset nederst på trappen for å beundre den, slik jeg gjorde hver gang jeg gikk forbi. Den var en tykk ring av eviggrønt, tett og mørk, tredd med et bredt gullbånd og besatt med kongler hun hadde forgylt selv, med en enslig kvist bitterhet for sesongens oransje farge.</w:t>
+        <w:t xml:space="preserve">Winter Wonderland Inn lå der Evergreen Avenue utvidet seg mot allmenningen, et høyt hus med gavler malt i den myke grågrønne fargen til en vinterhimmel, med en veranda som slynget seg rundt to sider av det som en arm lagt rundt skuldrene på en venn. Det så ut som om det hadde grodd opp der heller enn å være bygd. Fiona hadde hengt en krans på ytterdøren, og jeg stanset nederst på trappen for å beundre den, slik jeg gjorde hver gang jeg gikk forbi. Den var en tykk ring av eviggrønt, tett og mørk, tredd med et bredt gullbånd og besatt med kongler hun hadde forgylt selv, med en enslig kvist bitterhet for sesongens oransje farge.</w:t>
       </w:r>
     </w:p>
     <w:p>
@@ -198,7 +198,7 @@
     </w:p>
     <w:p>
       <w:r>
-        <w:t>Lobbyen var god og gjennomvarm av en peisild som hadde brent siden før daggry. Den luktet av kaffe og vedrøyk lagt over den eldre lukten av selve huset, bivoks og gammelt treverk. Gjester satt henslengt i de lave stolene, et par ved vinduet med et kart bredt ut mellom seg, en eldre dame ved peisen med en pocketbok, og rommet bar på den uanstrengte summingen til et sted der folk trives. Det var en ny lukt under alt sammen denne morgenen, riktignok, skarp og litt metallisk, som jeg ikke helt klarte å plassere til å begynne med. Da jeg så meg om, skjønte jeg det. Sam Patels smiearbeid var overalt hvor jeg snudde meg. Han hadde laget lampene langs veggene, det høye peisskjermbrettet ved ilyet og en rad svarte jernstjerner langs kaminhyllen til festivalen, og hele det fremre rommet hadde fått et svakt, rent preg av smia, arbeidet inn i luften som lukten av brød på et kjøkken.</w:t>
+        <w:t xml:space="preserve">Lobbyen var god og gjennomvarm av en peisild som hadde brent siden før daggry. Den luktet av kaffe og vedrøyk lagt over den eldre lukten av selve huset, bivoks og gammelt treverk. Gjester satt henslengt i de lave stolene, et par ved vinduet med et kart bredt ut mellom seg, en eldre dame ved peisen med en pocketbok, og rommet bar på den uanstrengte summingen til et sted der folk trives. Det var en ny lukt under alt sammen denne morgenen, riktignok, skarp og litt metallisk, som jeg ikke helt klarte å plassere til å begynne med. Da jeg så meg om, skjønte jeg det. Sam Patels smiearbeid var overalt hvor jeg snudde meg. Han hadde laget lampeholderne langs veggene, det høye peisskjermbrettet ved ildstedet og en rad svarte jernstjerner langs kaminhyllen til festivalen, og hele det fremre rommet hadde fått et svakt, rent preg av smia, arbeidet inn i luften som lukten av brød på et kjøkken.</w:t>
       </w:r>
     </w:p>
     <w:p>
@@ -208,12 +208,12 @@
     </w:p>
     <w:p>
       <w:r>
-        <w:t>Hun sto bak resepsjonsdisken og snurret en penn rundt og rundt. Fiona var en kvinne skapt for godt humør. Hun var rund og rask, rask i bevegelsene og raskere til å le, med en latter som begynte et sted dypt nede og kom veltende på én gang. Det gode humøret hadde rent ut av henne som varme ut av et rom med åpen dør. Det var mørke ringer under øynene hennes som ikke engang pudder hadde klart å dekke. Kardiganen hennes var knappe feil med en knapp. Da hun fikk øye på meg, gjorde hun det som plagde meg mer enn skyggene: Hun ordnet på ansiktet sitt. Hun tok på seg velkomsten, helt bevisst, som en kvinne som tar på seg en kappe hun er for sliten til å bære, og kom rundt disken mot meg.</w:t>
-      </w:r>
-    </w:p>
-    <w:p>
-      <w:r>
-        <w:t>– Jessica. Stemmen hennes var til og med gal, tynn der den burde ha vært varm. – Det skulle du virkelig ikke ha gjort.</w:t>
+        <w:t xml:space="preserve">Hun sto bak resepsjonsdisken og snurret en penn rundt og rundt. Fiona var en kvinne skapt for godt humør. Hun var rund og rask, rask i bevegelsene og raskere til å le, med en latter som begynte et sted dypt nede og kom veltende på én gang. Det gode humøret hadde rent ut av henne som varme ut av et rom med åpen dør. Det var mørke ringer under øynene hennes som ikke engang pudder hadde klart å dekke. Kardiganen hennes var kneppet skjevt med én knapp. Da hun fikk øye på meg, gjorde hun det som plagde meg mer enn skyggene: Hun ordnet på ansiktet sitt. Hun tok på seg velkomsten, helt bevisst, som en kvinne som tar på seg en kappe hun er for sliten til å bære, og kom rundt disken mot meg.</w:t>
+      </w:r>
+    </w:p>
+    <w:p>
+      <w:r>
+        <w:t xml:space="preserve">– Jessica. Til og med stemmen hennes var feil, tynn der den burde ha vært varm. – Det skulle du virkelig ikke ha gjort.</w:t>
       </w:r>
     </w:p>
     <w:p>
@@ -233,22 +233,22 @@
     </w:p>
     <w:p>
       <w:r>
-        <w:t>Ytterdøren gikk opp i et gufs med kald luft som fikk ilden til å blafre urolig, og et par kom inn. Alt ved Fiona forandret seg på en gang. Hun rettet seg opp. Hun satte kurven fra seg på disken. Smilet hun fant frem til de nykommere, var ekte, eller nært nok ekte til at bare noen som fulgte nøye med, ville ha sett arbeidet som lå bak.</w:t>
-      </w:r>
-    </w:p>
-    <w:p>
-      <w:r>
-        <w:t>– Mr. Worthington, Mrs. Worthington, sa hun. – God morgen. Har dere kommet dere vel på plass?</w:t>
-      </w:r>
-    </w:p>
-    <w:p>
-      <w:r>
-        <w:t>– Mer enn på plass. Mannen var sølvhåret og pent strøket, blid og ustresset, en mann som åpenbart aldri hadde trengt å vente på tur. Kona hans bar en kashmirgenser i fargen krem og perleøredobber, nei, diamanter, små noen, som fanget peislyset da hun snudde på hodet og strødde det utover taket. – Vi håpet, Fiona, at vi kanskje kunne få beholde suiten en uke til. Vi har forelsket oss fullstendig i dette stedet. Kona mi sier at hun ikke har sovet så godt på år og dag.</w:t>
-      </w:r>
-    </w:p>
-    <w:p>
-      <w:r>
-        <w:t>– Det er stillheten, sa Mrs. Worthington. – Og teppene. Jeg glemmer stadig å spørre hvem som har laget dem.</w:t>
+        <w:t xml:space="preserve">Ytterdøren gikk opp i et gufs med kald luft som fikk ilden til å blafre urolig, og et par kom inn. Alt ved Fiona forandret seg på en gang. Hun rettet seg opp. Hun satte kurven fra seg på disken. Smilet hun fant frem til nykommerne, var ekte, eller nært nok ekte til at bare noen som fulgte nøye med, ville ha sett arbeidet som lå bak.</w:t>
+      </w:r>
+    </w:p>
+    <w:p>
+      <w:r>
+        <w:t xml:space="preserve">– Herr Worthington, fru Worthington, sa hun. – God morgen. Har dere kommet dere vel på plass?</w:t>
+      </w:r>
+    </w:p>
+    <w:p>
+      <w:r>
+        <w:t xml:space="preserve">– Mer enn på plass. Mannen var sølvhåret og pent strøket, blid og ustresset, en mann som åpenbart aldri hadde trengt å vente på tur. Kona hans bar en kashmirgenser i fargen krem og perleøredobber, nei, diamanter, små sådanne, som fanget peislyset da hun snudde på hodet og strødde det utover taket. – Vi håpet, Fiona, at vi kanskje kunne få beholde suiten en uke til. Vi har forelsket oss fullstendig i dette stedet. Kona mi sier at hun ikke har sovet så godt på år og dag.</w:t>
+      </w:r>
+    </w:p>
+    <w:p>
+      <w:r>
+        <w:t xml:space="preserve">– Det er stillheten, sa fru Worthington. – Og teppene. Jeg glemmer stadig å spørre hvem som har laget dem.</w:t>
       </w:r>
     </w:p>
     <w:p>
@@ -278,7 +278,7 @@
     </w:p>
     <w:p>
       <w:r>
-        <w:t>Det var Sam Patel denne gangen, som rygget inn med en kasse full av jern i armene, og verandaforankringene klirret dempet mot hverandre mens han snudde seg og satte dem fra seg ved disken med et stønn. Sam var en stor, omhyggelig mann med sot som hadde satt seg så langt inn i foldene på knokene at jeg tvilte på at såpe kunne nå dem lenger, og vanligvis hadde han en håndverkers rolige fatning. Det fantes ikke noe igjen av den nå. Han krysset gulvet mot Fiona med fast stram kjeve.</w:t>
+        <w:t xml:space="preserve">Det var Sam Patel denne gangen, som rygget inn med en kasse full av jern i armene, og verandabrakettene klirret dempet mot hverandre mens han snudde seg og satte dem fra seg ved disken med et stønn. Sam var en stor, omhyggelig mann med sot som hadde satt seg så langt inn i foldene på knokene at jeg tvilte på at såpe kunne nå dem lenger, og vanligvis hadde han en håndverkers rolige fatning. Det fantes ikke noe igjen av den nå. Han krysset gulvet mot Fiona med fast stram kjeve.</w:t>
       </w:r>
     </w:p>
     <w:p>
@@ -313,7 +313,7 @@
     </w:p>
     <w:p>
       <w:r>
-        <w:t>– Vakkert arbeid, det smijernsarbeidet der. Fremmedarbeideren var spenstig, kvikk i øynene og et sted midt i femtiårene, velkledd på den litt skrukketrete måten til en mann som reiser mye. Han holdt en liten notisbok i hånden som han ikke gjorde noe forsøk på å skjule. Han nikket etter Sam. – Lokal smed? Man kan alltid se om det er lokalt. Det er en viss selvfølge over det. Og dette huset. Han snudde seg uforstyrret for å ta inn lobbyen, den buede trappen, det gamle gipsmedaljongen midt i taket. – Nå snakker vi et hus med historie. Familiebedrift, vil jeg anslå. Generasjoner med det.</w:t>
+        <w:t xml:space="preserve">– Vakkert arbeid, det smijernsarbeidet der. Den fremmede var spenstig, kvikk i øynene og et sted midt i femtiårene, velkledd på den litt skrukkete måten til en mann som reiser mye. Han holdt en liten notisbok i hånden som han ikke gjorde noe forsøk på å skjule. Han nikket etter Sam. – Lokal smed? Man kan alltid se om det er lokalt. Det er en viss selvfølge over det. Og dette huset. Han snudde seg uforstyrret for å ta inn lobbyen, den buede trappen, den gamle gipsmedaljongen midt i taket. – Nå snakker vi et hus med historie. Familiebedrift, vil jeg anslå. Generasjoner med det.</w:t>
       </w:r>
     </w:p>
     <w:p>
@@ -333,7 +333,7 @@
     </w:p>
     <w:p>
       <w:r>
-        <w:t>– Claus. Han smilte, og det var et godt smil, avslappet og innøvd, men jeg stolte på det så langt som jeg kunne ha kastet peisskjermen. – Da er du altså den berømte Mrs. Claus. Så ufattelig herlig. Jeg hadde hørt det, selvsagt, man hører jo i hverdagen, men jeg trodde ikke helt på det før nå. Han lente seg litt frem, tillitsfullt. – Fortell meg. De gamle familiene her, Blackburn-slekten og resten, fins tingene deres fremdeles i byen? Arvestykker, møbler, smykker, den slags? Jeg leter tilfeldigvis etter en gjenstand. En brosje.</w:t>
+        <w:t xml:space="preserve">– Claus. Han smilte, og det var et godt smil, avslappet og innøvd, men jeg stolte på det så langt som jeg kunne ha kastet peisskjermen. – Da er du altså den berømte fru Claus. Så ufattelig herlig. Jeg hadde hørt det, selvsagt, man hører jo ting, men jeg trodde ikke helt på det før nå. Han lente seg litt frem, tillitsfullt. – Fortell meg. De gamle familiene her, Blackburn-slekten og resten, fins tingene deres fremdeles i byen? Arvestykker, møbler, smykker, den slags? Jeg leter tilfeldigvis etter en gjenstand. En brosje.</w:t>
       </w:r>
     </w:p>
     <w:p>
@@ -368,12 +368,12 @@
     </w:p>
     <w:p>
       <w:r>
-        <w:t>– Jada. Jada, selvsagt er det det. Han klikket på pennen sin, puttet den i brystlommen og ga meg et lite nikk. – Vel. En sann fornøyelse, Mrs. Claus. Jeg regner med at jeg treffer på deg her og der. Det er en slik by, er det ikke? Alle ser alle. Og han tuslet av sted mot trappene med hendene i lommene, mens han kikket opp på gipsmedaljongen i taket idet han gikk.</w:t>
-      </w:r>
-    </w:p>
-    <w:p>
-      <w:r>
-        <w:t>Jeg tok med meg Pip, som i mellomtiden hadde karret seg tvers over lobbyen til et lite bord ved trappene og det store, glitrende midtpunktet på det, en fasettert krystallbolle med glassfrukt som kastet regnbuer omkring seg da flammene fanget den. Hun sto med nebbet omtrent en tomme fra en glasspære, og vibrerte svakt av begjær.</w:t>
+        <w:t xml:space="preserve">– Jada. Jada, selvsagt er det det. Han klikket på pennen sin, puttet den i brystlommen og ga meg et lite nikk. – Vel. En sann fornøyelse, fru Claus. Jeg regner med at jeg treffer på deg her og der. Det er en slik by, er det ikke? Alle ser alle. Og han tuslet av sted mot trappene med hendene i lommene, mens han kikket opp på gipsmedaljongen i taket idet han gikk.</w:t>
+      </w:r>
+    </w:p>
+    <w:p>
+      <w:r>
+        <w:t xml:space="preserve">Jeg tok med meg Pip, som i mellomtiden hadde karret seg tvers over lobbyen til et lite bord ved trappene og det store, glitrende midtpunktet på det, en fasettert krystallbolle med glassfrukt som kastet regnbuer omkring seg da flammene fanget den. Hun sto med nebbet omtrent et par centimeter fra en glasspære, og vibrerte svakt av begjær.</w:t>
       </w:r>
     </w:p>
     <w:p>
@@ -383,12 +383,12 @@
     </w:p>
     <w:p>
       <w:r>
-        <w:t>Hun sendte meg et blikk preget av dyp og eldgammel svikfølelse. Så, siden hun ikke var fremmed for å være smålåten, dultet hun bort i bordet med skulderen idet hun gikk forbi. Hele krystalloppsetningen gynget. En halv dose gjester trakk pusten skarpt på én gang, den eldre damen ved peisen halvveis reiste seg fra stolen, og bollen gynget på plass igjen. Jeg fikk geleidet oss begge ut gjennom ytterdøren og ut på verandaen før min vanærede pingvin rakk å fullføre det hun hadde begynt på.</w:t>
-      </w:r>
-    </w:p>
-    <w:p>
-      <w:r>
-        <w:t>Ute var kulden en velsignelse etter den tette, varme uroen inne i lobbyen. Jeg sto et øyeblikk ved verandarekkverket og lot den friske opp hodet mitt. Nede på tunet holdt menn på stiger på å strekke festivallysene mellom lyktestolpene og ropte til hverandre. En hund gjødde et sted borte ved parken, og toget ga fra seg det fjerne fløytesignalet sitt idet det rullet inn på stasjonen. Alt sammen var så hverdagslig at det feilaktige i Fionas ansikt et øyeblikk virket som noe jeg hadde forestilt meg.</w:t>
+        <w:t xml:space="preserve">Hun sendte meg et blikk preget av dyp og eldgammel svikfølelse. Så, siden hun ikke var fremmed for å være smålig, dultet hun bort i bordet med skulderen idet hun gikk forbi. Hele krystalloppsetningen gynget. Et halvt dusin gjester trakk pusten skarpt på én gang, den eldre damen ved peisen halvveis reiste seg fra stolen, og bollen gynget på plass igjen. Jeg fikk geleidet oss begge ut gjennom ytterdøren og ut på verandaen før min skammelige pingvin rakk å fullføre det hun hadde begynt på.</w:t>
+      </w:r>
+    </w:p>
+    <w:p>
+      <w:r>
+        <w:t xml:space="preserve">Ute var kulden en velsignelse etter den tette, varme uroen inne i lobbyen. Jeg sto et øyeblikk ved verandarekkverket og lot den friske opp hodet mitt. Nede på allmenningen holdt menn på stiger på å strekke festivallysene mellom lyktestolpene og ropte til hverandre. En hund gjødde et sted borte ved parken, og toget ga fra seg det fjerne fløytesignalet sitt idet det rullet inn på stasjonen. Alt sammen var så hverdagslig at det feilaktige i Fionas ansikt et øyeblikk virket som noe jeg hadde forestilt meg.</w:t>
       </w:r>
     </w:p>
     <w:p>
@@ -418,12 +418,12 @@
     </w:p>
     <w:p>
       <w:r>
-        <w:t>Det var ingenting. En løs ledning. Et spill av kulden på slitne øyne. Jeg gjentok det for meg selv hele veien opp Evergreen Avenue, forbi bakeriet der morgensidene fylte hele kvartalet med lukten av ferskt brød, forbi det grønne tunet med de halvt uthengte lysene, forbi lokalavisens avislesende skjelett. En løs ledning. Det var det hele.</w:t>
-      </w:r>
-    </w:p>
-    <w:p>
-      <w:r>
-        <w:t>Men jeg hadde levd lenge side om side med julens magi, og jeg visste hvordan det føltes når den rørte på seg. Jeg hadde kjent det i Frost Falls i dager nå, en skarp egg i luften som været som slår om før himmelen viser det.</w:t>
+        <w:t xml:space="preserve">Det var ingenting. En løs ledning. Et spill av kulden på slitne øyne. Jeg gjentok det for meg selv hele veien opp Evergreen Avenue, forbi bakeriet der morgenbaksten fylte hele kvartalet med lukten av ferskt brød, forbi allmenningen med de halvt uthengte lysene, forbi lokalavisens avislesende skjelett. En løs ledning. Det var det hele.</w:t>
+      </w:r>
+    </w:p>
+    <w:p>
+      <w:r>
+        <w:t xml:space="preserve">Men jeg hadde levd lenge side om side med julens magi, og jeg visste hvordan det føltes når den rørte på seg. Jeg hadde kjent det i Frost Falls i dager nå, en skarp egg i luften som når været slår om før himmelen viser det.</w:t>
       </w:r>
     </w:p>
     <w:p>
@@ -438,7 +438,7 @@
     </w:p>
     <w:p>
       <w:r>
-        <w:t>Hun kvitret angrende. Vi gikk hjem i den gullkalde morgenen, og jeg snudde meg ikke for å se tilbake på vertshusets takskjegg, selv om en del av meg hadde lyst til å sjekke om lysene der fremdeles var oransje eller hadde gått stille tilbake til gull mens jeg hadde ryggen til.</w:t>
+        <w:t xml:space="preserve">Hun kvitret uten snev av anger. Vi gikk hjem i den gullkalde morgenen, og jeg snudde meg ikke for å se tilbake på vertshusets takskjegg, selv om en del av meg hadde lyst til å sjekke om lysene der fremdeles var oransje eller hadde gått stille tilbake til gull mens jeg hadde ryggen til.</w:t>
       </w:r>
     </w:p>
     <w:p>
@@ -468,7 +468,7 @@
     </w:p>
     <w:p>
       <w:r>
-        <w:t>– Jeg kommer. Jeg holdt allerede på å løsne kntingen på forkleet med én hånd. – Er du skadet? Er noen skadet?</w:t>
+        <w:t xml:space="preserve">– Jeg kommer. Jeg holdt allerede på å løsne knuten på forkleet med én hånd. – Er du skadet? Er noen skadet?</w:t>
       </w:r>
     </w:p>
     <w:p>
@@ -483,7 +483,7 @@
     </w:p>
     <w:p>
       <w:r>
-        <w:t>Jeg dekket den utrullede deigen med et fuktig klede så den ikke skulle tørke ut, og tok kappen av knaggen ved døren. Pip var der før jeg hadde fått igjen den første knappen, vraltende i en stram, engstelig sirkel.</w:t>
+        <w:t xml:space="preserve">Jeg dekket den utrullede deigen med et fuktig klede så den ikke skulle tørke ut, og tok kåpen av knaggen ved døren. Pip var der før jeg hadde fått igjen den første knappen, vraltende i en stram, engstelig sirkel.</w:t>
       </w:r>
     </w:p>
     <w:p>
@@ -498,17 +498,17 @@
     </w:p>
     <w:p>
       <w:r>
-        <w:t>Winter Wonderland Inn kom til syne da vi svingte mot allmenningen, dens grågrønne fasade og kransen med det gule båndet helt nøyaktig som dagen før, og likevel så hele stedet annerledes ut for meg nå, forandret av intet annet enn at jeg visste det var bråk på innsiden. Kransen fanget det tidlige lyset. Vinduene var mørke, bortsett fra ett.</w:t>
-      </w:r>
-    </w:p>
-    <w:p>
-      <w:r>
-        <w:t>Jeg dytter opp den tunge ytterdøren, og den kjente knirkingen lød altfor høyt i den dempede foajeen. Ilden var tent, men bare så vidt, og det var ingen andre gjester der ennå, bare den eldre kvinnen fra dagen før, i den samme stolen ved ildstedet med den samme pocketboken. Hun så opp på meg over lesebrillene med en slik oppriktig nysgjerrighet som bare folk har når de ikke har noe annet å gjøre enn å stirre på foajeen, og blikket hennes fulgte meg hele veien over rommet. Jeg har aldri likt å bli stirret på på et sted som burde være vennlig, og jeg likte det enda mindre den morgenen.</w:t>
-      </w:r>
-    </w:p>
-    <w:p>
-      <w:r>
-        <w:t>Fiona dukket opp fra en sidedør før jeg var halvveis, med et dratt og blekt ansikt, med kardiganen feilknappet i dag, men ellers var alt galt med henne. Hun tok tak i armen min med en kald hånd og trakk meg inn i det lille sitterommet ved siden av foajeen, det hun brukte til private samtaler og ettermiddagste med venner. Hun lukket døren bak oss, og de dempede lydene fra det våknende vertshuset stilnet. Bestemorsklokken i hjørnet tikket. Det var det mest støyende i hele rommet.</w:t>
+        <w:t xml:space="preserve">Winter Wonderland Inn kom til syne da vi svingte mot allmenningen, dens grågrønne fasade og kransen med gullbåndet helt nøyaktig som dagen før, og likevel så hele stedet annerledes ut for meg nå, forandret av intet annet enn at jeg visste det var trøbbel der inne. Kransen fanget det tidlige lyset. Vinduene var mørke, bortsett fra ett.</w:t>
+      </w:r>
+    </w:p>
+    <w:p>
+      <w:r>
+        <w:t xml:space="preserve">Jeg dyttet opp den tunge ytterdøren, og den kjente knirkingen lød altfor høyt i den dempede foajeen. Ilden var tent, men bare så vidt, og det var ingen andre gjester der ennå, bare den eldre kvinnen fra dagen før, i den samme stolen ved ildstedet med den samme pocketboken. Hun så opp på meg over lesebrillene med en slik oppriktig nysgjerrighet som bare folk har når de ikke har noe annet å gjøre enn å stirre på foajeen, og blikket hennes fulgte meg hele veien over rommet. Jeg har aldri likt å bli stirret på på et sted som burde være vennlig, og jeg likte det enda mindre den morgenen.</w:t>
+      </w:r>
+    </w:p>
+    <w:p>
+      <w:r>
+        <w:t xml:space="preserve">Fiona dukket opp fra en sidedør før jeg var halvveis, med et dratt og blekt ansikt, med kardiganen riktig knappet i dag, men alt annet ved henne var galt. Hun tok tak i armen min med en kald hånd og trakk meg inn i det lille sitterommet ved siden av foajeen, det hun brukte til private samtaler og ettermiddagste med venner. Hun lukket døren bak oss, og de dempede lydene fra det våknende vertshuset stilnet. Gulvuret i hjørnet tikket. Det var det mest støyende i hele rommet.</w:t>
       </w:r>
     </w:p>
     <w:p>
@@ -523,7 +523,7 @@
     </w:p>
     <w:p>
       <w:r>
-        <w:t>Hun satte seg ikke. Hun gikk i stedet til det lille skrivebordet i hjørnet og åpnet den øverste skuffen med hender som ikke helt ville gjøre som hun ville, mens hun fomlet med det lille messinghåndtaket. Hun tok ut to ting og strakte dem frem til meg uten et ord. Et brettet ark. Et gammelt fotografi, brunt og mykt av elda i kantene.</w:t>
+        <w:t xml:space="preserve">Hun satte seg ikke. Hun gikk i stedet til det lille skrivebordet i hjørnet og åpnet den øverste skuffen med hender som ikke helt ville gjøre som hun ville, mens hun fomlet med det lille messinghåndtaket. Hun tok ut to ting og strakte dem frem til meg uten et ord. Et brettet ark. Et gammelt fotografi, brunt og mykt av elde i kantene.</w:t>
       </w:r>
     </w:p>
     <w:p>
@@ -539,12 +539,12 @@
         <w:rPr>
           <w:i/>
         </w:rPr>
-        <w:t>Jeg vet hvordan familien din kom over dette vertshuset. Jeg vet om brosjen oldemor tok fra Blackburn-familien, den med safiren i hjørnet, og butikken i Ridgeline der hun solgte den for å kjøpe dette stedet. Betal, eller hele byen får vite sannheten. Legg pengene under vertshusets inngangstrapp. Ta ned det gule båndet på kransen og heng opp et rødt i stedet, så jeg vet at pengene er der.</w:t>
-      </w:r>
-    </w:p>
-    <w:p>
-      <w:r>
-        <w:t>Jeg leste det gjennom to ganger. Bestemorsklokken tikket. Noe i ordvalget hogg seg fast i meg. Safiren i hjørnet. En rar, myk, nesten øm måte for en utpresser å omtale en stjålet stein på, som en frase løftet ut av en bok. Jeg lot det ligge. Jeg hadde større ting foran meg akkurat da enn en fremmeds vendinger.</w:t>
+        <w:t xml:space="preserve">Jeg vet hvordan familien din kom over dette vertshuset. Jeg vet om brosjen oldemor tok fra Blackburn-familien, den med safiren i hjertet, og butikken i Ridgeline der hun solgte den for å kjøpe dette stedet. Betal, eller hele byen får vite sannheten. Legg pengene under vertshusets inngangstrapp. Ta ned gullbåndet på kransen og heng opp et rødt i stedet, så jeg vet at pengene er der.</w:t>
+      </w:r>
+    </w:p>
+    <w:p>
+      <w:r>
+        <w:t xml:space="preserve">Jeg leste det gjennom to ganger. Gulvuret tikket. Noe i ordvalget hogg seg fast i meg. Safiren i hjertet. En rar, myk, nesten øm måte for en utpresser å omtale en stjålet stein på, som en frase løftet ut av en bok. Jeg lot det ligge. Jeg hadde større ting foran meg akkurat da enn en fremmeds vendinger.</w:t>
       </w:r>
     </w:p>
     <w:p>
@@ -594,7 +594,7 @@
     </w:p>
     <w:p>
       <w:r>
-        <w:t>Tyngden av det la seg over det lille rommet. Jeg satt med fotografiet i den ene hånden og brevet i den andre og prøvde å ta det inn. Vertshuset, der halve byen hadde feiret et eller annet til en hver tid, bygget på et tyveri et århundre tilbake i tid.</w:t>
+        <w:t xml:space="preserve">Tyngden av det la seg over det lille rommet. Jeg satt med fotografiet i den ene hånden og brevet i den andre og prøvde å ta det inn. Vertshuset, der halve byen hadde feiret et eller annet på et eller annet tidspunkt, bygget på et tyveri et århundre tilbake i tid.</w:t>
       </w:r>
     </w:p>
     <w:p>
@@ -613,7 +613,7 @@
         <w:t>ikke mist denne</w:t>
       </w:r>
       <w:r>
-        <w:t>. Så selvfølgelig åpnet jeg den. En liten, brukket latter. – Brev. En pantelapp, den ekte, fra butikken i Ridgeline, med dato og beløp. En del andre ting. Alt sammen brettet sammen smått og stukket inn i hjørnene, som noe du ikke bærer over med å kaste og ikke bærer over med å se på heller. Moren min visste det. Hennes mor visste det. Og nå vet jeg det. Og ikke en av oss har sagt det til et levende menneske. Hun så opp på meg, og øynene var sårbare. – Hvem kunne jeg fortelle det til? Hvordan forteller man noen en sånn ting? Hvordan ville de se på meg, på vertshuset, om de visste det?</w:t>
+        <w:t xml:space="preserve">. Så selvfølgelig åpnet jeg den. En liten, brukket latter. – Brev. En pantelapp, den ekte, fra butikken i Ridgeline, med dato og beløp. En del andre ting. Alt sammen brettet sammen smått og stukket inn i hjørnene, som noe du ikke klarer å kaste og ikke klarer å se på heller. Moren min visste det. Hennes mor visste det. Og nå vet jeg det. Og ikke en av oss har sagt det til et levende menneske. Hun så opp på meg, og øynene var sårbare. – Hvem kunne jeg fortelle det til? Hvordan forteller man noen en sånn ting? Hvordan ville de se på meg, på vertshuset, om de visste det?</w:t>
       </w:r>
     </w:p>
     <w:p>
@@ -638,7 +638,7 @@
     </w:p>
     <w:p>
       <w:r>
-        <w:t>– Fiona, sa jeg langsomt og senket brevet. – Les det igjen. Det nevner safiren. Safiren i hjørnet, akkurat de ordene. Og den nevner Ridgeline, der hun solgte den. Jeg snudde fotografiet mot henne, med fingeren nær den bleke gløden av edelstenen ved kvinnens hals. – Har du noen gang fortalt noen de to tingene? At hun solgte den i Ridgeline? At stenen var en safir?</w:t>
+        <w:t xml:space="preserve">– Fiona, sa jeg langsomt og senket brevet. – Les det igjen. Det nevner safiren. Safiren i hjertet, akkurat de ordene. Og det nevner Ridgeline, der hun solgte den. Jeg snudde fotografiet mot henne, med fingeren nær den bleke gløden av edelstenen ved kvinnens hals. – Har du noen gang fortalt noen de to tingene? At hun solgte den i Ridgeline? At stenen var en safir?</w:t>
       </w:r>
     </w:p>
     <w:p>
@@ -648,7 +648,7 @@
     </w:p>
     <w:p>
       <w:r>
-        <w:t>– Tenk med meg et øyeblikk da, sa jeg, – for dette betyr mer enn noe annet. Hvem som helst som har skrevet denne lappen, vet hva som lå i den låste kisten. Og det er bare to måter en person kan få vite hva som ligger i en låst kiste som bare du har åpnet. Enten har de på en eller annen måte vært inne i kisten din, noe du sier er umulig. Jeg holdt opp en finger. – Eller så har de kommet frem til den samme hemmeligheten fra den andre siden. Blackburn-familiens side. For Blackburn-familien mistet en brosje i 1924, gjorde de vel ikke? En familie som det, de ville ha skrevet det ned. Et brev, et husholdningsregnskap, en lapp til forsikringsmannen, et eller annet. Deres versjon av historien finnes et sted, adskilt fra din.</w:t>
+        <w:t xml:space="preserve">– Tenk med meg et øyeblikk da, sa jeg, – for dette betyr mer enn noe annet. Den som har skrevet denne lappen, vet hva som lå i den låste kisten. Og det er bare to måter en person kan få vite hva som ligger i en låst kiste som bare du har åpnet. Enten har de på en eller annen måte vært inne i kisten din, noe du sier er umulig. Jeg holdt opp en finger. – Eller så har de kommet frem til den samme hemmeligheten fra den andre siden. Blackburn-familiens side. For Blackburn-familien mistet en brosje i 1924, ikke sant? En familie som det, de ville ha skrevet det ned. Et brev, et husholdningsregnskap, en lapp til forsikringsmannen, et eller annet. Deres versjon av historien finnes et sted, adskilt fra din.</w:t>
       </w:r>
     </w:p>
     <w:p>
@@ -668,7 +668,7 @@
     </w:p>
     <w:p>
       <w:r>
-        <w:t>– Jeg ber deg ikke om å tro noe om noen ennå, sa jeg mildt. – Jeg ber deg bare om hvor denne viten kan ha kommet fra. Og det er to steder, og det ene av dem er en kiste som bare du kan åpne. Det er ikke noen beskyldning. Jeg brettet lappen langs de slitte foldene, forsiktig, og så på henne. – Kan jeg få beholde disse? Både lappen og fotografiet. Lappen kan fortelle oss mer enn forfatteren mente at den skulle.</w:t>
+        <w:t xml:space="preserve">– Jeg ber deg ikke om å tro noe om noen ennå, sa jeg mildt. – Jeg spør deg bare hvor denne viten kan ha kommet fra. Og det er to steder, og det ene av dem er en kiste som bare du kan åpne. Det er ikke noen beskyldning. Jeg brettet lappen langs de slitte foldene, forsiktig, og så på henne. – Kan jeg få beholde disse? Både lappen og fotografiet. Lappen kan fortelle oss mer enn forfatteren mente at den skulle.</w:t>
       </w:r>
     </w:p>
     <w:p>
@@ -693,7 +693,7 @@
     </w:p>
     <w:p>
       <w:r>
-        <w:t>– Vi skal finne ut av dette, sa jeg, og jeg mente det helt i dybden av mitt hjerte. Jeg stakk lappen og fotografiet forsiktig ned i innerlommen på kappen, mot hjertet mitt. – Hører du det? Du bærer ikke på dette alene lenger. Ikke en dag til. Uansett hva det koster, hvem enn det viser seg å være, så har du en venn i det nå, og jeg er veldig sta, og jeg har mer tid og tålmodighet enn noen du kjenner.</w:t>
+        <w:t xml:space="preserve">– Vi skal finne ut av dette, sa jeg, og jeg mente det helt i dybden av mitt hjerte. Jeg stakk lappen og fotografiet forsiktig ned i innerlommen på kåpen, mot hjertet mitt. – Hører du det? Du bærer ikke på dette alene lenger. Ikke en dag til. Uansett hva det koster, hvem enn det viser seg å være, så har du en venn i det nå, og jeg er veldig sta, og jeg har mer tid og tålmodighet enn noen du kjenner.</w:t>
       </w:r>
     </w:p>
     <w:p>
@@ -703,7 +703,7 @@
     </w:p>
     <w:p>
       <w:r>
-        <w:t>Da Pip og jeg til slutt kom ut av vertshuset, tok kulden pusten fra meg, og jeg ble stående på trappen et øyeblikk med den ene hånden presset flatt over det stedet der lappen lå brettet mot kappen min. Et tyveri et hundre år gammelt, og nå kunne ikke en god kvinne sove på grunn av det. Og bare to steder i verden hemmeligheten kunne ha kommet fra, og det ene av dem en boks som bare Fiona kunne åpne.</w:t>
+        <w:t xml:space="preserve">Da Pip og jeg til slutt kom ut av vertshuset, tok kulden pusten fra meg, og jeg ble stående på trappen et øyeblikk med den ene hånden presset flatt over det stedet der lappen lå brettet mot kåpen min. Et tyveri et hundre år gammelt, og nå kunne ikke en god kvinne sove på grunn av det. Og bare to steder i verden hemmeligheten kunne ha kommet fra, og det ene av dem en boks som bare Fiona kunne åpne.</w:t>
       </w:r>
     </w:p>
     <w:p>
@@ -718,7 +718,7 @@
     </w:p>
     <w:p>
       <w:r>
-        <w:t>Hun kvitterte med en liten lyd og falt i takt ved siden av meg. Vi gikk hjem gjennom den våkne byen, og jeg holdt hånden presset over lappen hele veien og så ikke opp på festivallysene langs takskjegget.</w:t>
+        <w:t xml:space="preserve">Hun kvitret og falt i takt ved siden av meg. Vi gikk hjem gjennom den våknende byen, og jeg holdt hånden presset over lappen hele veien og så ikke opp på festivallysene langs takskjegget.</w:t>
       </w:r>
     </w:p>
     <w:p>
@@ -735,13 +735,13 @@
     <w:p/>
     <w:p>
       <w:r>
-        <w:t>Nick kunne lese meg tvers over et rom. Jeg kom inn og banket kulden av støvlene mine, og han kastet bare et blikk på ansiktet mitt uten å stille en eneste byge av spørsmål. Han øste opp to tallerkener med en suppe som inneholdt byggryn, gulrøtter og de aller siste høstpurrene, satte dem på kjøkkenbordet og trakk ut stolen for meg. Han ventet til jeg hadde tatt tre skjeer før han i det hele tatt løftet på et øyenbryn.</w:t>
-      </w:r>
-    </w:p>
-    <w:p/>
-    <w:p>
-      <w:r>
-        <w:t>Så fortalte jeg det. Alt sammen, mens suppen dampet og Pip døste ved ovnen med den ene lanken over øynene. Telefonsamtalen. Den lille stuen med den høytlydte klokken. Brevet, det røde båndet og kontantene under trappen. Fotografiet av den navnløse Blackburn-kvinnen med brosjen ved halsen. Constance Okafor, nitten eller tyve år gammel i en hard vinter, tyveriet, pantesjappene to byer unna i Ridgeline, kroen kjøpt for pengene. Og den låste kisten på loftet som ingen hadde åpnet unntatt Fiona selv.</w:t>
+        <w:t xml:space="preserve">Nick kunne lese meg tvers over et rom. Jeg kom inn og banket kulden av støvlene mine, og han kastet bare et blikk på ansiktet mitt uten å stille et eneste spørsmål. Han øste opp to tallerkener med en suppe som inneholdt byggryn, gulrøtter og de aller siste høstpurrene, satte dem på kjøkkenbordet og trakk ut stolen for meg. Han ventet til jeg hadde tatt tre skjeer før han i det hele tatt løftet på et øyenbryn.</w:t>
+      </w:r>
+    </w:p>
+    <w:p/>
+    <w:p>
+      <w:r>
+        <w:t xml:space="preserve">Så fortalte jeg det. Alt sammen, mens suppen dampet og Pip døste ved ovnen med den ene luffen over øynene. Telefonsamtalen. Den lille stuen med den høytlydte klokken. Brevet, det røde båndet og kontantene under trappen. Fotografiet av den navnløse Blackburn-kvinnen med brosjen ved halsen. Constance Okafor, nitten eller tyve år gammel i en hard vinter, tyveriet, pantelånerbutikken to byer unna i Ridgeline, vertshuset kjøpt for pengene. Og den låste kisten på loftet som ingen hadde åpnet unntatt Fiona selv.</w:t>
       </w:r>
     </w:p>
     <w:p/>
@@ -789,7 +789,7 @@
     <w:p/>
     <w:p>
       <w:r>
-        <w:t>– Theo Hussein, sa han, er en av de snilleste mennene i Frost Falls. Det vet du like godt som jeg. Han nesten gråt da vi lot ham fotografere den gamle verkstedssleden til samlingen sin. Han tar med kakao til barnas lesetime på lørdager, den gode kakaoen med små marshmallows, betalt av egen lomme, fordi han sier at barna i Frost Falls burde vokse opp med å vite hvor de kommer fra. Han så på meg. – Jeg sier ikke det for å krangle med deg. Jeg sier det fordi det er sant, og fordi du må holde det for sant gjennom hele greia, uansett hva dette er, ellers vil du rote det til.</w:t>
+        <w:t xml:space="preserve">– Theo Hussein, sa han, – er en av de snilleste mennene i Frost Falls. Det vet du like godt som jeg. Han gråt nesten da vi lot ham fotografere den gamle verkstedssleden til samlingen sin. Han tar med kakao til barnas lesetime på lørdager, den gode kakaoen med små marshmallows, betalt av egen lomme, fordi han sier at barna i Frost Falls burde vokse opp med å vite hvor de kommer fra. Han så på meg. – Jeg sier ikke det for å krangle med deg. Jeg sier det fordi det er sant, og fordi du må holde det for sant gjennom hele greia, uansett hva dette er, ellers vil du rote det til.</w:t>
       </w:r>
     </w:p>
     <w:p/>
@@ -801,7 +801,7 @@
     <w:p/>
     <w:p>
       <w:r>
-        <w:t>– Vel, her er noe annet som også er sant, og det kan kanskje hjelpe. Han lente seg fram. – Mange hender er borti disse eskene, Jess. Frivillige kommer og går. Forskere sender forespørsler på forhånd og tilbringer en uke her. Skolebarn på ekskursjoner. Alle Theo slipper inn døren, og Theo slipper alle inn døren, fordi for Theo er en interessert fremmed det beste som kan hende en tirsdag. Så det at hemmeligheten kom ut fra Blackburn-papirene, forteller deg ikke at det var Theo. Det forteller deg bare hvor du skal stå. Det forteller deg hvilken brønn vannet ble hentet fra. Nå må du finne ut hvis bøtte som ble firt ned i den.</w:t>
+        <w:t xml:space="preserve">– Vel, her er noe annet som også er sant, og det kan kanskje hjelpe. Han lente seg fram. – Mange hender er borti disse eskene, Jess. Frivillige kommer og går. Forskere sender forespørsler på forhånd og tilbringer en uke her. Skolebarn på ekskursjoner. Alle Theo slipper inn døren, og Theo slipper alle inn døren, fordi for Theo er en interessert fremmed det beste som kan hende en tirsdag. Så det at hemmeligheten kom ut fra Blackburn-papirene, forteller deg ikke at det var Theo. Det forteller deg bare hvor du skal stå. Det forteller deg hvilken brønn vannet ble hentet fra. Nå må du finne ut hvem sin bøtte det var som ble firt ned i den.</w:t>
       </w:r>
     </w:p>
     <w:p/>
@@ -819,13 +819,13 @@
     <w:p/>
     <w:p>
       <w:r>
-        <w:t>– Da er halve byen et utmerket sted å begynne, sa Nick, og munnvikene hans løftet seg, selv om resten av ansiktet forble alvorlig. – Spis suppen din. Du tenker bedre når du er mett. Det har du alltid gjort. Du løste hele greia med Redfern-barnet over en tallerken av ingefærkjeksene mine, hvis du husker det, og tok attpåtil all æren for det selv.</w:t>
-      </w:r>
-    </w:p>
-    <w:p/>
-    <w:p>
-      <w:r>
-        <w:t>– Jeg delte æren broderlig med kjeksene, sa jeg, og spiste suppen min, for han hadde rett, og fordi det var god suppe.</w:t>
+        <w:t xml:space="preserve">– Da er halve byen et utmerket sted å begynne, sa Nick, og munnvikene hans løftet seg, selv om resten av ansiktet forble alvorlig. – Spis suppen din. Du tenker bedre når du er mett. Det har du alltid gjort. Du løste hele greia med Redfern-barnet over en tallerken med ingefærkjeksene mine, hvis du husker det, og tok attpåtil all æren for det selv.</w:t>
+      </w:r>
+    </w:p>
+    <w:p/>
+    <w:p>
+      <w:r>
+        <w:t xml:space="preserve">– Jeg delte æren raust med kjeksene, sa jeg, og spiste suppen min, for han hadde rett, og fordi det var god suppe.</w:t>
       </w:r>
     </w:p>
     <w:p/>
@@ -837,7 +837,7 @@
     <w:p/>
     <w:p>
       <w:r>
-        <w:t>Det var da jeg reiste meg for å vaske tallerkener, at jeg la merke til at Nick hadde vært oppe fra bordet tre ganger mens jeg snakket, og sneket seg ut bakveien til verkstedet og kommet inn igjen. Hver gang hadde han kommet tilbake med nytt sagflis på ermet og et uttrykk i ansiktet som han prøvde, men mislyktes med, å skjule.</w:t>
+        <w:t xml:space="preserve">Det var da jeg reiste meg for å vaske tallerkener, at jeg la merke til at Nick hadde vært oppe fra bordet tre ganger mens jeg snakket, og sneket seg ut bakveien til verkstedet og kommet inn igjen. Hver gang hadde han kommet tilbake med ny sagflis på ermet og et uttrykk i ansiktet som han prøvde, men mislyktes med, å skjule.</w:t>
       </w:r>
     </w:p>
     <w:p/>
@@ -861,13 +861,13 @@
     <w:p/>
     <w:p>
       <w:r>
-        <w:t>– Til alle. Han kom bort og kysset meg på toppen av hodet på vei for å rydde vekk tallerkenene. – Men ikke ennå. Ikke gå ut dit, Jess. Lov meg det. Den er ikke klar, og en ting som ikke er klar, kan bli ødelagt om den blir stirret på for tidlig. Noen ting trenger mørket for å vokse. Løk gjør det. Det gjør dette også.</w:t>
-      </w:r>
-    </w:p>
-    <w:p/>
-    <w:p>
-      <w:r>
-        <w:t>– Det gjelder svært mange ting, sa jeg, og det har aldri i verdens historie vært sant om et fuglehus, noe du fortalte meg den uken vi flyttet inn.</w:t>
+        <w:t xml:space="preserve">– Til alle. Han kom bort og kysset meg på toppen av hodet på vei for å rydde vekk tallerkenene. – Men ikke ennå. Ikke gå ut dit, Jess. Lov meg det. Den er ikke klar, og en ting som ikke er klar, kan bli ødelagt om den blir stirret på for tidlig. Noen ting trenger mørket for å vokse. Blomsterløk gjør det. Det gjør dette også.</w:t>
+      </w:r>
+    </w:p>
+    <w:p/>
+    <w:p>
+      <w:r>
+        <w:t xml:space="preserve">– Det gjelder svært mange ting, sa jeg, – og det har aldri i verdens historie vært sant om et fuglehus, noe du fortalte meg den uken vi flyttet inn.</w:t>
       </w:r>
     </w:p>
     <w:p/>
@@ -885,7 +885,7 @@
     <w:p/>
     <w:p>
       <w:r>
-        <w:t>Festivallysene langs de fjerne takene, lenkene mennene hadde hengt opp mellom lyktestolpene på allmenningen, brant i gull i stedet for oransje, et dypalt, stødig gull, hver eneste streng av dem, fra kirken til stasjonen, så langt øyet kunne se.</w:t>
+        <w:t xml:space="preserve">Festivallysene langs de fjerne takene, lenkene mennene hadde hengt opp mellom lyktestolpene på allmenningen, brant i gull i stedet for oransje, et dypt, stødig gull, hver eneste streng av dem, fra allmenningen til stasjonen, så langt øyet kunne se.</w:t>
       </w:r>
     </w:p>
     <w:p/>
@@ -980,7 +980,7 @@
     <w:p/>
     <w:p>
       <w:r>
-        <w:t xml:space="preserve">Frost Falls historiske forening holdt til i en smal mursteinsbygning ved torget, og den morgenen utstillingen med arkivmateriale åpnet, var det flere mennesker som gikk inn og ut der enn jeg noen gang hadde sett før. Fortauet utenfor var som en langsom elv av kåper. Noen hadde hengt opp et banner over døren – håndmalt, </w:t>
+        <w:t xml:space="preserve">Frost Falls historielag holdt til i en smal mursteinsbygning ved torget, og den morgenen utstillingen med arkivmateriale åpnet, var det flere mennesker som gikk inn og ut der enn jeg noen gang hadde sett før. Fortauet utenfor var som en langsom elv av kåper. Noen hadde hengt opp et banner over døren – håndmalt, </w:t>
       </w:r>
       <w:r>
         <w:rPr>
@@ -999,12 +999,12 @@
     </w:p>
     <w:p>
       <w:r>
-        <w:t>Inne var alle vegger tatt i bruk til utstillingen. Veggene som vanligvis prydede falmede kart og en jernbanerute fra 1911, var nå fylt med innrammede brev, fotografier og gulnede skjøter. Hvert enkelt dokument var merket med en liten, pen, skrå håndskrift som jeg kjente igjen før jeg rakk å lese et ord av den, for jeg hadde sett den på kortene under barnas lesestund og på de små skiltene i montrene. Theos hånd. Han merket alt. Han ville ha merket eplesideren også om noen hadde tillatt det.</w:t>
-      </w:r>
-    </w:p>
-    <w:p>
-      <w:r>
-        <w:t>Han sto ved døren til hovedrommet og hilste på folk, og jeg betraktede ham et øyeblikk før han fikk øye på meg.</w:t>
+        <w:t xml:space="preserve">Inne var alle vegger tatt i bruk til utstillingen. Veggene som vanligvis prydet falmede kart og en jernbanerute fra 1911, var nå fylt med innrammede brev, fotografier og gulnede skjøter. Hvert enkelt dokument var merket med en liten, pen, skrå håndskrift som jeg kjente igjen før jeg rakk å lese et ord av den, for jeg hadde sett den på kortene under barnas lesestund og på de små skiltene i montrene. Theos hånd. Han merket alt. Han ville ha merket eplesideren også om noen hadde tillatt det.</w:t>
+      </w:r>
+    </w:p>
+    <w:p>
+      <w:r>
+        <w:t xml:space="preserve">Han sto ved døren til hovedrommet og hilste på folk, og jeg betraktet ham et øyeblikk før han fikk øye på meg.</w:t>
       </w:r>
     </w:p>
     <w:p>
@@ -1040,7 +1040,7 @@
         <w:rPr>
           <w:i/>
         </w:rPr>
-        <w:t xml:space="preserve">å se</w:t>
+        <w:t xml:space="preserve">å, se</w:t>
       </w:r>
       <w:r>
         <w:t xml:space="preserve"> og </w:t>
@@ -1057,7 +1057,7 @@
     </w:p>
     <w:p>
       <w:r>
-        <w:t>Og det var mye å se på, for de var der alle sammen. Hver og en av dem, la jeg merke til, i den samme bygningen med Blackburn-arkivene innen rekkevidde, på den samme lyse morgenen.</w:t>
+        <w:t xml:space="preserve">Og det var mye å se på, for de var der alle sammen. Hver og en av dem, la jeg merke til, i den samme bygningen med Blackburn-eskene innen rekkevidde, på den samme lyse morgenen.</w:t>
       </w:r>
     </w:p>
     <w:p>
@@ -1067,7 +1067,7 @@
     </w:p>
     <w:p>
       <w:r>
-        <w:t>Vera Reed var ved resepsjonen og satte ned en flat arkivboks med papirer, rask og knppet helt opp i halsen, med bevegelser som var raske og økonomiske. Hun sa et eller annet til Theo på den andre siden av rommet, og han løftet en hånd til henne, en liten takkebevegelse. Hun nikket tilbake, en enkelt gang, og bøyde seg for å rette boksen nøyaktig inn etter skrivebordets kant, ute av stand til, som enkelte mennesker, å la noe ligge skjevt.</w:t>
+        <w:t xml:space="preserve">Vera Reed var ved resepsjonen og satte ned en flat arkivboks med papirer, rask og kneppet helt opp i halsen, med bevegelser som var raske og økonomiske. Hun sa et eller annet til Theo på den andre siden av rommet, og han løftet en hånd til henne, en liten takkebevegelse. Hun nikket tilbake, en enkelt gang, og bøyde seg for å rette boksen nøyaktig inn etter skrivebordets kant, ute av stand til, som enkelte mennesker, å la noe ligge skjevt.</w:t>
       </w:r>
     </w:p>
     <w:p>
@@ -1088,7 +1088,7 @@
     </w:p>
     <w:p>
       <w:r>
-        <w:t>– Fru Claus. Neil så ikke opp fra glasset. – Fascinerende, alt dette. Deres Mr. Hussein har gjort byen en reell tjeneste, enten byen vet det eller ei. Se her. Han pekte mot monteren, med den ene fingeren uten helt å berøre glasset. – En hel løpende korrespondanse om husholdningen. Hvem som ble ansatt, hvem som fikk gå, hva som ble kjøpt, hva som ble solgt. Så snudde han hodet, og smilet var på plass. – Hva som gikk tapt.</w:t>
+        <w:t xml:space="preserve">– Fru Claus. Neil så ikke opp fra glasset. – Fascinerende, alt dette. Din herr Hussein har gjort byen en reell tjeneste, enten byen vet det eller ei. Se her. Han pekte mot monteren, med den ene fingeren uten helt å berøre glasset. – En hel løpende korrespondanse om husholdningen. Hvem som ble ansatt, hvem som fikk gå, hva som ble kjøpt, hva som ble solgt. Så snudde han hodet, og smilet var på plass. – Hva som gikk tapt.</w:t>
       </w:r>
     </w:p>
     <w:p>
@@ -1098,7 +1098,7 @@
     </w:p>
     <w:p>
       <w:r>
-        <w:t>– Jeg er alltid på jakt etter brosjen min. Det er jobben. Han rettet seg opp og stakk notatblokken under armen. – En mann kom bort til meg ved siderbordet i stad og fortalte at Blackburns en gang eide halvparten av Maple Street. Visste du det? Folk elsker å fortelle hva de rike familiene eide. De kan aldri fortelle deg hva de rike familiene gjorde mot dem som arbeidet for dem. Den biten kommer ikke med i familiepapirene. Han nikket mot glasset. – Rart det der. Tyve år med brev og ikke et eneste ett skrevet av en stuepike.</w:t>
+        <w:t xml:space="preserve">– Jeg er alltid på jakt etter brosjen min. Det er jobben. Han rettet seg opp og stakk notatblokken under armen. – En mann kom bort til meg ved siderbordet i stad og fortalte at Blackburns en gang eide halvparten av Maple Street. Visste du det? Folk elsker å fortelle hva de rike familiene eide. De kan aldri fortelle deg hva de rike familiene gjorde mot dem som arbeidet for dem. Den biten kommer ikke med i familiepapirene. Han nikket mot glasset. – Rart det der. Tyve år med brev og ikke ett eneste skrevet av en stuepike.</w:t>
       </w:r>
     </w:p>
     <w:p>
@@ -1108,7 +1108,7 @@
     </w:p>
     <w:p>
       <w:r>
-        <w:t>Så klirret Theo med en skje mot et glass fremst i rommet. Forsamlingen snudde seg og stilnet, og han sa sine få ord, som slett ikke var få. Theo kunne ikke si noe som helst om fortiden i en fart. Han takket de frivillige med navn, hver og en av dem, inkludert en viss fru Pelletier som øyensynlig hadde sortert fotografier tre helger på rad og ble ildrød av å bli nevnt. Han takket byen. Han takket, med en brist i stemmen, «alle som noensinne har tatt vare på et brev istedenfor å kaste det, for det er alt historien er, til syvende og sist, de tingene folk ikke klarte å bære å kaste.»</w:t>
+        <w:t xml:space="preserve">Så klirret Theo med en skje mot et glass fremst i rommet. Forsamlingen snudde seg og stilnet, og han sa sine få ord, som slett ikke var få. Theo kunne ikke si noe som helst om fortiden i en fart. Han takket de frivillige med navn, hver og en av dem, inkludert en viss fru Pelletier som øyensynlig hadde sortert fotografier tre helger på rad og ble ildrød av å bli nevnt. Han takket byen. Han takket, med en brist i stemmen, «alle som noensinne har tatt vare på et brev istedenfor å kaste det, for det er alt historien er, til syvende og sist, de tingene folk ikke klarte å kaste.»</w:t>
       </w:r>
     </w:p>
     <w:p>
@@ -1138,7 +1138,7 @@
     </w:p>
     <w:p>
       <w:r>
-        <w:t>Jeg beveget meg gjennom rommet etter det, langsomt. Jeg beundret de gamle skjøtene sammen med Dot, som stemplet det hele som «et voldsomt styr med andre folks post» og ble stående en time likevel. Jeg lot Theo lede meg gjennom tre av glassmontrene, og jeg betraktede måten han berørte dem på, eller rettere sagt unnlot å gjøre det, med fingrene svevende over glasset over hver enkelt av dem som en hånd holdt over ryggen på et sovende barn for å kjenne det puste uten å vekke det. Og hele tiden holdt jeg øye med rommet.</w:t>
+        <w:t xml:space="preserve">Jeg beveget meg gjennom rommet etter det, langsomt. Jeg beundret de gamle skjøtene sammen med Dot, som stemplet det hele som «et voldsomt styr med andre folks post» og ble stående en time likevel. Jeg lot Theo lede meg gjennom tre av glassmontrene, og jeg betraktet måten han berørte dem på, eller rettere sagt unnlot å gjøre det, med fingrene svevende over glasset over hver enkelt av dem som en hånd holdt over ryggen på et sovende barn for å kjenne det puste uten å vekke det. Og hele tiden holdt jeg øye med rommet.</w:t>
       </w:r>
     </w:p>
     <w:p>
@@ -1153,12 +1153,12 @@
     </w:p>
     <w:p>
       <w:r>
-        <w:t>Jeg rørte ikke bunken. Jeg saknet ikke engang farten da jeg gikk forbi den. Jeg bare så, en eneste gang, og holdt ansiktet avslappet, og gikk videre mot cideren som om papir var det siste i verden jeg tenkte på.</w:t>
-      </w:r>
-    </w:p>
-    <w:p>
-      <w:r>
-        <w:t>Pip fant meg nær døren noen minutter senere, og hun hadde rotet seg bort i et eller annet, slik hun pleide. Hun paraderte gjennom forgangen med et stykke rødt bånd som slepte etter nebbet hennes, en krøll med festhugget bånd hun hadde arbeidet løst fra en girlander med granbar ved trappen, med hodet hevet og halen i bevegelse, overmåte fornøyd med seg selv.</w:t>
+        <w:t xml:space="preserve">Jeg rørte ikke bunken. Jeg saktnet ikke engang farten da jeg gikk forbi den. Jeg bare så, en eneste gang, og holdt ansiktet avslappet, og gikk videre mot cideren som om papir var det siste i verden jeg tenkte på.</w:t>
+      </w:r>
+    </w:p>
+    <w:p>
+      <w:r>
+        <w:t xml:space="preserve">Pip fant meg nær døren noen minutter senere, og hun hadde rotet seg bort i et eller annet, slik hun pleide. Hun paraderte gjennom forhallen med et stykke rødt bånd som slepte etter nebbet hennes, en krøll med festivalbånd hun hadde arbeidet løst fra en girlander med granbar ved trappen, med hodet hevet og halen i bevegelse, overmåte fornøyd med seg selv.</w:t>
       </w:r>
     </w:p>
     <w:p>
@@ -1173,7 +1173,7 @@
     </w:p>
     <w:p>
       <w:r>
-        <w:t>Men jeg brettet det inn i kåpelommen for det om, ved siden av brevet. Jeg rettet meg opp og så tilbake over det varme, fulle rommet en siste gang. På Theo, som nå stod bøyd ved siderbordet og fortalte en liten gutt om grunnleggelsen av byen av hele sitt trette hjerte, med gutten store av undring. På Vera, ved disken, som rettet inn papirboksen sin en siste kvarttomme. På Neil Carter, ved glasset, som skrev et eller annet i notatblokken sin. Og på bunken med kremfarget brevpapir ved Veras albue, som fanget lyset.</w:t>
+        <w:t xml:space="preserve">Men jeg brettet det inn i kåpelommen likevel, ved siden av brevet. Jeg rettet meg opp og så tilbake over det varme, fulle rommet en siste gang. På Theo, som nå stod bøyd ved siderbordet og fortalte en liten gutt om grunnleggelsen av byen av hele sitt trette hjerte, med store øyne av undring. På Vera, ved disken, som rettet inn papirboksen sin en siste halv centimeter. På Neil Carter, ved glasset, som skrev et eller annet i notatblokken sin. Og på bunken med kremfarget brevpapir ved Veras albue, som fanget lyset.</w:t>
       </w:r>
     </w:p>
     <w:p>
@@ -1200,7 +1200,7 @@
     <w:p/>
     <w:p>
       <w:r>
-        <w:t>Og jeg, og Pip, som kastet et blikk på den varme flekken foran vedovnen, snudde seg rundt to ganger, stakk nebbet under en lalle og sovnet.</w:t>
+        <w:t xml:space="preserve">Og jeg, og Pip, som kastet et blikk på den varme flekken foran vedovnen, snudde seg rundt to ganger, stakk nebbet under en luffe og sovnet.</w:t>
       </w:r>
     </w:p>
     <w:p/>
@@ -1254,7 +1254,7 @@
     <w:p/>
     <w:p>
       <w:r>
-        <w:t>Ivy lo, den store, lune latten som fylte et rom.</w:t>
+        <w:t xml:space="preserve">Ivy lo, den store, lune latteren som fylte et rom.</w:t>
       </w:r>
     </w:p>
     <w:p/>
@@ -1296,13 +1296,13 @@
     <w:p/>
     <w:p>
       <w:r>
-        <w:t>– Det er ikke utstillingen. Martha la pinnene ned i fanget. – Det er pengene. Foreningen er blakk, Jessica. Blakk på ordentlig. Jeg fikk vite det av Theo selv, i vår, før han sluttet å innrømme det for noen. De har ikke noe fond å snakke om. Det har de aldri hatt. De har klart seg på et lite tilskudd fra byen og det de samlet inn på sommermarkedet, helt til byen kuttet tilskuddet for to budsjetter siden. Taket over rommene bak lekker hver gang det regner. Kjelen er eldre enn meg. Og han har søkt på hver eneste stiftelse og fond i tre stater. Hun rister sakte på hodet. – Avvist. Avvist. Avvist. Jeg har sett brevene komme. Han viste meg et, en gang, og så sluttet han å vise meg dem.</w:t>
-      </w:r>
-    </w:p>
-    <w:p/>
-    <w:p>
-      <w:r>
-        <w:t xml:space="preserve">– Og nå har han lovet festivalen en hel teltpaviljong med byens historie, skjøt Claire inn, og jeg vet tilfeldigvis at han ikke har penger til å leie teltet, enn si alt det andre, for jeg spurte ham for </w:t>
+        <w:t xml:space="preserve">– Det er ikke utstillingen. Martha la pinnene ned i fanget. – Det er pengene. Foreningen er blakk, Jessica. Blakk på ordentlig. Jeg fikk vite det av Theo selv, i vår, før han sluttet å innrømme det for noen. De har ikke noe fond å snakke om. Det har de aldri hatt. De har klart seg på et lite tilskudd fra byen og det de samlet inn på sommermarkedet, helt til byen kuttet tilskuddet for to budsjetter siden. Taket over rommene bak lekker hver gang det regner. Fyrkjelen er eldre enn meg. Og han har søkt på hver eneste stiftelse og fond i tre stater. Hun ristet sakte på hodet. – Avvist. Avvist. Avvist. Jeg har sett brevene komme. Han viste meg et, en gang, og så sluttet han å vise meg dem.</w:t>
+      </w:r>
+    </w:p>
+    <w:p/>
+    <w:p>
+      <w:r>
+        <w:t xml:space="preserve">– Og nå har han lovet festivalen en hel teltpaviljong med byens historie, skjøt Claire inn, – og jeg vet tilfeldigvis at han ikke har penger til å leie teltet, enn si alt det andre, for jeg spurte ham for </w:t>
       </w:r>
       <w:r>
         <w:t>&lt;bt&gt;</w:t>
@@ -1326,7 +1326,7 @@
     <w:p/>
     <w:p>
       <w:r>
-        <w:t>Dot lagde en lyd gjennom nesen. – Ordfører Blackburn tror historie er noe som hendte andre mennesker i et annet fylke. Han kommer til å klippe snoren på festivalen og trykke Theos hånd til fotografiet. Han kommer ikke til å gi en eneste tynn selt for å holde lysene på resten av året. Bare se.</w:t>
+        <w:t xml:space="preserve">Dot lagde en lyd gjennom nesen. – Ordfører Blackburn tror historie er noe som hendte andre mennesker i et annet fylke. Han kommer til å klippe snoren på festivalen og trykke Theos hånd til fotografiet. Han kommer ikke til å gi en eneste rød øre for å holde lysene på resten av året. Bare se.</w:t>
       </w:r>
     </w:p>
     <w:p/>
@@ -1344,7 +1344,7 @@
     <w:p/>
     <w:p>
       <w:r>
-        <w:t>Å vite at hemmeligheten stammer fra papirene forteller deg hvor du skal stå, hadde Nick sagt. Ikke hvem. Svært mange mennesker i Frost Falls syntes synd på Theo. Halvparten av byen ville ha felt tårer om de fikk vite hvor ille det sto til. Å syns synd på en mann, selv det å være byens mest desperate mann, er ikke det samme som å utpresse en venn for penger, og jeg nektet å la det ene gli over i det andre i hodet mitt uten noe mer enn regnestykker og en dårlig magefølelse. Så jeg fortsatte å strikke, holdt knyttneven åpen, og bar på mistanken med lett hånd, som et glødende kull jeg var rede til å slippe.</w:t>
+        <w:t xml:space="preserve">Å vite at hemmeligheten stammer fra papirene forteller deg hvor du skal stå, hadde Nick sagt. Ikke hvem. Svært mange mennesker i Frost Falls syntes synd på Theo. Halvparten av byen ville ha felt tårer om de fikk vite hvor ille det sto til. Å synes synd på en mann, selv det å være byens mest desperate mann, er ikke det samme som å utpresse en venn for penger, og jeg nektet å la det ene gli over i det andre i hodet mitt uten noe mer enn regnestykker og en dårlig magefølelse. Så jeg fortsatte å strikke, holdt knyttneven åpen, og bar på mistanken med lett hånd, som et glødende kull jeg var rede til å slippe.</w:t>
       </w:r>
     </w:p>
     <w:p/>
@@ -1374,25 +1374,25 @@
     <w:p/>
     <w:p>
       <w:r>
-        <w:t>Claires pinner stanset. Hun så opp. Et øyeblikk forsvant journalistblikket fra ansiktet hennes, og noe eldre og trøttere kom til syne. – Tristere historier rister ikke løs noen penger, sa hun lavt. – Jeg har skrevet hundre av dem. De får folk til å føle at de har gjort en innsats ved å føle seg lei seg, og så blar de om. Så ristet hun det av seg, og det raske vesenet var tilbake. – Men jeg kommer til å skrive det mildt. Han fortjener å bli behandlet mildt, uansett hva som skjer.</w:t>
-      </w:r>
-    </w:p>
-    <w:p/>
-    <w:p>
-      <w:r>
-        <w:t>Praten gikk videre etter det, til vottene, til Ivys datters nye baby, og til om en snøstorm første oktober betydde en hard vinter eller en mild, noe ingen ble enige om. Jeg lot samtalen flyte videre. Ved siden av meg hadde Martha blitt taus over arbeidet sitt. Etter en stund bøyde hun seg litt mot meg og sa, lavt, bare for oss to: – Og hvordan står det til med vår Fiona? Jeg har hørt at hun ikke er seg selv.</w:t>
-      </w:r>
-    </w:p>
-    <w:p/>
-    <w:p>
-      <w:r>
-        <w:t>Jeg holdt blikket på strikketøyet og hendene i ro. – En tøff periode, tror jeg. Festivalen er mye å bære for kroken, helt alene.</w:t>
-      </w:r>
-    </w:p>
-    <w:p/>
-    <w:p>
-      <w:r>
-        <w:t>– Mm. Martha var ingen hvem som helst. Hun lot mm-et henge i lufta et øyeblikk, uten å tro på meg og uten å presse på. – Du får si ifra til henne at syklubben er her, om hun vil ha oss. Vi er gamle, men vi er ikke ubrukelige. Det er ikke en eneste trøbbel i denne byen vi ikke har sittet igjennom sammen med noen. Så la hun pinnene ned igjen, strakte seg ut og la sin flekkete, sterke, gamle hånd på kneet mitt. – Og du, Jessica. Du har det blikket der. Det du hadde for noen uker siden, med Redfern-barnet, da du nektet å slippe saken selv om resten av oss mente du burde det. Du bærer på noe.</w:t>
+        <w:t xml:space="preserve">Claires pinner stanset. Hun så opp. Et øyeblikk forsvant journalistblikket fra ansiktet hennes, og noe eldre og trøttere kom til syne. – Triste historier rister ikke løs noen penger, sa hun lavt. – Jeg har skrevet hundre av dem. De får folk til å føle at de har gjort en innsats ved å føle seg lei seg, og så blar de om. Så ristet hun det av seg, og det raske vesenet var tilbake. – Men jeg kommer til å skrive det mildt. Han fortjener å bli behandlet mildt, uansett hva som skjer.</w:t>
+      </w:r>
+    </w:p>
+    <w:p/>
+    <w:p>
+      <w:r>
+        <w:t xml:space="preserve">Praten gikk videre etter det, til vottene, til Ivys datters nye baby, og til om første snø allerede i oktober betydde en hard vinter eller en mild, noe ingen ble enige om. Jeg lot samtalen flyte videre. Ved siden av meg hadde Martha blitt taus over arbeidet sitt. Etter en stund bøyde hun seg litt mot meg og sa, lavt, bare for oss to: – Og hvordan står det til med vår Fiona? Jeg har hørt at hun ikke er seg selv.</w:t>
+      </w:r>
+    </w:p>
+    <w:p/>
+    <w:p>
+      <w:r>
+        <w:t xml:space="preserve">Jeg holdt blikket på strikketøyet og hendene i ro. – En tøff periode, tror jeg. Festivalen er mye å bære for vertshuset, helt alene.</w:t>
+      </w:r>
+    </w:p>
+    <w:p/>
+    <w:p>
+      <w:r>
+        <w:t xml:space="preserve">– Mm. Martha lot seg ikke lure. Hun lot mm-et henge i lufta et øyeblikk, uten å tro på meg og uten å presse på. – Du får si ifra til henne at syklubben er her, om hun vil ha oss. Vi er gamle, men vi er ikke ubrukelige. Det er ikke et eneste trøbbel i denne byen vi ikke har sittet igjennom sammen med noen. Så la hun pinnene ned igjen, strakte seg ut og la sin flekkete, sterke, gamle hånd på kneet mitt. – Og du, Jessica. Du har det blikket der. Det du hadde for noen uker siden, med Redfern-barnet, da du nektet å slippe saken selv om resten av oss mente du burde det. Du bærer på noe.</w:t>
       </w:r>
     </w:p>
     <w:p/>
@@ -1416,7 +1416,7 @@
     <w:p/>
     <w:p>
       <w:r>
-        <w:t>– Takk, sa jeg, og måtte rømme seg. – Det skal jeg huske.</w:t>
+        <w:t xml:space="preserve">– Takk, sa jeg, og måtte rømme meg. – Det skal jeg huske.</w:t>
       </w:r>
     </w:p>
     <w:p/>
@@ -1428,13 +1428,13 @@
     <w:p/>
     <w:p>
       <w:r>
-        <w:t>Da Pip og jeg dro, en time senere, hadde lyset tynnet ut til fargen på svak te, og mennene var tilbake på gressplenen for å henge opp de siste festivallysene mellom lyktestolpene, og ropte til hverandre i kulden. Jeg stanset på hjørnet og så på dem et øyeblikk, de mørke trådene som ble hengt opp, og jeg tenkte på penger.</w:t>
-      </w:r>
-    </w:p>
-    <w:p/>
-    <w:p>
-      <w:r>
-        <w:t>Fem hundre tusen dollar, krevd av en kvinne som ikke eide en tiendedel av det, av en eller annen som visste nøyaktig hvordan en formue kunne manes fram fra en gammel hemmelighet. En bygning full av byens minner som holdt på å mørkne for en brøkdel av den samme summen. Og en god, gråsprengt mann som var gått tom for ærlige dører å banke på.</w:t>
+        <w:t xml:space="preserve">Da Pip og jeg dro, en time senere, hadde lyset tynnet ut til fargen på svak te, og mennene var tilbake på allmenningen for å henge opp de siste festivallysene mellom lyktestolpene, og ropte til hverandre i kulden. Jeg stanset på hjørnet og så på dem et øyeblikk, de mørke trådene som ble hengt opp, og jeg tenkte på penger.</w:t>
+      </w:r>
+    </w:p>
+    <w:p/>
+    <w:p>
+      <w:r>
+        <w:t xml:space="preserve">Fem hundre tusen dollar, krevd av en kvinne som ikke eide en tiendedel av det, av en eller annen som visste nøyaktig hvordan en formue kunne manes fram fra en gammel hemmelighet. En bygning full av byens minner som holdt på å mørkne for en brøkdel av den samme summen. Og en god, gråblek mann som var gått tom for ærlige dører å banke på.</w:t>
       </w:r>
     </w:p>
     <w:p/>
@@ -1462,7 +1462,7 @@
     </w:p>
     <w:p>
       <w:r>
-        <w:t>Byallmenningen var der festivalen skulle være, den store gressletten sør for Evergreen som strakte seg ned fra torget, med krigsminnesmerket i den ene enden og den store almreisa i den andre. Hele byen hadde møtt opp for å pynte den. Det skulle bæres ut bukkeord og settes opp i rader, bygges en scene i nordenden, og det som så ut til å være tusen små pyntegraskar skulle ordnes slik at det så tilfeldig ut. Komiteen kom da også til å dulle med dem i en times tid. Jeg hadde bare kommet for å levere sirkelens første dusin votter til festkomiteen, og innen nitti sekunder etter at jeg hadde kommet, ble jeg stukket i hånden av en kasse med paigresskar av en mann jeg ikke kjente, som sa: «Kan du sette de der langs scenekanten? Pass på det myke.» Slik var det å bo i denne byen, og jeg hadde ingenting imot det. Det var umulig å gruble med en kasse gresskar i armene, og det passet meg utmerket.</w:t>
+        <w:t xml:space="preserve">Byallmenningen var der festivalen skulle være, den store gressletten sør for Evergreen som strakte seg ned fra torget, med krigsminnesmerket i den ene enden og den store almen i den andre. Hele byen hadde møtt opp for å pynte den. Det skulle bæres ut bukkebord og settes opp i rader, bygges en scene i nordenden, og det som så ut til å være tusen små pyntegresskar skulle ordnes slik at det så tilfeldig ut. Komiteen kom da også til å dulle med dem i en times tid. Jeg hadde bare kommet for å levere syklubbens første dusin votter til festkomiteen, og innen nitti sekunder etter at jeg hadde kommet, fikk jeg en kasse med paigresskar stukket i hendene av en mann jeg ikke kjente, som sa: «Kan du sette de der langs scenekanten? Pass på det myke.» Slik var det å bo i denne byen, og jeg hadde ingenting imot det. Det var umulig å gruble med en kasse gresskar i armene, og det passet meg utmerket.</w:t>
       </w:r>
     </w:p>
     <w:p/>
@@ -1474,7 +1474,7 @@
     <w:p/>
     <w:p>
       <w:r>
-        <w:t>Jeg snudde meg. Pip hadde hele hodet gravd ned i den opprevne toppen av en lykt som noen hadde skåret ut tidligere, der hun drog ut de våte frøene og slang dem ut i gresset med den enøyde saligheten hun la for dagen i alt som var forbudt. Over henne stod Emma Redfern, fanget et sted mellom skrekk og begeistring.</w:t>
+        <w:t xml:space="preserve">Jeg snudde meg. Pip hadde hele hodet gravd ned i den opprevne toppen av en lykt som noen hadde skåret ut tidligere, der hun drog ut de våte frøene og slang dem ut i gresset med den målrettede saligheten hun la for dagen i alt som var forbudt. Over henne stod Emma Redfern, fanget et sted mellom skrekk og begeistring.</w:t>
       </w:r>
     </w:p>
     <w:p/>
@@ -1492,7 +1492,7 @@
     <w:p/>
     <w:p>
       <w:r>
-        <w:t>Latteren brøt frem hos henne, lys og overrasket, en ekte latter som slipper ut av et barn før hun har rukket å bestemme seg for om hun skal tillate det, og den gjorde meg bedre til vilje enn en ukes søvn, for det hadde vært en lang periode etter morens død hvor Emma Redfern ikke hadde ledd i det hele tatt. Sarah Redferns sykdom hadde vart i det meste av et år, og etterpå hadde Emma drevet gatelangs i en by som ikke visste hvordan de skulle nå frem til henne, som et lite, grått spøkelse til jente. Hun hadde tatt Marthas lille hund tidligere denne måneden – tatt ham, gjemt ham og beholdt ham – drevet av en sorg som var altfor stor til å få plass inne i en åtteåring. Hele byen hadde rykket ut for å lete. Til slutt hadde jeg funnet dem begge, jenta og hunden sammen i et gammelt skur, og det funnet ble starten på at Emma fant tilbake til seg selv. Nå luftet hun hunden tre ettermiddager i uken, en ordning Martha hadde kokt i hop fra løse luften for å gi et ensomt barn en grunn til å stå opp og noe varmt å ha ansvar for, og det hadde virket, på omveier, uten at noen noensinne sa høyt hva det var godt for.</w:t>
+        <w:t xml:space="preserve">Latteren brøt frem hos henne, lys og overrasket, en ekte latter som slipper ut av et barn før hun har rukket å bestemme seg for om hun skal tillate det, og den gjorde meg bedre enn en ukes søvn, for det hadde vært en lang periode etter morens død hvor Emma Redfern ikke hadde ledd i det hele tatt. Sarah Redferns sykdom hadde vart i det meste av et år, og etterpå hadde Emma drevet gatelangs i en by som ikke visste hvordan de skulle nå frem til henne, som et lite, grått spøkelse til jente. Hun hadde tatt Marthas lille hund tidligere denne måneden – tatt ham, gjemt ham og beholdt ham – drevet av en sorg som var altfor stor til å få plass inne i en åtteåring. Hele byen hadde rykket ut for å lete. Til slutt hadde jeg funnet dem begge, jenta og hunden sammen i et gammelt skur, og det funnet ble starten på at Emma fant tilbake til seg selv. Nå luftet hun hunden tre ettermiddager i uken, en ordning Martha hadde kokt i hop fra løse luften for å gi et ensomt barn en grunn til å stå opp og noe varmt å ha ansvar for, og det hadde virket, på omveier, uten at noen noensinne sa høyt hva det var godt for.</w:t>
       </w:r>
     </w:p>
     <w:p/>
@@ -1534,7 +1534,7 @@
     <w:p/>
     <w:p>
       <w:r>
-        <w:t>Etter det tok vi fatt på arbeidet sammen, vi fire og hunden, bar stoler, fraktet pyntegraskar og diskuterte lystig hvilke gresskar som var for myke til å ligge på første rad.</w:t>
+        <w:t xml:space="preserve">Etter det tok vi fatt på arbeidet sammen, vi fire og hunden, bar stoler, fraktet pyntegresskar og diskuterte lystig hvilke gresskar som var for myke til å ligge på første rad.</w:t>
       </w:r>
     </w:p>
     <w:p/>
@@ -1558,7 +1558,7 @@
     <w:p/>
     <w:p>
       <w:r>
-        <w:t>«Bedre.» Han sa det forsiktig, som en mann som setter foten på is han ennå ikke stoler på. «Vi har det bedre. Det finnes heile timer nå hvor jeg glemmer det, og så husker jeg det igjen, og det å minnes slår meg ikke i bakken lenger. Det bare går ved siden av meg en stund og så letter det igjen.» Han satte ned sin ende av en benk. «Det var byen som gjorde det. Jeg prøver hele tiden å finne ut hvordan man takker en hel by, og det finnes ingen måte å gjøre det på. Folk bare dukket opp hele tiden. Gryteretter. Noen tok med seg Emma en ettermiddag. Martha og den hunden. Du og den håpløse fuglen. Ingen ordnet opp i noe. Ingen kunne det. De bare fortsatte å dukke opp til det å dukke opp ble et liv igjen, og en dag så jeg meg rundt og oppdaget at vi levde det.»</w:t>
+        <w:t xml:space="preserve">«Bedre.» Han sa det forsiktig, som en mann som setter foten på is han ennå ikke stoler på. «Vi har det bedre. Det finnes hele timer nå hvor jeg glemmer det, og så husker jeg det igjen, og det å minnes slår meg ikke i bakken lenger. Det bare går ved siden av meg en stund og så letter det igjen.» Han satte ned sin ende av en benk. «Det var byen som gjorde det. Jeg prøver hele tiden å finne ut hvordan man takker en hel by, og det finnes ingen måte å gjøre det på. Folk bare dukket opp hele tiden. Gryteretter. Noen tok med seg Emma en ettermiddag. Martha og den hunden. Du og den håpløse fuglen. Ingen ordnet opp i noe. Ingen kunne det. De bare fortsatte å dukke opp til det å dukke opp ble et liv igjen, og en dag så jeg meg rundt og oppdaget at vi levde det.»</w:t>
       </w:r>
     </w:p>
     <w:p/>
@@ -1576,13 +1576,13 @@
     <w:p/>
     <w:p>
       <w:r>
-        <w:t>Vottene lå fremdeles i vesken min. Jeg lette opp den som ledde komiteen, og fant sjefen for det hele. Noriko Tanaka stod midt på gressletten i parkas og ulllue, med en klipsholder i den ene hånden og et termokrus i den andre, og dirigerer folk dit det trengtes. Hun var en tettbygd kvinne i femtiårene med gråsprengt hår ved tinningene og en slitt notisblokk som stakk opp av jakkelommen. Olivia hadde fortalt meg at hun hadde kommet hjem etter tjue år i statspolitiet for å lede en avdeling på seks personer, og at ingen i Frost Falls noensinne hadde hørt henne heve stemmen.</w:t>
-      </w:r>
-    </w:p>
-    <w:p/>
-    <w:p>
-      <w:r>
-        <w:t>«Fru Claus.» Hun tok imot vottene, talte dem og skrev talen ned. «Håndarbeidsbordet i bortre ende. Takk skal du ha. Og reinsdyrene dine står ikke på programmet i år.»</w:t>
+        <w:t xml:space="preserve">Vottene lå fremdeles i vesken min. Jeg lette opp den som ledde komiteen, og fant politisjefen. Noriko Tanaka stod midt på gressletten i parkas og ulllue, med en klipsholder i den ene hånden og et termokrus i den andre, og dirigerte folk dit det trengtes. Hun var en tettbygd kvinne i femtiårene med gråsprengt hår ved tinningene og en slitt notisblokk som stakk opp av jakkelommen. Olivia hadde fortalt meg at hun hadde kommet hjem etter tjue år i statspolitiet for å lede en avdeling på seks personer, og at ingen i Frost Falls noensinne hadde hørt henne heve stemmen.</w:t>
+      </w:r>
+    </w:p>
+    <w:p/>
+    <w:p>
+      <w:r>
+        <w:t xml:space="preserve">«Fru Claus.» Hun tok imot vottene, talte dem og skrev tallet ned. «Håndarbeidsbordet i bortre ende. Takk skal du ha. Og reinsdyrene dine står ikke på programmet i år.»</w:t>
       </w:r>
     </w:p>
     <w:p/>
@@ -1648,7 +1648,7 @@
     <w:p/>
     <w:p>
       <w:r>
-        <w:t>«For oss selv,» samtykket jeg, krysset hjertet og så henne kvele en bevegelse med hånden over kristtornen for å skjule den for den travle komiteen, akkurat som om hun holdt en liten, varm hemmelighet i live mellom hendene.</w:t>
+        <w:t xml:space="preserve">«For oss selv,» samtykket jeg, krysset hjertet og så henne kupe hånden over kristtornen for å skjule den for den travle komiteen, akkurat som om hun holdt en liten, varm hemmelighet i live mellom hendene.</w:t>
       </w:r>
     </w:p>
     <w:p/>
@@ -1660,31 +1660,31 @@
     <w:p/>
     <w:p>
       <w:r>
-        <w:t>Jeg burde ha vært bekymret, og en liten, forsiktig del av meg var det også. Men resten av meg stod på kne i det kalde gresset sammen med en jente som var på helsestoff, en kvist umulig kristtorn, en hund i gevirlue og en pingvin med gresskar på haken, og stikk i strid med alt jeg visste om å være fornuftig, så kjente jeg en dyp glede.</w:t>
-      </w:r>
-    </w:p>
-    <w:p/>
-    <w:p>
-      <w:r>
-        <w:t>Så rettet jeg meg opp. Det lå fremdeles en utpressingstrussel brettet sammen i jakken min, et styremøte i vente og en sliten mann blant alle esker og kasser.</w:t>
-      </w:r>
-    </w:p>
-    <w:p/>
-    <w:p>
-      <w:r>
-        <w:t>«Slik at det blir i morgen til samme tid?» spurte Emma håpefullt, med hånden fremdeles over kristtornen. «For Pips skyld?»</w:t>
-      </w:r>
-    </w:p>
-    <w:p/>
-    <w:p>
-      <w:r>
-        <w:t>«Slik at det blir i morgen til samme tid,» sa jeg. «For Pips skyld. Pass på at hun ikke river ned resten av festivalen.»</w:t>
-      </w:r>
-    </w:p>
-    <w:p/>
-    <w:p>
-      <w:r>
-        <w:t>Og jeg samlet sammen den skamløse, gresskarkledde fuglen min og gikk hjemover gjennom kvelden som ble stadig kaldere.</w:t>
+        <w:t xml:space="preserve">Jeg burde ha vært bekymret, og en liten, forsiktig del av meg var det også. Men resten av meg stod på kne i det kalde gresset sammen med en jente som holdt på å bli hel igjen, en kvist umulig kristtorn, en hund i gevirlue og en pingvin med gresskar på haken, og stikk i strid med alt jeg visste om å være fornuftig, så kjente jeg en dyp glede.</w:t>
+      </w:r>
+    </w:p>
+    <w:p/>
+    <w:p>
+      <w:r>
+        <w:t xml:space="preserve">Så rettet jeg meg opp. Det lå fremdeles et utpressingsbrev brettet sammen i kåpen min, et styremøte i vente og en sliten mann blant alle esker og kasser.</w:t>
+      </w:r>
+    </w:p>
+    <w:p/>
+    <w:p>
+      <w:r>
+        <w:t xml:space="preserve">«Samme tid i morgen?» spurte Emma håpefullt, med hånden fremdeles over kristtornen. «For Pips skyld?»</w:t>
+      </w:r>
+    </w:p>
+    <w:p/>
+    <w:p>
+      <w:r>
+        <w:t xml:space="preserve">«Samme tid i morgen,» sa jeg. «For Pips skyld. Pass på at hun ikke river ned resten av festivalen.»</w:t>
+      </w:r>
+    </w:p>
+    <w:p/>
+    <w:p>
+      <w:r>
+        <w:t xml:space="preserve">Og jeg samlet sammen den skamløse fuglen min med gresskar på haken og gikk hjemover gjennom kvelden som ble stadig kaldere.</w:t>
       </w:r>
     </w:p>
     <w:p>
@@ -1715,17 +1715,17 @@
     </w:p>
     <w:p>
       <w:r>
-        <w:t>Vi tok med oss suppen inn i den lille stuen, og hun spiste, og jeg så på mens hun spiste. Jeg hadde lært for lenge siden at man kan se mye på et menneske ut fra om det husker å smake på maten sin. Fiona hadde sluttet å smake på sin et sted i løpet av de siste ukene. Hun spiste den første halvdelen av skålen som medisin, fort og uten å ense noe. Så, et sted midt i, saktere hun farten og smakte. Skuldrene sank noen centimeter, og jeg visste at suppen hjalp.</w:t>
-      </w:r>
-    </w:p>
-    <w:p>
-      <w:r>
-        <w:t>– Jeg tenker stadig på henne, sa hun etter en stund og la fra seg skjeen. – Constance. Det gjorde jeg aldri før. Hun var bare et navn på en vegg, et alvorlig ansikt i en ramme. Og nå er hun alt jeg tenker på. Den jenta, og det hun gjorde, og hva det har gjort med meg hundre år etterpå. Hun ga fra seg en liten, misfornøyd lat. – Rart, ikke sant. Jeg har tilbrakt hele livet mitt i huset hennes uten noen gang å prøve å bli kjent med henne. Kom og se. Jeg vil vise deg noe.</w:t>
-      </w:r>
-    </w:p>
-    <w:p>
-      <w:r>
-        <w:t>Hun ledet meg ut i forgangen, der ettermiddagslyset falt skrått gjennom overlysvinduet over døren og lå som en lang, gyllen stripe over gulvbordene. På veggen ved trappen, i en enkel, mørk ramme jeg hadde gått forbi et dusin ganger uten å ense, hang et fotografi. En kvinne i en slik kjole med høy krage og tettbølget hår som var vanlig for et århundre siden, med haken løftet, med mørke øyne som møtte kameraet like standhaftig som Blackburn-kvinnens hadde gjort på det andre fotografiet, med det samme stramme blikket, selv om det hvilte hardere på dette ansiktet, mer trett og nærmere beinet. Yngre enn jeg hadde forestilt meg. Yngre enn kvinnen på utpresserens bilde, som var en Blackburn i sin stas. Dette var Constance selv, i en billig fotostudiostol med en malt hage i bakgrunnen, kledd i sin fineste stas, som ikke var mye å skryte av.</w:t>
+        <w:t xml:space="preserve">Vi tok med oss suppen inn i den lille stuen, og hun spiste, og jeg så på mens hun spiste. Jeg hadde lært for lenge siden at man kan se mye på et menneske ut fra om det husker å smake på maten sin. Fiona hadde sluttet å smake på sin et sted i løpet av de siste ukene. Hun spiste den første halvdelen av skålen som medisin, fort og uten å ense noe. Så, et sted midt i, saktnet hun farten og smakte. Skuldrene sank noen centimeter, og jeg visste at suppen hjalp.</w:t>
+      </w:r>
+    </w:p>
+    <w:p>
+      <w:r>
+        <w:t xml:space="preserve">– Jeg tenker stadig på henne, sa hun etter en stund og la fra seg skjeen. – Constance. Det gjorde jeg aldri før. Hun var bare et navn på en vegg, et alvorlig ansikt i en ramme. Og nå er hun alt jeg tenker på. Den jenta, og det hun gjorde, og hva det har gjort med meg hundre år etterpå. Hun ga fra seg en liten, misfornøyd latter. – Rart, ikke sant. Jeg har tilbrakt hele livet mitt i huset hennes uten noen gang å prøve å bli kjent med henne. Kom og se. Jeg vil vise deg noe.</w:t>
+      </w:r>
+    </w:p>
+    <w:p>
+      <w:r>
+        <w:t xml:space="preserve">Hun ledet meg ut i forhallen, der ettermiddagslyset falt skrått gjennom overlysvinduet over døren og lå som en lang, gyllen stripe over gulvbordene. På veggen ved trappen, i en enkel, mørk ramme jeg hadde gått forbi et dusin ganger uten å ense, hang et fotografi. En kvinne i en slik kjole med høy krage og tettbølget hår som var vanlig for et århundre siden, med haken løftet, med mørke øyne som møtte kameraet like standhaftig som Blackburn-kvinnens hadde gjort på det andre fotografiet, med det samme stramme blikket, selv om det hvilte hardere på dette ansiktet, mer trett og nærmere beinet. Yngre enn jeg hadde forestilt meg. Yngre enn kvinnen på utpresserens bilde, som var en Blackburn i sin stas. Dette var Constance selv, i en billig fotostudiostol med en malt hage i bakgrunnen, kledd i sin fineste stas, som ikke var mye å skryte av.</w:t>
       </w:r>
     </w:p>
     <w:p>
@@ -1740,12 +1740,12 @@
     </w:p>
     <w:p>
       <w:r>
-        <w:t>– Hun drev vertshuset i førti år, fortsatte Fiona. – Visste du det? Førti år. Oldemoren min. Hun giftet seg sent, fikk bestemor sent, og hele tiden drev hun dette huset og bespiste hver eneste sjel som kom inn i kulden. Det finnes en historie som bestemor fortalte, om at Constance tok inn tre familier som ikke hadde et sted å gjøre av seg, i løpet av en fæl influensavinter. Hun mettet dem fra sitt eget forråd helt til våren, krevde aldri en øre for det og snakket aldri om det. Det er den kvinnen hun ble. Det er det hun bygget oppå den tingen hun gjorde. Fionas stemme ble tykkere. – Og jeg har vært så skamfull over henne. Så redd for henne. Når sannheten er at hun er den modigste personen jeg er i slekt med, og hun skapte alt dette, all denne varmen, ut av en forferdelig, desperat vinter, og jeg får leve i den, og det verste jeg noensinne har måttet gjøre, er å telle stoler.</w:t>
-      </w:r>
-    </w:p>
-    <w:p>
-      <w:r>
-        <w:t>Jeg la armen rundt henne der i det gylne lyset under fotografiet, og hun lente seg inn mot meg, og en stund sa ingen av oss noe. Pip hadde lusket inn fra stuen og lagt seg i den varme solstripen på gulvbordene, og hun tittet opp på fotografiet hun også, med hodet på skakke som om hun viste sin lille ære.</w:t>
+        <w:t xml:space="preserve">– Hun drev vertshuset i førti år, fortsatte Fiona. – Visste du det? Førti år. Oldemoren min. Hun giftet seg sent, fikk bestemor sent, og hele tiden drev hun dette huset og bespiste hver eneste sjel som kom inn fra kulden. Det finnes en historie som bestemor fortalte, om at Constance tok inn tre familier som ikke hadde et sted å gjøre av seg, i løpet av en fæl influensavinter. Hun mettet dem fra sitt eget forråd helt til våren, krevde aldri en øre for det og snakket aldri om det. Det er den kvinnen hun ble. Det er det hun bygget oppå den tingen hun gjorde. Fionas stemme ble tykkere. – Og jeg har vært så skamfull over henne. Så redd for henne. Når sannheten er at hun er den modigste personen jeg er i slekt med, og hun skapte alt dette, all denne varmen, ut av en forferdelig, desperat vinter, og jeg får leve i den, og det verste jeg noensinne har måttet gjøre, er å telle stoler.</w:t>
+      </w:r>
+    </w:p>
+    <w:p>
+      <w:r>
+        <w:t xml:space="preserve">Jeg la armen rundt henne der i det gylne lyset under fotografiet, og hun lente seg inn mot meg, og en stund sa ingen av oss noe. Pip hadde lusket inn fra stuen og lagt seg i den varme solstripen på gulvbordene, og hun tittet opp på fotografiet hun også, med hodet på skakke som om hun viste sin lille ærbødighet.</w:t>
       </w:r>
     </w:p>
     <w:p>
@@ -1775,7 +1775,7 @@
     </w:p>
     <w:p>
       <w:r>
-        <w:t>Det fikk en ordentlig lott frem i henne, den dype som kommer på en gang, den jeg hadde savnet, og det gjorde meg like godt å høre den som suppen hadde gjort for henne. Vi gikk tilbake til stolene sammen. Jeg talte mens hun fikset de vaklevorne, og Pip førte oppsyn fra den varme flekken i solen. I en time var vertshuset bare et vertshus igjen, varmt og travelt, i ferd med å gjøre seg klart til en festival. Uansett hva som ellers skjedde, var dette verdt å beskytte: varmen som en redd jente hadde skapt av ingenting og gitt videre gjennom hundre år til en annen kvinne som talte stoler.</w:t>
+        <w:t xml:space="preserve">Det fikk en ordentlig latter frem i henne, den dype som kommer på en gang, den jeg hadde savnet, og det gjorde meg like godt å høre den som suppen hadde gjort for henne. Vi gikk tilbake til stolene sammen. Jeg talte mens hun fikset de vaklevorne, og Pip førte oppsyn fra den varme flekken i solen. I en time var vertshuset bare et vertshus igjen, varmt og travelt, i ferd med å gjøre seg klart til en festival. Uansett hva som ellers skjedde, var dette verdt å beskytte: varmen som en redd jente hadde skapt av ingenting og gitt videre gjennom hundre år til en annen kvinne som talte stoler.</w:t>
       </w:r>
     </w:p>
     <w:p>
@@ -1796,7 +1796,7 @@
     <w:p/>
     <w:p>
       <w:r>
-        <w:t>Det var derfor jeg hadde kommet. Jeg hadde holdt utpressingstrusselen opp til nesen et dusin ganger siden Fiona ga den til meg, og forsøkt å plassere det svake, metalliske preget som hang ved papiret, og kvelden før, da jeg lå våken og hørte på Nicks pust, hadde jeg funnet ut av det. Det var dette. Kull, og varmt jern, og noe mineralsk under det hele, hele pusten fra en arbeidssam smie. Jeg hadde kommet for å være sikker.</w:t>
+        <w:t xml:space="preserve">Det var derfor jeg hadde kommet. Jeg hadde holdt utpressingsbrevet opp til nesen et dusin ganger siden Fiona ga den til meg, og forsøkt å plassere det svake, metalliske preget som hang ved papiret, og kvelden før, da jeg lå våken og hørte på Nicks pust, hadde jeg funnet ut av det. Det var dette. Kull, og varmt jern, og noe mineralsk under det hele, hele pusten fra en arbeidssam smie. Jeg hadde kommet for å være sikker.</w:t>
       </w:r>
     </w:p>
     <w:p/>
@@ -1808,13 +1808,13 @@
     <w:p/>
     <w:p>
       <w:r>
-        <w:t>Når stjernen gikk fra oransje til matt rødt, kjølte Sam den ned i en hvesing og en dampstråle, snudde seg og fikk øye på meg.</w:t>
-      </w:r>
-    </w:p>
-    <w:p/>
-    <w:p>
-      <w:r>
-        <w:t>– Fru Claus. Han satte hammeren ned på ambolthornet og tørket hendene av på skinnforkleet, og etterlot nye, mørke strøk over de gamle. – De er her for lysestaken. Den er ferdig. Den ble fin, om jeg skal si det selv. Han smilte nesten, det alvorlige, nøysomme nærsmilet som var alt Sam ga en kunde, og gikk bort til en benk langs bakveggen.</w:t>
+        <w:t xml:space="preserve">Da stjernen gikk fra oransje til matt rødt, kjølte Sam den ned i en hvesing og en dampstråle, snudde seg og fikk øye på meg.</w:t>
+      </w:r>
+    </w:p>
+    <w:p/>
+    <w:p>
+      <w:r>
+        <w:t xml:space="preserve">– Fru Claus. Han satte hammeren ned på ambolthornet og tørket hendene av på skinnforkleet, og etterlot nye, mørke strøk over de gamle. – Du er her for lysestaken. Den er ferdig. Den ble fin, om jeg skal si det selv. Han smilte nesten, det alvorlige, nøysomme nærsmilet som var alt Sam ga en kunde, og gikk bort til en benk langs bakveggen.</w:t>
       </w:r>
     </w:p>
     <w:p/>
@@ -1832,7 +1832,7 @@
     <w:p/>
     <w:p>
       <w:r>
-        <w:t>Og mens jeg beundret den, trakk jeg inn lukten fra smia, og der var den, umiskjennelig, den nøyaktige lukten som hang ved et ark kremfarget papir brettet i kåpen min. Den var på brettet, og den var her. Og jeg tvang meg til å ta det med ro, tvang meg til å holde kullet i den åpne hånden og ikke lukke knyttneven rundt det, for en lukt er ingen tilståelse. Sam Patel hadde etter alle solemerker vært hederlig og grei med hele denne byen i ti år, og jeg hadde kommet for å se, ikke for å dømme.</w:t>
+        <w:t xml:space="preserve">Og mens jeg beundret den, trakk jeg inn lukten fra smia, og der var den, umiskjennelig, den nøyaktige lukten som hang ved et ark kremfarget papir brettet i kåpen min. Den var på brevet, og den var her. Og jeg tvang meg til å ta det med ro, tvang meg til å holde kullet i den åpne hånden og ikke lukke knyttneven rundt det, for en lukt er ingen tilståelse. Sam Patel hadde etter alle solemerker vært hederlig og grei med hele denne byen i ti år, og jeg hadde kommet for å se, ikke for å dømme.</w:t>
       </w:r>
     </w:p>
     <w:p/>
@@ -1868,7 +1868,7 @@
     <w:p/>
     <w:p>
       <w:r>
-        <w:t>Og likevel var lukten her, og lukten var på brettet. Jeg kunne ikke få de to sanne tingene til å slutte å være sanne bare fordi jeg hadde bestemt meg for at jeg likte mannen.</w:t>
+        <w:t xml:space="preserve">Og likevel var lukten her, og lukten var på brevet. Jeg kunne ikke få de to sanne tingene til å slutte å være sanne bare fordi jeg hadde bestemt meg for at jeg likte mannen.</w:t>
       </w:r>
     </w:p>
     <w:p/>
@@ -1880,13 +1880,13 @@
     <w:p/>
     <w:p>
       <w:r>
-        <w:t>– Alle er skrapa hvert år. Han la endelig fra seg fillen og så rett på meg. – Jeg bryr meg ikke om å ha penger til gode hos en venn som sliter, fru Claus. Hele byen sjonglerer, det vet jeg lige godt som noen, jeg gjør halvparten av arbeidet mitt på tillit. Om hun bare hadde sagt, Sam, ting er i en knipe, gi meg frist til våren, ville jeg revet regningen og sagt at hun ikke skulle tenke på det mer. Det er det at hun unngår blikket mitt jeg ikke holder ut. En kvinne som bare har det knapt med kontanter, oppfører seg ikke sånn. Hun skammer seg, eller er redd for et eller annet, og det har ingenting med de tjue dollarene mine å gjøre, og jeg kommer ikke nær nok til å hjelpe. Han spredde de sotsvarte hendene. – Er hun i knipe? Virkelig i knipe? For hvis hun er det, vil jeg mye heller vite om det og hjelpe enn å stå her og være sur for litt vekselpengelignende en smålig kar.</w:t>
-      </w:r>
-    </w:p>
-    <w:p/>
-    <w:p>
-      <w:r>
-        <w:t>Og det, mer enn noe annet, fjernet det meste av mistanken min, nokså fullstendig, for en mann som holdt på med utpressing ville ikke stått i sin egen smie med hjertet utenpå og spurt om kvinnen han blødde, hadde det bra. Men nokså fullstendig er ikke det samme som å vite sikkert, og jeg holdt meg fast på mitt, og spurte om det jeg halvt om halvt hadde kommet for under lukten.</w:t>
+        <w:t xml:space="preserve">– Alle er skrapa hvert år. Han la endelig fra seg fillen og så rett på meg. – Jeg bryr meg ikke om å ha penger til gode hos en venn som sliter, fru Claus. Hele byen sjonglerer, det vet jeg like godt som noen, jeg gjør halvparten av arbeidet mitt på tillit. Om hun bare hadde sagt, Sam, ting er i en knipe, gi meg frist til våren, ville jeg revet regningen og sagt at hun ikke skulle tenke på det mer. Det er det at hun unngår blikket mitt jeg ikke holder ut. En kvinne som bare har det knapt med kontanter, oppfører seg ikke sånn. Hun skammer seg, eller er redd for et eller annet, og det har ingenting med de tjue dollarene mine å gjøre, og jeg kommer ikke nær nok til å hjelpe. Han spredde de sotsvarte hendene. – Er hun i knipe? Virkelig i knipe? For hvis hun er det, vil jeg mye heller vite om det og hjelpe enn å stå her og være sur for litt småpenger som en smålig kar.</w:t>
+      </w:r>
+    </w:p>
+    <w:p/>
+    <w:p>
+      <w:r>
+        <w:t xml:space="preserve">Og det, mer enn noe annet, fjernet det meste av mistanken min, nokså fullstendig, for en mann som holdt på med utpressing ville ikke stått i sin egen smie med hjertet utenpå og spurt om kvinnen han presset for penger, hadde det bra. Men nokså fullstendig er ikke det samme som å vite sikkert, og jeg holdt meg fast på mitt, og spurte om det jeg halvt om halvt hadde kommet for under lukten.</w:t>
       </w:r>
     </w:p>
     <w:p/>
@@ -1898,7 +1898,7 @@
     <w:p/>
     <w:p>
       <w:r>
-        <w:t>Han så tomt på meg. – Endte opp med å eie det? De har da alltid eid det. Så langt bak noen kan huske. Oldemoromoren hennes startet det, det er alt jeg vet, det henger et fotografi av den dama i gangen. Han trakk på skuldrene, tydelig uforstående til spørsmålet. – Hvorfor skulle jeg vite mer enn det? Jeg er smed. Jeg kan jern og jeg vet at kundene mine betaler for seint. De gamle familiene og alt det der, det er Theos avdeling, Historielaget. Støv får meg til å nyse. Jeg har aldri vært der inne.</w:t>
+        <w:t xml:space="preserve">Han så tomt på meg. – Endte opp med å eie det? De har da alltid eid det. Så langt bak noen kan huske. Oldemoren hennes startet det, det er alt jeg vet, det henger et fotografi av den dama i gangen. Han trakk på skuldrene, tydelig uforstående til spørsmålet. – Hvorfor skulle jeg vite mer enn det? Jeg er smed. Jeg kan jern og jeg vet at kundene mine betaler for seint. De gamle familiene og alt det der, det er Theos avdeling, Historielaget. Støv får meg til å nyse. Jeg har aldri vært der inne.</w:t>
       </w:r>
     </w:p>
     <w:p/>
@@ -1916,13 +1916,13 @@
     <w:p/>
     <w:p>
       <w:r>
-        <w:t>– Disse er også hennes, sa han, tok en opp og snudde den mot lyset, og det var kjærlighet i hendene hans for den den dag i dag. – Verandabrakettene. Siste del av bestillingen. Jeg har lagt mye av meg selv i den foajeen i år, vet du. Du kan ikke gå gjennom Fionas stue uten å berøre noe jeg har lagt, eller stå i nærheten av det. Han satte stjernen ned. – Det passer meg. En smed liker å etterlate et sted som lukter av ilden hans.</w:t>
-      </w:r>
-    </w:p>
-    <w:p/>
-    <w:p>
-      <w:r>
-        <w:t>Jeg falt til ro inni meg. Hele foajeen var gjennomtrukket av jernet hans og pusten fra ilden hans, tykk som lukten av hundre middager på et kjøkken. Alt som ble igjen i den foajeen, alt som ble satt fra seg på resepsjonen eller stukket under en dør eller båret i lomma over det gulvet, ville lukte av Sam Patels smie.</w:t>
+        <w:t xml:space="preserve">– Disse er også hennes, sa han, tok en opp og snudde den mot lyset, og det var kjærlighet i hendene hans for den den dag i dag. – Verandabrakettene. Siste del av bestillingen. Jeg har lagt mye av meg selv i den foajeen i år, vet du. Du kan ikke gå gjennom Fionas stue uten å berøre noe jeg har laget, eller stå i nærheten av det. Han satte stjernen ned. – Det passer meg. En smed liker å etterlate et sted som lukter av ilden hans.</w:t>
+      </w:r>
+    </w:p>
+    <w:p/>
+    <w:p>
+      <w:r>
+        <w:t xml:space="preserve">Jeg ble helt stille inni meg. Hele foajeen var gjennomtrukket av jernet hans og pusten fra ilden hans, tykk som lukten av hundre middager på et kjøkken. Alt som ble igjen i den foajeen, alt som ble satt fra seg på resepsjonen eller stukket under en dør eller båret i lomma over det gulvet, ville lukte av Sam Patels smie.</w:t>
       </w:r>
     </w:p>
     <w:p/>
@@ -1952,7 +1952,7 @@
     <w:p/>
     <w:p>
       <w:r>
-        <w:t>Jeg hadde kommet til smia og halvveis trodd at jeg gikk rett mot et svar. Jeg gikk derfra med et bedre spørsmål, med kullukten hengende i ullkåpen, og en voksende mistanke om at lukten på brettet markerte hvor det hadde vært.</w:t>
+        <w:t xml:space="preserve">Jeg hadde kommet til smia og halvveis trodd at jeg gikk rett mot et svar. Jeg gikk derfra med et bedre spørsmål, med kullukten hengende i ullkåpen, og en voksende mistanke om at lukten på brevet markerte hvor det hadde vært.</w:t>
       </w:r>
     </w:p>
     <w:p/>
@@ -1993,7 +1993,7 @@
     <w:p/>
     <w:p>
       <w:r>
-        <w:t>– Atten hundre og en og nitti. Blackburn-familien betalte halvparten av pengene til kirken på allmenningen. Visste du det? Halvparten. Sjenerte, de gamle, når det passet seg for å bli sett.</w:t>
+        <w:t xml:space="preserve">– Atten hundre og en og nitti. Blackburn-familien betalte halvparten av pengene til kirken på allmenningen. Visste du det? Halvparten. Gavmilde, de gamle, når det passet seg for å bli sett.</w:t>
       </w:r>
     </w:p>
     <w:p/>
@@ -2137,7 +2137,7 @@
     <w:p/>
     <w:p>
       <w:r>
-        <w:t>– Jeg gir dem til alle. Sannelig, alle. Jo flere mennesker i en by som vet hva jeg leter etter, desto sannsynligtere er det at noens bestemor viser seg å huske noe moren hennes sa en gang, og sparer meg for en måned.</w:t>
+        <w:t xml:space="preserve">– Jeg gir dem til alle. Sannelig, alle. Jo flere mennesker i en by som vet hva jeg leter etter, desto sannsynligere er det at noens bestemor viser seg å huske noe moren hennes sa en gang, og sparer meg for en måned.</w:t>
       </w:r>
     </w:p>
     <w:p/>
@@ -2155,7 +2155,7 @@
     <w:p/>
     <w:p>
       <w:r>
-        <w:t>Den som hadde skrevet det brevet, arbeidet i mørket. All hans makt, hver eneste gram av den, kom av å ikke bli sett. Han hadde skrevet med en hånd som ikke var hans egen. Han hadde bedt en kvinne henge et rødt bånd på kransen sin slik at han aldri trengte å vise ansiktet sitt for å kreve inn. Og her, over et bibliotekbord i det lyseste rommet i byen, satt Neil Carter og delte ut kort som en mann som stilte til valg, og fortalte bibliotekaren, ordføreren, fru Claus og hvem som helst som ville sitte stille, at han jaktet på en Blackburn-brosje som forlot byen på feil måte i 1924.</w:t>
+        <w:t xml:space="preserve">Den som hadde skrevet det brevet, arbeidet i mørket. All hans makt, hvert eneste gram av den, kom av å ikke bli sett. Han hadde skrevet med en hånd som ikke var hans egen. Han hadde bedt en kvinne henge et rødt bånd på kransen sin slik at han aldri trengte å vise ansiktet sitt for å kreve inn. Og her, over et bibliotekbord i det lyseste rommet i byen, satt Neil Carter og delte ut kort som en mann som stilte til valg, og fortalte bibliotekaren, ordføreren, fru Claus og hvem som helst som ville sitte stille, at han jaktet på en Blackburn-brosje som forlot byen på feil måte i 1924.</w:t>
       </w:r>
     </w:p>
     <w:p/>
@@ -2179,7 +2179,7 @@
     <w:p/>
     <w:p>
       <w:r>
-        <w:t>– Herr Carter, sa jeg, – antar at du fant ut at brosjen hadde blitt tatt av noen som trengte penger så altfor mye. En tjenestepike, for eksempel. En jente fra et hardt hus i en hard vinter. Hva ville du ha gjort med det?</w:t>
+        <w:t xml:space="preserve">– Herr Carter, sa jeg, – anta at du fant ut at brosjen hadde blitt tatt av noen som trengte penger så altfor mye. En tjenestepike, for eksempel. En jente fra et hardt hus i en hard vinter. Hva ville du ha gjort med det?</w:t>
       </w:r>
     </w:p>
     <w:p/>
@@ -2274,7 +2274,7 @@
     <w:p/>
     <w:p>
       <w:r>
-        <w:t>– Fordi hun ikke kom seg ut. Han senket stemmen. – Jeg mener, hun kom seg jo ut, klart det, der står hun i kålen, jeg har da øyne i hodet. Men grinden var klinket etterpå. Klinket igjen bak henne, utenfra, mens hun stod på utsiden. Tre ganger har jeg kommet ned og funnet grinda lukket og en rein på feil side av den, og du må forklare meg, fru Claus, hvordan et dyr klarer å rikke på en klinke fra den siden den ikke er på, og da skal jeg si deg det samme som jeg sier til unge Fenn, og det er at det foregår noe i denne byen, det foregår sannelig noe.</w:t>
+        <w:t xml:space="preserve">– Fordi hun ikke kom seg ut. Han senket stemmen. – Jeg mener, hun kom seg jo ut, klart det, der står hun i kålen, jeg har da øyne i hodet. Men grinden var klinket etterpå. Klinket igjen bak henne, utenfra, mens hun stod foran den. Tre ganger har jeg kommet ned og funnet grinda lukket og en rein på feil side av den, og du må forklare meg, fru Claus, hvordan et dyr klarer å rikke på en klinke fra den siden den ikke er på, og da skal jeg si deg det samme som jeg sier til unge Fenn, og det er at det foregår noe i denne byen, det foregår sannelig noe.</w:t>
       </w:r>
     </w:p>
     <w:p/>
@@ -2298,13 +2298,13 @@
     <w:p/>
     <w:p>
       <w:r>
-        <w:t>– På verkstedet. Hvor ellers. Bram snøftet, såret på nytt. – Vil ikke slippe meg inn. Vil ikke slippe Fenn inn. Sitter og bygger hvem-veit-hva bak låst dør til alle døgnets tider og nynner for seg selv. Jeg har vært formann på det verkstedet i to hundre år, fru Claus, to hundre, og nå blir jeg stengt ute fra halve greia som en hvem som helst som kommer for å avlevere strømmåleren. Han tok seg i det og la til i en fart: – Ikke det at jeg ville snoke. Jeg ville aldri snoket. Det er bare det at et verksted vil ha en formann som vet hva som befinner seg der inne, det er alt, det er snakk om yrkesstolthet.</w:t>
-      </w:r>
-    </w:p>
-    <w:p/>
-    <w:p>
-      <w:r>
-        <w:t>– Jeg blir stengt ute jeg òg, om det er til noen trøst, sa jeg, og det så faktisk ut til å trøste ham, den lille, stakkarslige trøsten i å dele en fortred. Jeg lot ham stå der og bekymre seg produktivt over grinda, noe som var Brams foretrukne tilstand og ikke gjorde skade, og gikk for å finne mannen min.</w:t>
+        <w:t xml:space="preserve">– På verkstedet. Hvor ellers. Bram snøftet, såret på nytt. – Vil ikke slippe meg inn. Vil ikke slippe Fenn inn. Sitter og bygger hvem-veit-hva bak låst dør til alle døgnets tider og nynner for seg selv. Jeg har vært formann på det verkstedet i to hundre år, fru Claus, to hundre, og nå blir jeg stengt ute fra halve greia som en hvem som helst som kommer for å lese av strømmåleren. Han tok seg i det og la til i en fart: – Ikke det at jeg ville snoke. Jeg ville aldri snoket. Det er bare det at et verksted vil ha en formann som vet hva som befinner seg der inne, det er alt, det er snakk om yrkesstolthet.</w:t>
+      </w:r>
+    </w:p>
+    <w:p/>
+    <w:p>
+      <w:r>
+        <w:t xml:space="preserve">– Jeg blir stengt ute jeg òg, om det er til noen trøst, sa jeg, og det så faktisk ut til å trøste ham, den lille, stakkarslige trøsten i å ha selskap i harmen. Jeg lot ham stå der og bekymre seg produktivt over grinda, noe som var Brams foretrukne tilstand og ikke gjorde skade, og gikk for å finne mannen min.</w:t>
       </w:r>
     </w:p>
     <w:p/>
@@ -2340,7 +2340,7 @@
     <w:p/>
     <w:p>
       <w:r>
-        <w:t>– Det ble med oss ned, sa han. – Magien. Den biten kjenner du til. Den hørte aldri til på Nordpolen, Polen var bare stedet den satt. Et ildsted den hadde slitt glatt over veldig lang tid, et sted å være. Og så dro vi, og den ble med, fordi den er vår, eller vi er dens, jeg har aldri vært sikker på hvem av dem som gjelder. Og her har den intet ildsted. Intet slitt sted å falle til ro i. Derfor slår den gnister. Han nikket ut mot byen der nede, hvor festlysene var i ferd med å slå seg på langs takene i det fjerne, gule der de skulle ha vært oransje. – Små ting, for det meste. Lys som skifter farge. En klinke som smekker igjen av seg selv. Et gresskar som gror kristtorn. Den gjør ingen skade, Jess. Den vet ikke hvordan den skal gjøre skade. Den er som en hund som har mistet eieren sin, og som går fra dør til dør bortover hele gaten, like håpefull ved hver eneste en.</w:t>
+        <w:t xml:space="preserve">– Det ble med oss ned, sa han. – Magien. Den biten kjenner du til. Den hørte aldri til på Nordpolen, Nordpolen var bare stedet den satt. Et ildsted den hadde slitt glatt over veldig lang tid, et sted å være. Og så dro vi, og den ble med, fordi den er vår, eller vi er dens, jeg har aldri vært sikker på hvem av dem som gjelder. Og her har den intet ildsted. Intet slitt sted å falle til ro i. Derfor slår den gnister. Han nikket ut mot byen der nede, hvor festlysene var i ferd med å slå seg på langs takene i det fjerne, gylne der de skulle ha vært oransje. – Små ting, for det meste. Lys som skifter farge. En klinke som smekker igjen av seg selv. Et gresskar som gror kristtorn. Den gjør ingen skade, Jess. Den vet ikke hvordan den skal gjøre skade. Den er som en hund som har mistet eieren sin, og som går fra dør til dør bortover hele gaten, like håpefull ved hver eneste en.</w:t>
       </w:r>
     </w:p>
     <w:p/>
@@ -2358,7 +2358,7 @@
     <w:p/>
     <w:p>
       <w:r>
-        <w:t>– Og verkstedet. Jeg lot det ligge som et åpent spørsmål. – Overraskelsen din. Den henger sammen med dette.</w:t>
+        <w:t xml:space="preserve">– Og verkstedet. Jeg sa det ikke som et spørsmål. – Overraskelsen din. Den henger sammen med dette.</w:t>
       </w:r>
     </w:p>
     <w:p/>
@@ -2376,7 +2376,7 @@
     <w:p/>
     <w:p>
       <w:r>
-        <w:t>Pip hadde snusket langs den nederste spilen i luftegårdsgjerdet hele tiden. Jeg hadde brevet i frakkelommen, og nå gjorde hun det hun hadde begynt med hver gang brevet var i nærheten. Hun kom bort til lommen, presset nebbet flatt mot utsiden av den og stivnet til i den samme stillingen som hun falt i når hun hadde snifret opp et spor og ville være sikker. Så snudde hun seg og vraltet med stor verdighet bort fra meg, rett opp stien til kjøkkendøren, og ventet der til jeg åpnet den. Hun krysset gulvet og stanset ved kurven der jeg hadde lagt lysestaken jeg bar med meg hjem fra smia om morgenen. Hun satte seg ned ved siden av kurven, så opp på meg og sa et enkelt, skarpt og bestemt lite kvek, som en pekende finger.</w:t>
+        <w:t xml:space="preserve">Pip hadde snusket langs den nederste spilen i luftegårdsgjerdet hele tiden. Jeg hadde brevet i kåpelommen, og nå gjorde hun det hun hadde begynt med hver gang brevet var i nærheten. Hun kom bort til lommen, presset nebbet flatt mot utsiden av den og stivnet til i den samme stillingen som hun falt i når hun hadde snifret opp et spor og ville være sikker. Så snudde hun seg og vraltet målbevisst bort fra meg, rett opp stien til kjøkkendøren, og ventet der til jeg åpnet den. Hun krysset gulvet og stanset ved kurven der jeg hadde lagt lysestaken jeg bar med meg hjem fra smia om morgenen. Hun satte seg ned ved siden av kurven, så opp på meg og sa et enkelt, skarpt og bestemt lite kvek, som en pekende finger.</w:t>
       </w:r>
     </w:p>
     <w:p/>
@@ -2411,13 +2411,13 @@
     <w:p/>
     <w:p>
       <w:r>
-        <w:t>Rådhuset var en krusete mursteinsbygning i enden av allmenningen, med et klokketårn som hadde gått fire minutter for fort så lenge noen kunne huske. Jeg gikk dit på mandagen sammen med Pip på to ærend, ett av dem ekte og ett av dem mindre så. Det ekte ærendet var å føre kretsens navn opp på festivalens hjelperliste, og å spørre – på vegne av ingen andre enn byen selv – om Frost Falls kunne finne en liten slant til historielaget før taket raste sammen for godt. Det mindre ekte ærendet var å se ordentlig og på nært hold på Vera Reed.</w:t>
-      </w:r>
-    </w:p>
-    <w:p/>
-    <w:p>
-      <w:r>
-        <w:t>Foajéen var dekorert med portretter av tidligere ordførere, gullinnrammede og selvgode, og et oppsiktsvekkende antall av dem var Blackburner, med den samme lange Blackburn-nesen arvet nedover veggen som et stykke familie-sølv. Innerst i foajéen stod døren til den nåværende ordføreren åpen. Bak et bredt, rent skrivebord som ikke inneholdt annet enn en telefon og en lærpad, satt ordføreren selv, en glatt, grå mann som hadde arvet nesen, embetet og, så vidt noen i byen kunne bedømme, lite annet.</w:t>
+        <w:t xml:space="preserve">Rådhuset var en overpyntet mursteinsbygning i enden av allmenningen, med et klokketårn som hadde gått fire minutter for fort så lenge noen kunne huske. Jeg gikk dit på mandagen sammen med Pip på to ærend, ett av dem ekte og ett av dem mindre så. Det ekte ærendet var å føre syklubbens navn opp på festivalens hjelperliste, og å spørre – på vegne av ingen andre enn byen selv – om Frost Falls kunne finne en liten slant til historielaget før taket raste sammen for godt. Det mindre ekte ærendet var å se ordentlig og på nært hold på Vera Reed.</w:t>
+      </w:r>
+    </w:p>
+    <w:p/>
+    <w:p>
+      <w:r>
+        <w:t xml:space="preserve">Foajéen var dekorert med portretter av tidligere ordførere, gullinnrammede og selvgode, og et oppsiktsvekkende antall av dem var Blackburner, med den samme lange Blackburn-nesen arvet nedover veggen som et stykke familie-sølv. Innerst i foajéen stod døren til den nåværende ordføreren åpen. Bak et bredt, rent skrivebord som ikke inneholdt annet enn en telefon og et skriveunderlag i lær, satt ordføreren selv, en glatt, grå mann som hadde arvet nesen, embetet og, så vidt noen i byen kunne bedømme, lite annet.</w:t>
       </w:r>
     </w:p>
     <w:p/>
@@ -2429,7 +2429,7 @@
     <w:p/>
     <w:p>
       <w:r>
-        <w:t>– Fru Claus. Er det festivalinnsamlingen?</w:t>
+        <w:t xml:space="preserve">– Fru Claus. Er det festivallisten?</w:t>
       </w:r>
     </w:p>
     <w:p/>
@@ -2441,7 +2441,7 @@
     <w:p/>
     <w:p>
       <w:r>
-        <w:t>Han hadde et minutt, og han avse det fra bak det rene skrivebordet sitt uten å gjøre seg den umaken å reise seg. Jeg la fram saken for historielaget så godt jeg evnet. At taket lakk inn i bakrommene. At kjelen var inne i sin siste vinter. To århundrer med byens minne som sakte gikk i oppløsning for mangel på en brøkdel av det byen ville brukt på en eneste festivalhelg. Jeg la det fram varmt, og jeg la det fram kort. Claire hadde fortalt meg at triste historier ikke rister løs penger, og jeg forsøkte meg på noe stødigere og vanskeligere å feie til side enn tristhet.</w:t>
+        <w:t xml:space="preserve">Han hadde et minutt, og han avså det fra bak det rene skrivebordet sitt uten å gjøre seg den umaken å reise seg. Jeg la fram saken for historielaget så godt jeg evnet. At taket lakk inn i bakrommene. At fyrkjelen var inne i sin siste vinter. To århundrer med byens minne som sakte gikk i oppløsning for mangel på en brøkdel av det byen ville brukt på en eneste festivalhelg. Jeg la det fram varmt, og jeg la det fram kort. Claire hadde fortalt meg at triste historier ikke rister løs penger, og jeg forsøkte meg på noe stødigere og vanskeligere å feie til side enn tristhet.</w:t>
       </w:r>
     </w:p>
     <w:p/>
@@ -2453,13 +2453,13 @@
     <w:p/>
     <w:p>
       <w:r>
-        <w:t>– Det er en verdig sak, sa han da jeg var ferdig. Theo gjør en fin jobb på sin måte. Men byens budsjett er byens budsjett, fru Claus, og historien – om jeg så må si det – brøyter ikke veier i februar eller holder gatelysene brennende. Laget har alltid klart seg selv på egen hånd. Jeg er sikker på at de lander på føttene, det har de da alltid gjort. Han frambrakte et smil, smilet til en mann som hadde bestemt seg for at han hadde vært gavmild bare ved å lytte. Kanskje festivalen deres viser seg å bli en fin liten innsamling for dem. Folk blir jo så sentimentale på denne tiden av året.</w:t>
-      </w:r>
-    </w:p>
-    <w:p/>
-    <w:p>
-      <w:r>
-        <w:t>– Det blir de, samtykket jeg. Det er noe av det bedre ved dem.</w:t>
+        <w:t xml:space="preserve">– Det er en verdig sak, sa han da jeg var ferdig. – Theo gjør en fin jobb på sin måte. Men byens budsjett er byens budsjett, fru Claus, og historien – om jeg så må si det – brøyter ikke veier i februar eller holder gatelysene brennende. Laget har alltid klart seg selv på egen hånd. Jeg er sikker på at de lander på føttene, det har de da alltid gjort. Han frambrakte et smil, smilet til en mann som hadde bestemt seg for at han hadde vært gavmild bare ved å lytte. – Kanskje festivalen deres viser seg å bli en fin liten innsamling for dem. Folk blir jo så sentimentale på denne tiden av året.</w:t>
+      </w:r>
+    </w:p>
+    <w:p/>
+    <w:p>
+      <w:r>
+        <w:t xml:space="preserve">– Det blir de, samtykket jeg. – Det er noe av det bedre ved dem.</w:t>
       </w:r>
     </w:p>
     <w:p/>
@@ -2471,13 +2471,13 @@
     <w:p/>
     <w:p>
       <w:r>
-        <w:t xml:space="preserve">Hun hadde festivalisten klar og pent opprettet på lærunderlaget sitt. Mens hun lot pennspissen gli nedover den og la til kretsen med sin lille, jevne hånd, lot jeg blikket gli over skrivebordet hennes, rolig, uanfektet, som en kvinne som venter mens en saksbehandler gjør seg ferdig. Det var et mirakel av orden, det skrivebordet. Merkede mapper som stod i et stativ. En lang veggkalender med ruter og anmerkninger. Og bak henne, fra gulv til tak, en vegg med arkivskap, hvert med en liten messingramme foran som holdt et maskinskrevet kort. </w:t>
+        <w:t xml:space="preserve">Hun hadde festivallisten klar og pent rettet inn på lærunderlaget sitt. Mens hun lot pennspissen gli nedover den og la til syklubben med sin lille, jevne hånd, lot jeg blikket gli over skrivebordet hennes, rolig, uanfektet, som en kvinne som venter mens en saksbehandler gjør seg ferdig. Det var et mirakel av orden, det skrivebordet. Merkede mapper som stod i et stativ. En lang veggkalender med ruter og anmerkninger. Og bak henne, fra gulv til tak, en vegg med arkivskap, hvert med en liten messingramme foran som holdt et maskinskrevet kort. </w:t>
       </w:r>
       <w:r>
         <w:rPr>
           <w:i/>
         </w:rPr>
-        <w:t>DEEDS. PERMITS. TAX ROLLS. PROPERTY RECORDS, 1900–1950.</w:t>
+        <w:t xml:space="preserve">SKJØTER. TILLATELSER. SKATTELISTER. EIENDOMSARKIV, 1900–1950.</w:t>
       </w:r>
       <w:r>
         <w:t xml:space="preserve"> Hele papirminnet om hvem som hadde eid hva i Frost Falls, et århundre av det, som stod bak denne ene trøtte kvinnens rygg, og nøklene til alt sammen på ringen i beltet hennes.</w:t>
@@ -2486,13 +2486,13 @@
     <w:p/>
     <w:p>
       <w:r>
-        <w:t>Pip hadde funnet messingrammene. Hun stod nese mot nese med sin egen speilbilde i den nederste og beundret det.</w:t>
-      </w:r>
-    </w:p>
-    <w:p/>
-    <w:p>
-      <w:r>
-        <w:t>– Du tar vare på eiendomsarkivene, sa jeg lett, som om jeg bare førte en samtale for å fylle pennens skrapende stillhet. Hele veien tilbake. Det må være nyttig for folk. Jeg vedder på at halvparten av byen kommer til deg når de vil vite hvem som bygde huset deres, eller hvor det ble av bestemorens jord.</w:t>
+        <w:t xml:space="preserve">Pip hadde funnet messingrammene. Hun stod nese mot nese med sitt eget speilbilde i den nederste og beundret det.</w:t>
+      </w:r>
+    </w:p>
+    <w:p/>
+    <w:p>
+      <w:r>
+        <w:t xml:space="preserve">– Du tar vare på eiendomsarkivene, sa jeg lett, som om jeg bare førte en samtale for å fylle pennens skrapende stillhet. – Hele veien tilbake. Det må være nyttig for folk. Jeg vedder på at halvparten av byen kommer til deg når de vil vite hvem som bygde huset deres, eller hvor det ble av bestemorens jord.</w:t>
       </w:r>
     </w:p>
     <w:p/>
@@ -2504,7 +2504,7 @@
     <w:p/>
     <w:p>
       <w:r>
-        <w:t>– Folk kommer til meg med alle slags ting, sa hun. Pennen fortsatte å bevege seg. Mest for å klage på skatten.</w:t>
+        <w:t xml:space="preserve">– Folk kommer til meg med alle slags ting, sa hun. Pennen fortsatte å bevege seg. – Mest for å klage på skatten.</w:t>
       </w:r>
     </w:p>
     <w:p/>
@@ -2528,19 +2528,19 @@
     <w:p/>
     <w:p>
       <w:r>
-        <w:t xml:space="preserve">– Jeg vet ingenting om Blackburn-familien, sa hun, noe som var en rar ting å si når en Blackburn satt to meter unna bak sin åpne dør og Blackburn-skjøter fylte skuffene bak henne. Det der er Theos avdeling. Historielaget. Jeg tar bare vare på arkivene. Jeg leser dem ikke. </w:t>
-      </w:r>
-    </w:p>
-    <w:p/>
-    <w:p>
-      <w:r>
-        <w:t xml:space="preserve">Hun skjøv festivalisten over skriveunderlaget til meg. </w:t>
-      </w:r>
-    </w:p>
-    <w:p/>
-    <w:p>
-      <w:r>
-        <w:t>– Der. Kretsen er lagt til. Var det noe annet?</w:t>
+        <w:t xml:space="preserve">– Jeg vet ingenting om Blackburn-familien, sa hun, noe som var en rar ting å si når en Blackburn satt to meter unna bak sin åpne dør og Blackburn-skjøter fylte skuffene bak henne. – Det der er Theos avdeling. Historielaget. Jeg tar bare vare på arkivene. Jeg leser dem ikke. </w:t>
+      </w:r>
+    </w:p>
+    <w:p/>
+    <w:p>
+      <w:r>
+        <w:t xml:space="preserve">Hun skjøv festivallisten over skriveunderlaget til meg. </w:t>
+      </w:r>
+    </w:p>
+    <w:p/>
+    <w:p>
+      <w:r>
+        <w:t xml:space="preserve">– Der. Syklubben er lagt til. Var det noe annet?</w:t>
       </w:r>
     </w:p>
     <w:p/>
@@ -2558,7 +2558,7 @@
     <w:p/>
     <w:p>
       <w:r>
-        <w:t>– Det var alt, sa jeg. Takk skal du ha, Vera. Du ser utslitt ut, om du tilgir at jeg sier det. De lar deg arbeide altfor hardt på dette stedet.</w:t>
+        <w:t xml:space="preserve">– Det var alt, sa jeg. – Takk skal du ha, Vera. Du ser utslitt ut, om du tilgir at jeg sier det. De lar deg arbeide altfor hardt på dette stedet.</w:t>
       </w:r>
     </w:p>
     <w:p/>
@@ -2570,7 +2570,7 @@
     <w:p/>
     <w:p>
       <w:r>
-        <w:t xml:space="preserve">– Det er sesongen, sa hun. Og ordføreren betaler en bylønn for et arbeid som tilsvarer en storby, og det strekker aldri helt til i slutten av måneden. Ikke for noen i år. Regningene betaler seg ikke selv. </w:t>
+        <w:t xml:space="preserve">– Det er sesongen, sa hun. – Og ordføreren betaler en bylønn for et arbeid som tilsvarer en storby, og det strekker aldri helt til i slutten av måneden. Ikke for noen i år. Regningene betaler seg ikke selv. </w:t>
       </w:r>
     </w:p>
     <w:p/>
@@ -2588,7 +2588,7 @@
     <w:p/>
     <w:p>
       <w:r>
-        <w:t>– Nei, sa hun. Det gjør de ikke.</w:t>
+        <w:t xml:space="preserve">– Nei, sa jeg. – Det gjør de ikke.</w:t>
       </w:r>
     </w:p>
     <w:p/>
@@ -2659,13 +2659,13 @@
     <w:p/>
     <w:p>
       <w:r>
-        <w:t>Theo ledde møtet med en papirbinge foran seg, brillene på og slipset på snei. Han reiste seg for å legge frem tallene, og jeg hadde sjelden sett en mann gjøre en vanskeligere ting med mer verdighet. For tallene var en dødsdom, og han leste dem opp likevel, med sin omstendelige historikerstemme, som om de var hvilke som helst andre fakta om byen han elsket.</w:t>
-      </w:r>
-    </w:p>
-    <w:p/>
-    <w:p>
-      <w:r>
-        <w:t>Kommunetilskuddet, kuttet med en tredjedel. Taket, kostnadsoverslag som fikk en av de gamle mennene til å grøsse. Kjelen, erklært utrangert av mannen som hadde vært der for å se på den, og som hadde sagt, rapporterte Theo, at han var overrasket over at den hadde kommet gjennom i fjor vinter. Fondet, det vesle som var igjen av det, tæret ned to år på rad for å holde lysene på, og nesten borte. Medlemskontingenten, som dekket, sa Theo mens han så på arket og ikke ut i rommet, «omtrent kostnaden for kaffen».</w:t>
+        <w:t xml:space="preserve">Theo ledde møtet med en papirbunke foran seg, brillene på og slipset på snei. Han reiste seg for å legge frem tallene, og jeg hadde sjelden sett en mann gjøre en vanskeligere ting med mer verdighet. For tallene var en dødsdom, og han leste dem opp likevel, med sin omhyggelige historikerstemme, som om de var hvilke som helst andre fakta om byen han elsket.</w:t>
+      </w:r>
+    </w:p>
+    <w:p/>
+    <w:p>
+      <w:r>
+        <w:t xml:space="preserve">Kommunetilskuddet, kuttet med en tredjedel. Taket, kostnadsoverslag som fikk en av de gamle mennene til å grøsse. Fyrkjelen, erklært utrangert av mannen som hadde vært der for å se på den, og som hadde sagt, rapporterte Theo, at han var overrasket over at den hadde kommet gjennom i fjor vinter. Fondet, det vesle som var igjen av det, tæret ned to år på rad for å holde lysene på, og nesten borte. Medlemskontingenten, som dekket, sa Theo mens han så på arket og ikke ut i rommet, «omtrent kostnaden for kaffen».</w:t>
       </w:r>
     </w:p>
     <w:p/>
@@ -2677,13 +2677,13 @@
     <w:p/>
     <w:p>
       <w:r>
-        <w:t>«Det er det regnestykket sier.» Theo tok av seg brillene og trykket fingrene mot neseroten, og et øyeblikk sviktet den omhyggelige stemmen. «Jeg har søkt overalt. Det vil jeg at dere alle skal vite. Hver eneste tilskuddsordning, hver stiftelse, hvert fond i tre fylker. Jeg har en mappe med avslag. Jeg kunne ha tapetsert dette rommet med dem, og da hadde i det minste rommet vært tørt.» Noen av dem lo, den triste, hjelpeløse latteren til folk ved veis ende. «Kommunen vil ikke hjelpe. Jeg dro til ordføreren selv i vår, og fru Claus her dro igjen i morges, og han sier det samme som han alltid sier. Historien brøyter ikke veiene.» Han satte brillene ned på papirene sine. «Jeg vet ikke hva annet jeg skal prøve. Jeg har prøvd å være rimelig. Jeg har prøvd å være ynkelig. Jeg er ikke for stolt til å si at jeg prøvde å være ynkelig, skriftlig, til en stiftelse i byen, og de sendte tilbake et svært vennlig brev der det sto nei.»</w:t>
-      </w:r>
-    </w:p>
-    <w:p/>
-    <w:p>
-      <w:r>
-        <w:t>Jeg så på ham mens han sa det. Jeg så en mann drukne midt på lys dag, i et kaldt rom, foran menneskene som elsket det han elsket, og som sa det høyt med vannet allerede opp til haken. Jeg hadde kommet til det møtet og fremdeles halvt håpet at mannen jeg mistenkte, på et eller annet vis ville vise seg å være en annen enn denne. Det gjorde han ikke. Han var nøyaktig denne. En god mann ved den absolutte enden av sin tålmodighet, som så samfunnet han hadde gitt sitt liv til, gå under for mangel på penger, mens flekken bredte seg utover taket og blikkbøtten fanget opp regnet.</w:t>
+        <w:t xml:space="preserve">«Det er det regnestykket sier.» Theo tok av seg brillene og trykket fingrene mot neseroten, og et øyeblikk sviktet den omhyggelige stemmen. «Jeg har søkt overalt. Det vil jeg at dere alle skal vite. Hver eneste tilskuddsordning, hver stiftelse, hvert fond i tre stater. Jeg har en mappe med avslag. Jeg kunne ha tapetsert dette rommet med dem, og da hadde i det minste rommet vært tørt.» Noen av dem lo, den triste, hjelpeløse latteren til folk ved veis ende. «Kommunen vil ikke hjelpe. Jeg dro til ordføreren selv i vår, og fru Claus her dro igjen i morges, og han sier det samme som han alltid sier. Historien brøyter ikke veiene.» Han satte brillene ned på papirene sine. «Jeg vet ikke hva annet jeg skal prøve. Jeg har prøvd å være rimelig. Jeg har prøvd å være ynkelig. Jeg er ikke for stolt til å si at jeg prøvde å være ynkelig, skriftlig, til en stiftelse i storbyen, og de sendte tilbake et svært vennlig brev der det sto nei.»</w:t>
+      </w:r>
+    </w:p>
+    <w:p/>
+    <w:p>
+      <w:r>
+        <w:t xml:space="preserve">Jeg så på ham mens han sa det. Jeg så en mann drukne midt på lys dag, i et kaldt rom, foran menneskene som elsket det han elsket, og som sa det høyt med vannet allerede opp til haken. Jeg hadde kommet til det møtet og fremdeles halvt håpet at mannen jeg mistenkte, på et eller annet vis ville vise seg å være en annen enn denne. Det gjorde han ikke. Han var nøyaktig denne. En god mann ved den absolutte enden av sin tålmodighet, som så laget han hadde gitt sitt liv til, gå under for mangel på penger, mens flekken bredte seg utover taket og blikkbøtten fanget opp regnet.</w:t>
       </w:r>
     </w:p>
     <w:p/>
@@ -2695,7 +2695,7 @@
     <w:p/>
     <w:p>
       <w:r>
-        <w:t>Vera var der også, i hjørnet, og tok referat. Ordførerkontoret sendte en person for å referere fra møtene til de organene det finansierte, og denne personen var Vera, med stenoblokken sin og den knappe cardiganen, som skrev alt ned med sin nette, raske hånd. Jeg så på henne også, når jeg kunne gjøre det uten å bli sett. Hun skrev ned tallene uten å mine en mine. Men da Theo sa det om å være ynkelig, om det vennlige brevet som sa nei, stoppet pennen hennes opp et øyeblikk. Kjeven strammet seg. Hun så opp på den brune flekken i taket, og det som fløy over ansiktet hennes, lå tett opp til sorg, eller frykt, eller begge deler på en gang. Jeg klarte ikke å tenke på hva en kvinne kunne sørge over eller frykte på et styremøte der hun bare var til stede for å skrive referat.</w:t>
+        <w:t xml:space="preserve">Vera var der også, i hjørnet, og tok referat. Ordførerkontoret sendte en person for å referere fra møtene til de organene det finansierte, og denne personen var Vera, med stenoblokken sin og den tilknappede cardiganen, som skrev alt ned med sin nette, raske hånd. Jeg så på henne også, når jeg kunne gjøre det uten å bli sett. Hun skrev ned tallene uten å mine en mine. Men da Theo sa det om å være ynkelig, om det vennlige brevet som sa nei, stoppet pennen hennes opp et øyeblikk. Kjeven strammet seg. Hun så opp på den brune flekken i taket, og det som fløy over ansiktet hennes, lå tett opp til sorg, eller frykt, eller begge deler på en gang. Jeg klarte ikke å tenke på hva en kvinne kunne sørge over eller frykte på et styremøte der hun bare var til stede for å skrive referat.</w:t>
       </w:r>
     </w:p>
     <w:p/>
@@ -2748,7 +2748,7 @@
     <w:p/>
     <w:p>
       <w:r>
-        <w:t>Han lo og rettet seg opp. Der var den, tingen jeg halvt om halvt hadde håpet på å slippe å se, og halvt om halvt trengte. Bak gliset var han slitt helt ned til treverket. Øynene hans var mørke av skygger. Selve gliset satt et hårfin hakk for stramt i vikene, med den skjelvingen som følger med noe som holdes oppe for lenge.</w:t>
+        <w:t xml:space="preserve">Han lo og rettet seg opp. Der var den, tingen jeg halvt om halvt hadde håpet på å slippe å se, og halvt om halvt trengte. Bak gliset var han slitt helt ned til treverket. Øynene hans var mørke av skygger. Selve gliset satt et hårfint hakk for stramt i munnvikene, med den skjelvingen som følger med noe som holdes oppe for lenge.</w:t>
       </w:r>
     </w:p>
     <w:p/>
@@ -2772,7 +2772,7 @@
     <w:p/>
     <w:p>
       <w:r>
-        <w:t>Gliset holdt, men det kostet ham noe å holde det. – Sakte, innrømmet han. – Banken sitter på lånet. Tredje måneden nå. Hver gang jeg tror vi er i mål, vil de ha en skjema til, enda et tall, enda en måneds kontoutskrift. Han så bort, utover det lyse, nye gulvet. – Jeg skal ikke lyve for deg, fru Claus, det er tøft. Jeg har satset alt på dette stedet. Alt jeg hadde, og vel så det. Det er netter jeg regner på det og bare blir liggende og ikke sover.</w:t>
+        <w:t xml:space="preserve">Gliset holdt, men det kostet ham noe å holde det. – Sakte, innrømmet han. – Banken sitter på lånet. Tredje måneden nå. Hver gang jeg tror vi er i mål, vil de ha et skjema til, enda et tall, enda en måneds kontoutskrift. Han så bort, utover det lyse, nye gulvet. – Jeg skal ikke lyve for deg, fru Claus, det er tøft. Jeg har satset alt på dette stedet. Alt jeg hadde, og vel så det. Det er netter jeg regner på det og bare blir liggende og ikke sover.</w:t>
       </w:r>
     </w:p>
     <w:p/>
@@ -2784,7 +2784,7 @@
     <w:p/>
     <w:p>
       <w:r>
-        <w:t>– Det er det. Han pustet ut en lang anstrengelse, og så, ettersom moren hans åpenbart hadde oppdratt ham til ikke å klage uten å ha en plan parat, rettet han på skuldrene. – Men her er det jeg gjør med det, siden du spurte, og jeg sier det heller rett ut til deg enn at du skal gå og bekymre deg. Jeg tok sikkerhetskontrakten for festivalen. Nattarbeid, hele helgen, passe på bodene og scenen og utstyret så ingenting vandrer avgårde i mørket. Og så har jeg lagt til de tidlige timene, klokka halv seks om morgenen, før den vanlige dagen i det hele tatt har startet. Han trakk på skuldrene, og gliset kom tilbake, mer ekte denne gangen. – Du løser ikke pengeproblemer med å ønske deg bort fra dem, fru Claus. Du løser det ved å jobbe flere timer enn problemene har. Det er den eneste måten jeg vet om, og den har aldri sviktet meg ennå, den er bare treg og gjør vondt.</w:t>
+        <w:t xml:space="preserve">– Det er det. Han pustet langt ut, og så, ettersom moren hans åpenbart hadde oppdratt ham til ikke å klage uten å ha en plan parat, rettet han på skuldrene. – Men her er det jeg gjør med det, siden du spurte, og jeg sier det heller rett ut til deg enn at du skal gå og bekymre deg. Jeg tok sikkerhetskontrakten for festivalen. Nattarbeid, hele helgen, passe på bodene og scenen og utstyret så ingenting vandrer avgårde i mørket. Og så har jeg lagt til de tidlige timene, boot camp klokka halv seks om morgenen, før den vanlige dagen i det hele tatt har startet. Han trakk på skuldrene, og gliset kom tilbake, mer ekte denne gangen. – Du løser ikke pengeproblemer med å ønske deg bort fra dem, fru Claus. Du løser det ved å jobbe flere timer enn problemene har. Det er den eneste måten jeg vet om, og den har aldri sviktet meg ennå, den er bare treg og gjør vondt.</w:t>
       </w:r>
     </w:p>
     <w:p/>
@@ -2796,7 +2796,7 @@
     <w:p/>
     <w:p>
       <w:r>
-        <w:t>Men jeg aktet å mistenke ham på redelig vis, og det betød at jeg sjekket selv etter at hjertet mitt for det meste hadde bestemt seg. Så jeg stilte det siste spørsmålet jeg hadde kommet for å stille, lett, som om det var løs prat.</w:t>
+        <w:t xml:space="preserve">Men jeg aktet å mistenke ham på redelig vis, og det betydde at jeg sjekket selv etter at hjertet mitt for det meste hadde bestemt seg. Så jeg stilte det siste spørsmålet jeg hadde kommet for å stille, lett, som om det var løs prat.</w:t>
       </w:r>
     </w:p>
     <w:p/>
@@ -2814,13 +2814,13 @@
     <w:p/>
     <w:p>
       <w:r>
-        <w:t>Han sa det lett, uten å ane at han hadde gitt meg noe som helst, og jeg holdt maska mens det sa et lite, rent klikk inni meg. Han hadde ikke lest brevene. Han hadde båret esken med blikket festet på føttene. Uansett hva utpresseren hadde lest i Blackburn-papirene, brosjen, steinen, pantehylla, hadde Jamal aldri hatt det foran øynene. Han hadde hatt det i armene, stengt inne i en eske, og aldri kikket oppi.</w:t>
-      </w:r>
-    </w:p>
-    <w:p/>
-    <w:p>
-      <w:r>
-        <w:t>– Vel, sa jeg, du er en god venn som låner bort alt det muskelarbeidet når du hadde nok av egne problemer. Han trengte det sårt, tror jeg.</w:t>
+        <w:t xml:space="preserve">Han sa det lett, uten å ane at han hadde gitt meg noe som helst, og jeg holdt maska mens det sa et lite, rent klikk inni meg. Han hadde ikke lest brevene. Han hadde båret esken med blikket festet på føttene. Uansett hva utpresseren hadde lest i Blackburn-papirene, brosjen, steinen, pantelåneren, hadde Jamal aldri hatt det foran øynene. Han hadde hatt det i armene, stengt inne i en eske, og aldri kikket oppi.</w:t>
+      </w:r>
+    </w:p>
+    <w:p/>
+    <w:p>
+      <w:r>
+        <w:t xml:space="preserve">– Vel, sa jeg, – du er en god venn som låner bort alt det muskelarbeidet når du hadde nok av egne problemer. Han trengte det sårt, tror jeg.</w:t>
       </w:r>
     </w:p>
     <w:p/>
@@ -2861,7 +2861,7 @@
     <w:p/>
     <w:p>
       <w:r>
-        <w:t>Magien, som hadde begynt sesongen med forsiktig å farge en lyslenke gullfarget, hadde blitt litt tøffere i fisken innen den uken festivalen startet. Jeg brukte det meste av en formiddag på å følge sporene etter den rundt i byen sammen med Pip, og resten av den med Bram hakk i hæl, mens han ramset opp sin egen fortvilelse.</w:t>
+        <w:t xml:space="preserve">Magien, som hadde begynt sesongen med forsiktig å farge en lyslenke gullfarget, hadde blitt litt tøffere i trynet innen den uken festivalen startet. Jeg brukte det meste av en formiddag på å følge sporene etter den rundt i byen sammen med Pip, og resten av den med Bram hakk i hæl, mens han ramset opp sin egen fortvilelse.</w:t>
       </w:r>
     </w:p>
     <w:p/>
@@ -2873,7 +2873,7 @@
     <w:p/>
     <w:p>
       <w:r>
-        <w:t xml:space="preserve">Greta hadde en stor snøkula i glass stående på disken i </w:t>
+        <w:t xml:space="preserve">Greta hadde en stor snøkule i glass stående på disken i </w:t>
       </w:r>
       <w:r>
         <w:t>&lt;bt&gt;</w:t>
@@ -2885,7 +2885,7 @@
         <w:t>&lt;/bt&gt;</w:t>
       </w:r>
       <w:r>
-        <w:t>, en sånn turistgreie med en liten keramisk utgave av Frost Falls inni, med byparken og rådhuset og det hele. Den morgenen, da jeg stakk innom for å hente kanelbollene til Nick, ville ikke snøen inni roe seg. Den virvlet og virvlet uten at noen var i nærheten av den, en bitteliten snøstorm som gikk rundt og rundt bak glasset. Greta hadde hengt et kjøkkenhåndkle over den ene halvdelen, som om det skulle hjelpe, og solgte bollene sine ved siden av med den sta livsgladen til en kvinne som hadde bestemt seg for ikke å snakke om snøkula.</w:t>
+        <w:t xml:space="preserve">, en sånn turistgreie med en liten keramisk utgave av Frost Falls inni, med allmenningen og rådhuset og det hele. Den morgenen, da jeg stakk innom for å hente kanelbollene til Nick, ville ikke snøen inni roe seg. Den virvlet og virvlet uten at noen var i nærheten av den, en bitteliten snøstorm som gikk rundt og rundt bak glasset. Greta hadde hengt et kjøkkenhåndkle over den ene halvdelen, som om det skulle hjelpe, og solgte bollene sine ved siden av med den sta munterheten til en kvinne som hadde bestemt seg for ikke å snakke om snøkula.</w:t>
       </w:r>
     </w:p>
     <w:p/>
@@ -2915,7 +2915,7 @@
     <w:p/>
     <w:p>
       <w:r>
-        <w:t>Ute på byparken var det derimot Brams problemer som gjaldt. Prancer hadde sluppet seg ut av innhegningen i løpet av natten og kommet ned i byen, og nå sto hun i bunnen av byens fontene, som ble skrudd av hver oktober, med høstblader opp til anklene. Hun sto der med hodet høyt hevet og nektet å rikke seg.</w:t>
+        <w:t xml:space="preserve">Ute på allmenningen var det derimot Brams problemer som gjaldt. Prancer hadde sluppet seg ut av innhegningen i løpet av natten og kommet ned i byen, og nå sto hun i bunnen av byens fontene, som ble skrudd av hver oktober, med høstblader opp til anklene. Hun sto der med hodet høyt hevet og nektet å rikke seg.</w:t>
       </w:r>
     </w:p>
     <w:p/>
@@ -2939,7 +2939,7 @@
     <w:p/>
     <w:p>
       <w:r>
-        <w:t>Pip gikk bort til kanten av fontenen, tittet ned i det tørre bassenget og snudde seg bort med et avskydd blikk. En fontene uten vann var en pingvin til null nytte.</w:t>
+        <w:t xml:space="preserve">Pip gikk bort til kanten av fontenen, tittet ned i det tørre bassenget og snudde seg bort med et avskydd blikk. En fontene uten vann var til null nytte for en pingvin.</w:t>
       </w:r>
     </w:p>
     <w:p/>
@@ -2951,7 +2951,7 @@
     <w:p/>
     <w:p>
       <w:r>
-        <w:t>Jeg gikk bort til fontenen, la hånden på den varme halsen til Prancer og lene meg tett inntil. – Det finnes da ingenting på denne parken som er halvparten så varmt som hjemme, sa jeg lavt til henne, bare for henne. – Vil du ha det varmt, så gå hjem. Gå og se.</w:t>
+        <w:t xml:space="preserve">Jeg gikk bort til fontenen, la hånden på den varme halsen til Prancer og lente meg tett inntil. – Det finnes da ingenting på denne allmenningen som er halvparten så varmt som hjemme, sa jeg lavt til henne, bare for henne. – Vil du ha det varmt, så gå hjem. Gå og se.</w:t>
       </w:r>
     </w:p>
     <w:p/>
@@ -2981,7 +2981,7 @@
     <w:p/>
     <w:p>
       <w:r>
-        <w:t>– Kalt hjem, sa han. – Jaja. Det er vel ikke det verste en skapning kan foreta seg. Eller en alv. – Han sukkede. – Da får jeg gå og hente Vixen ut fra kirken før hun spiser opp julefigurene. – Han luntet av sted og mumlet for seg selv. Folkemengden spredte seg, barna sto fremdeles og pekte oppover stien, og herr Kim klappet sammen stolen sin, reint fornøyd.</w:t>
+        <w:t xml:space="preserve">– Kalt hjem, sa han. – Jaja. Det er vel ikke det verste en skapning kan foreta seg. Eller en alv. – Han sukket. – Da får jeg gå og hente Vixen ut fra kirken før hun spiser opp julefigurene. – Han luntet av sted og mumlet for seg selv. Folkemengden spredte seg, barna sto fremdeles og pekte oppover stien, og herr Kim klappet sammen stolen sin, reint fornøyd.</w:t>
       </w:r>
     </w:p>
     <w:p/>
@@ -2993,7 +2993,7 @@
     <w:p/>
     <w:p>
       <w:r>
-        <w:t>Det burde ha uroet meg mer enn det gjorde. Det gikk en utpresser løs i byen, og en venninne ble skviset for en halv million dollar. Men et reinsdyr hadde nettopp klatret ut av en fontene fordi jeg hadde fortalt henne at det var noe varmere lenger oppe i stien. Barna hadde heiet på henne hele veien til hjørnet. Mot all sannsynlighet følte hjertet mitt seg som en drage som tok fyr.</w:t>
+        <w:t xml:space="preserve">Det burde ha uroet meg mer enn det gjorde. Det gikk en utpresser løs i byen, og en venninne ble skviset for en halv million dollar. Men et reinsdyr hadde nettopp klatret ut av en fontene fordi jeg hadde fortalt henne at det var noe varmere lenger oppe i stien. Barna hadde heiet på henne hele veien til hjørnet. Mot all sannsynlighet steg hjertet mitt til værs som en drage.</w:t>
       </w:r>
     </w:p>
     <w:p>
@@ -3008,7 +3008,7 @@
     </w:p>
     <w:p>
       <w:r>
-        <w:t>Pip og jeg var de siste som kom. De i sirkelen hadde dratt stolene sine tett inntil vedovnen, med kurv med skoggrønn ull på gulvet mellom seg. De ferdige vottene hang parvis langs en hyssing over disken, som klesvask. Pip gikk rett til knappeglasset på den lave hyllen ved kassaapparatet, og Olivia flyttet det opp på disken uten å miste en maske.</w:t>
+        <w:t xml:space="preserve">Pip og jeg var de siste som kom. Syklubben hadde dratt stolene sine tett inntil vedovnen, med kurver med garn i skolens grønnfarge på gulvet mellom seg. De ferdige vottene hang parvis langs en hyssing over disken, som klesvask. Pip gikk rett til knappeglasset på den lave hyllen ved kassaapparatet, og Olivia flyttet det opp på disken uten å miste en maske.</w:t>
       </w:r>
     </w:p>
     <w:p>
@@ -3023,7 +3023,7 @@
     </w:p>
     <w:p>
       <w:r>
-        <w:t>Ivy fortalte historien om fontenen. Hun hadde den fra Mr. Kim, som hadde sett hele opptrinnet fra sin sammenleggbare stol. I Ivys versjon hadde Prancer stått i fontenen siden daggry, og Bram hadde gått ut etter henne opp til armhulene.</w:t>
+        <w:t xml:space="preserve">Ivy fortalte historien om fontenen. Hun hadde den fra herr Kim, som hadde sett hele opptrinnet fra sin sammenleggbare stol. I Ivys versjon hadde Prancer stått i fontenen siden daggry, og Bram hadde gått ut etter henne opp til armhulene.</w:t>
       </w:r>
     </w:p>
     <w:p>
@@ -3033,7 +3033,7 @@
     </w:p>
     <w:p>
       <w:r>
-        <w:t>– Det er ikke sånn Mr. Kim forteller det. Ivy lo, den store, lune lattern som fylte butikken.</w:t>
+        <w:t xml:space="preserve">– Det er ikke sånn herr Kim forteller det. Ivy lo, den store, lune latteren som fylte butikken.</w:t>
       </w:r>
     </w:p>
     <w:p>
@@ -3053,12 +3053,12 @@
     </w:p>
     <w:p>
       <w:r>
-        <w:t>Martha sa ingenting. Hun hadde tatt med en formgryte til Theo på søndag, og denne gangen hadde han spist litt av den. Det hadde hun sagt til meg i døra, dempet, som en rapport fra et sykesrom.</w:t>
-      </w:r>
-    </w:p>
-    <w:p>
-      <w:r>
-        <w:t>– Når vi snakker om Historielaget, sa Ivy, er det noen andre som har hatt besøk av han fra biblioteket?</w:t>
+        <w:t xml:space="preserve">Martha sa ingenting. Hun hadde tatt med en formgryte til Theo på søndag, og denne gangen hadde han spist litt av den. Det hadde hun sagt til meg i døra, dempet, som en rapport fra et sykerom.</w:t>
+      </w:r>
+    </w:p>
+    <w:p>
+      <w:r>
+        <w:t xml:space="preserve">– Når vi snakker om Historielaget, sa Ivy, – er det noen andre som har hatt besøk av han fra biblioteket?</w:t>
       </w:r>
     </w:p>
     <w:p>
@@ -3088,7 +3088,7 @@
     </w:p>
     <w:p>
       <w:r>
-        <w:t>– Det har da enhver svindler i New Hampshire og.</w:t>
+        <w:t xml:space="preserve">– Det har da enhver svindler i New Hampshire òg.</w:t>
       </w:r>
     </w:p>
     <w:p>
@@ -3098,7 +3098,7 @@
     </w:p>
     <w:p>
       <w:r>
-        <w:t>Jeg hadde sitti på den andre siden av et bibliotekbord overfor Neil Carter en god stund, og jeg klarte fremdeles ikke å plassere ham. – Han er veldig interessert i Blackburn-slekta, sa jeg. – Jeg skulle gjerne visst hvem som betaler ham for å være det.</w:t>
+        <w:t xml:space="preserve">Jeg hadde sittet på den andre siden av et bibliotekbord overfor Neil Carter en god stund, og jeg klarte fremdeles ikke å plassere ham. – Han er veldig interessert i Blackburn-slekta, sa jeg. – Jeg skulle gjerne visst hvem som betaler ham for å være det.</w:t>
       </w:r>
     </w:p>
     <w:p>
@@ -3138,7 +3138,7 @@
     </w:p>
     <w:p>
       <w:r>
-        <w:t>– Innlosjeringen er full til festivalen, sa jeg. – Hun er helt utslitt.</w:t>
+        <w:t xml:space="preserve">– Vertshuset er fullt til festivalen, sa jeg. – Hun er helt utslitt.</w:t>
       </w:r>
     </w:p>
     <w:p>
@@ -3148,12 +3148,12 @@
     </w:p>
     <w:p>
       <w:r>
-        <w:t>Pip hadde gitt opp knappeglasset. Hun kom og la seg ved Marthas føtter, mot den varme siden av ovnen. Martha gled den ene foten ut av skoen og hvilte den på ryggen til Pip.</w:t>
-      </w:r>
-    </w:p>
-    <w:p>
-      <w:r>
-        <w:t>Vi arbeidet til lyset forsvant. Ved femtiden hang hyssingen over disken og seg i midten, og det var ni par igjen i kurvene. Ellie tok med seg tre par hjem og Ivy tok to. Den siste vrangborden på pinnene mine lød MAXIMILIAN i grønt og hvitt, og jeg måtte legge den flatt på kneet for å få plass til hver bokstav rundt.</w:t>
+        <w:t xml:space="preserve">Pip hadde gitt opp knappeglasset. Hun kom og la seg ved Marthas føtter, mot den varme siden av ovnen. Martha lot den ene foten gli ut av skoen og hvilte den på ryggen til Pip.</w:t>
+      </w:r>
+    </w:p>
+    <w:p>
+      <w:r>
+        <w:t xml:space="preserve">Vi arbeidet til lyset forsvant. Ved femtiden seg hyssingen over disken ned på midten, og det var ni par igjen i kurvene. Ellie tok med seg tre par hjem og Ivy tok to. Den siste vrangborden på pinnene mine lød MAXIMILIAN i grønt og hvitt, og jeg måtte legge den flatt på kneet for å få plass til hver bokstav rundt.</w:t>
       </w:r>
     </w:p>
     <w:p>
@@ -3200,7 +3200,7 @@
     </w:p>
     <w:p>
       <w:r>
-        <w:t>– Jamal bar boksene, men åpnet aldri en eneste, sa jeg. – Det sa han til meg selv, og jeg tror på ham. Hele stipendet hans handlet om å være «forsiktig, den er dyrebar». Han hadde hendene på utsiden av hemmeligheten hele uken og kikket aldri på innsiden. Og mannen jobber i tre jobber for å komme seg ut av uføret på ærlig vis, både klokken fem-tretti-treningen og nattvakt. Det er ikke ham. Jeg trakk en strek gjennom Jamals navn, med fast hånd. – Han hadde sjansen, men ikke kunnskapen. Og ikke hjertet til det heller, noe som betyr noe for meg, selv om det ikke ville holdt i en rettssak.</w:t>
+        <w:t xml:space="preserve">– Jamal bar boksene, men åpnet aldri en eneste, sa jeg. – Det sa han til meg selv, og jeg tror på ham. Hele hans historiske lærdom handlet om å være «forsiktig, den er dyrebar». Han hadde hendene på utsiden av hemmeligheten hele uken og kikket aldri på innsiden. Og mannen jobber i tre jobber for å komme seg ut av uføret på ærlig vis, både boot camp klokka halv seks og nattvakt. Det er ikke ham. Jeg trakk en strek gjennom Jamals navn, med fast hånd. – Han hadde sjansen, men ikke kunnskapen. Og ikke hjertet til det heller, noe som betyr noe for meg, selv om det ikke ville holdt i en rettssak.</w:t>
       </w:r>
     </w:p>
     <w:p>
@@ -3210,7 +3210,7 @@
     </w:p>
     <w:p>
       <w:r>
-        <w:t>– Sam hadde ingen sjanse i det hele tatt. Han har aldri satt sin fot i arkivet, sier at støv får ham til å nyse, og det tror jeg også på. Han sa til meg at de gamle familiene er Theos ansvarsområde, og det mente han. Jeg dunket fingeren mot papiret. – Lukten av smia plasserte ham på listen, og jeg tror at den samme lukten kommer til å stryke ham av listen igjen, for Pip har fortalt meg helt siden den første kvelden at lappen lukter av der Sams jern er, ikke av Sam. Og Sams jern er over alt i foajeen til Fiona. Alt som blir igjen der, lukter av smelten hans. Alt sammen.</w:t>
+        <w:t xml:space="preserve">– Sam hadde ingen sjanse i det hele tatt. Han har aldri satt sin fot i arkivet, sier at støv får ham til å nyse, og det tror jeg også på. Han sa til meg at de gamle familiene er Theos ansvarsområde, og det mente han. Jeg dunket fingeren mot papiret. – Lukten av smia plasserte ham på listen, og jeg tror at den samme lukten kommer til å stryke ham av listen igjen, for Pip har fortalt meg helt siden den første kvelden at lappen lukter av der Sams jern er, ikke av Sam. Og Sams jern er overalt i foajeen til Fiona. Alt som blir igjen der, lukter av ilden hans. Alt sammen.</w:t>
       </w:r>
     </w:p>
     <w:p>
@@ -3220,17 +3220,17 @@
     </w:p>
     <w:p>
       <w:r>
-        <w:t>Jeg strøk ikke Sam av listen riktig ennå, ikke helt. – Jeg vil bevise det før jeg frikjenner ham fullstendig, sa jeg. – Men jeg kunne satt huset på det. Lukten peker mot kroen, ikke mot mannen.</w:t>
-      </w:r>
-    </w:p>
-    <w:p>
-      <w:r>
-        <w:t>– Og din brautende mr. Carter.</w:t>
-      </w:r>
-    </w:p>
-    <w:p>
-      <w:r>
-        <w:t>Jeg rynket pannen over navnet hans på papiret. – Det er den jeg ikke klarer å avgjøre. Han vet alt utpresseren vet. Brosjen, den enslige stenen, Ridgeline, alt sammen. Han kom inn i det fra Blackburn-siden, advokatenes side, og har sporet det nesten helt til Constance's dør. Jeg snudde koppen en langsom halvturn på bordet. – Men han forteller det til alle. Han deler ut visittkort. Han satt på folkebiblioteket og fortalte meg hele historien før jeg i det hele tatt hadde rukket å spørre. En utpresser gjemmer seg, Nick. Hele makten hans ligger i det å gjemme seg. Og Neil Carter gjør nøyaktig det motsatte av å gjemme seg, hver eneste time på døgnet. Så enten er han ikke mannen vår i det hele tatt, eller så er han den klokkeste av dem alle, som lager så mye ærlig støy om brosjen at ingen i byen noensinne ville ofret en tanke på den som snakker høyest om den. Jeg satte et spørsmålstegn ved siden av Neil. – Jeg er ikke klar til å avskrive ham. Men jeg vil si så mye som dette: Han kjenner hemmeligheten, og han kom over den på ærlig vis, og han har aldri oppsøkt Fiona for å presse henne for en krone. Han har oppsøkt henne for å få svar, i dagslys, med en notisbok i hånden.</w:t>
+        <w:t xml:space="preserve">Jeg strøk ikke Sam av listen riktig ennå, ikke helt. – Jeg vil bevise det før jeg frikjenner ham fullstendig, sa jeg. – Men jeg kunne satt huset på det. Lukten peker mot vertshuset, ikke mot mannen.</w:t>
+      </w:r>
+    </w:p>
+    <w:p>
+      <w:r>
+        <w:t xml:space="preserve">– Og din brautende herr Carter.</w:t>
+      </w:r>
+    </w:p>
+    <w:p>
+      <w:r>
+        <w:t xml:space="preserve">Jeg rynket pannen over navnet hans på papiret. – Det er den jeg ikke klarer å avgjøre. Han vet alt utpresseren vet. Brosjen, den enslige stenen, Ridgeline, alt sammen. Han kom inn i det fra Blackburn-siden, advokatenes side, og har sporet det nesten helt til Constances dør. Jeg snudde koppen en langsom halvturn på bordet. – Men han forteller det til alle. Han deler ut visittkort. Han satt på folkebiblioteket og fortalte meg hele historien før jeg i det hele tatt hadde rukket å spørre. En utpresser gjemmer seg, Nick. Hele makten hans ligger i det å gjemme seg. Og Neil Carter gjør nøyaktig det motsatte av å gjemme seg, hver eneste time på døgnet. Så enten er han ikke mannen vår i det hele tatt, eller så er han den klokkeste av dem alle, som lager så mye ærlig støy om brosjen at ingen i byen noensinne ville ofret en tanke på den som snakker høyest om den. Jeg satte et spørsmålstegn ved siden av Neil. – Jeg er ikke klar til å avskrive ham. Men jeg vil si så mye som dette: Han kjenner hemmeligheten, og han kom over den på ærlig vis, og han har aldri oppsøkt Fiona for å presse henne for en krone. Han har oppsøkt henne for å få svar, i dagslys, med en notisbok i hånden.</w:t>
       </w:r>
     </w:p>
     <w:p>
@@ -3240,7 +3240,7 @@
     </w:p>
     <w:p>
       <w:r>
-        <w:t>– Da gjenstår det to. Jeg så på papiret og hadde ikke lyst til det. Vera. Theo. De to navnene jeg ikke klarte å sette en strek over. – Og det er dette som bekymrer meg. Av alle på denne listen er de eneste to jeg ikke kan frikjenne, de to som sitter på nøklene til byens gamle papirarkiv. Vera tar seg av skjøte- og eiendomsregistrene, et århundre med hvem-eide-hva, og kroens skjøte ligger et sted blant dem. Hun ble stiv som en pinne og fortalte meg at hun aldri leser de samme papirene som står rett bak ryggen hennes. Og Theo. Jeg tvang meg til å si det sakte. – Theo bor i arkivet. Blackburn-brevene var i hans varetekt, i hans hender. Og de mest interessante av dem, nettopp de som ville røpet at en brosje forsvant og hvor den tok veien, er de som han stilte seg opp foran hele byen og kunngjorde hadde kommet på avveie.</w:t>
+        <w:t xml:space="preserve">– Da gjenstår det to. Jeg så på papiret og hadde ikke lyst til det. Vera. Theo. De to navnene jeg ikke klarte å sette en strek over. – Og det er dette som bekymrer meg. Av alle på denne listen er de eneste to jeg ikke kan frikjenne, de to som sitter på nøklene til byens gamle papirarkiv. Vera tar seg av skjøte- og eiendomsregistrene, et århundre med hvem-eide-hva, og vertshusets skjøte ligger et sted blant dem. Hun ble stiv som en pinne og fortalte meg at hun aldri leser de samme papirene som står rett bak ryggen hennes. Og Theo. Jeg tvang meg til å si det sakte. – Theo bor i arkivet. Blackburn-brevene var i hans varetekt, i hans hender. Og de mest interessante av dem, nettopp de som ville røpet at en brosje forsvant og hvor den tok veien, er de som han stilte seg opp foran hele byen og kunngjorde hadde kommet på avveie.</w:t>
       </w:r>
     </w:p>
     <w:p>
@@ -3255,12 +3255,12 @@
     </w:p>
     <w:p>
       <w:r>
-        <w:t>– Jeg vil ikke at det skal være noen. Jeg presset hendene flatt mot bordet på hver sin side av papiret. – Jeg vil ha lest hele greia feil. Jeg vil at Neil skal vise seg å være en lur skurk slik at det kan være en fremmed som har blåst inn i byen, og ikke en venn som har levd her i tretti år. Men ønsker er ikke bevis, Nick, det har det aldri vært, og hvert eneste faktum jeg graver fram, danner den samme formen, og midt i den formen står Theos navn. Brevene kom ut av arkivet. Lappen er skrevet på arkivets eget papir. Og mannen som driver arkivet, er desperat. Han har banket på hver eneste ærlige dør som finnes og funnet dem stengt. Jeg ristet på hodet. – Det er en forferdelig fasit. Jeg håper hele tiden at neste faktum skal sprenge den i stykker. Og neste faktum dytter bare en ny sten på plass i stedet.</w:t>
-      </w:r>
-    </w:p>
-    <w:p>
-      <w:r>
-        <w:t>– Så test det ut, sa Nick, i stedet for å sitte her på kjøkkenet og grue deg, for det har aldri løst noe og kommer aldri til å gjøre det. Gå og se på den ene tingen du ikke har sett ordentlig på ennå. Selve brevene, eller stedet der de burde ligge. Han strakte seg over bordet og la den varme hånden sin flatt over den kalde hånden min. – Theo kunne trenge et par hender til å rydde opp i det arkivet. Gå og tilby deg. Og mens du hjelper til, kan du finne ut én eneste ting. Om ordene i den lappen samsvarer med ordene i brevene som ble borte. For hvis de gjør det, Jess, så har den som skrev lappen, ikke bare lest Blackburn-papirene i sin alminnelighet. De har hatt akkurat de brevene i hendene sine. Og det er en veldig kort liste over mennesker i Frost Falls som kan si det.</w:t>
+        <w:t xml:space="preserve">– Jeg vil ikke at det skal være noen. Jeg presset hendene flatt mot bordet på hver sin side av papiret. – Jeg vil ha lest hele greia feil. Jeg vil at Neil skal vise seg å være en lur skurk slik at det kan være en fremmed som har blåst inn i byen, og ikke en venn som har levd her i tretti år. Men ønsker er ikke bevis, Nick, det har det aldri vært, og hvert eneste faktum jeg graver fram, danner den samme formen, og midt i den formen står Theos navn. Brevene kom ut av arkivet. Lappen er skrevet på arkivets eget papir. Og mannen som driver arkivet, er desperat. Han har banket på hver eneste ærlige dør som finnes og funnet dem stengt. Jeg ristet på hodet. – Det er en forferdelig form. Jeg håper hele tiden at neste faktum skal sprenge den i stykker. Og neste faktum dytter bare en ny sten på plass i stedet.</w:t>
+      </w:r>
+    </w:p>
+    <w:p>
+      <w:r>
+        <w:t xml:space="preserve">– Så test det ut, sa Nick, – i stedet for å sitte her på kjøkkenet og grue deg, for det har aldri løst noe og kommer aldri til å gjøre det. Gå og se på den ene tingen du ikke har sett ordentlig på ennå. Selve brevene, eller stedet der de burde ligge. Han strakte seg over bordet og la den varme hånden sin flatt over den kalde hånden min. – Theo kunne trenge et par hender til å rydde opp i det arkivet. Gå og tilby deg. Og mens du hjelper til, kan du finne ut én eneste ting. Om ordene i den lappen samsvarer med ordene i brevene som ble borte. For hvis de gjør det, Jess, så har den som skrev lappen, ikke bare lest Blackburn-papirene i sin alminnelighet. De har hatt akkurat de brevene i hendene sine. Og det er en veldig kort liste over mennesker i Frost Falls som kan si det.</w:t>
       </w:r>
     </w:p>
     <w:p>
@@ -3270,7 +3270,7 @@
     </w:p>
     <w:p>
       <w:r>
-        <w:t>– Snart, sa jeg. – Det er to tråder til som må nøstes opp først. Sam og den fremmede. Jeg vil ha dem begge ut av verden, renvasket utover enhver tvil, før jeg lar meg selv gå inn i det arkivet og se ordentlig på Theo. Jeg skylder ham så pass, ikke å henge det på ham før det ikke er noen andre igjen å mistenke. Og så går jeg, og jeg ser på brevene, og jeg finner ut om ordene stemmer overens.</w:t>
+        <w:t xml:space="preserve">– Snart, sa jeg. – Det er to tråder til som må nøstes opp først. Sam og den fremmede. Jeg vil ha dem begge ute av bildet, renvasket utover enhver tvil, før jeg lar meg selv gå inn i det arkivet og se ordentlig på Theo. Jeg skylder ham så pass, ikke å henge det på ham før det ikke er noen andre igjen å mistenke. Og så går jeg, og jeg ser på brevene, og jeg finner ut om ordene stemmer overens.</w:t>
       </w:r>
     </w:p>
     <w:p>
@@ -3309,7 +3309,7 @@
     <w:p/>
     <w:p>
       <w:r>
-        <w:t>– Sam, jeg skyldte deg en ting. Jeg hadde snudd og vendt på hvordan jeg skulle gjøre dette hele veien nedover, og hadde bestemt meg for sannheten, eller så mye av den som det var opp til meg å gi. Jeg hadde mistenkt denne gode mannen, og den eneste ærlige måten å rette opp i det på var å betro ham en bit av saken til gjengjeld. – Kan vi gå en tur et øyeblikk? Bort fra vinduene.</w:t>
+        <w:t xml:space="preserve">– Sam, jeg skylder deg en ting. Jeg hadde snudd og vendt på hvordan jeg skulle gjøre dette hele veien nedover, og hadde bestemt meg for sannheten, eller så mye av den som det var opp til meg å gi. Jeg hadde mistenkt denne gode mannen, og den eneste ærlige måten å rette opp i det på var å betro ham en bit av saken til gjengjeld. – Kan vi gå en tur et øyeblikk? Bort fra vinduene.</w:t>
       </w:r>
     </w:p>
     <w:p/>
@@ -3333,7 +3333,7 @@
     <w:p/>
     <w:p>
       <w:r>
-        <w:t>– Utpressing. Han sa ordet lavt, som om det smakte vondt. – Fiona. Og jeg har stått på verandaen hennes i tre uker og vært sur for tyve kroner mens hun har båret på alt det der. Han presset håndbaken hardt mot pannen, slik at det ble en mørk flekk der. – Si til henne at det er slettet. De tyve kronene, hele bestillingen, hver eneste cent, si til henne at jeg aldri vil høre et ord om det igjen så lenge jeg lever. Gud. Jeg gjorde det verre, ikke sant? Maste på henne om penger mens hun holdt på å drukne. Jeg gjorde det verre uten å vite det.</w:t>
+        <w:t xml:space="preserve">– Utpressing. Han sa ordet lavt, som om det smakte vondt. – Fiona. Og jeg har stått på verandaen hennes i tre uker og vært sur for tjue dollar mens hun har båret på alt det der. Han presset håndbaken hardt mot pannen, slik at det ble en mørk flekk der. – Si til henne at det er tilgitt. De tjue dollarene, hele bestillingen, hver eneste cent, si til henne at jeg aldri vil høre et ord om det igjen så lenge jeg lever. Gud. Jeg gjorde det verre, ikke sant? Maste på henne om penger mens hun holdt på å drukne. Jeg gjorde det verre uten å vite det.</w:t>
       </w:r>
     </w:p>
     <w:p/>
@@ -3369,7 +3369,7 @@
     <w:p/>
     <w:p>
       <w:r>
-        <w:t>– Det kan jeg gjøre. Han tok tak i hånden min, hard som jern og varm. – Og fru Claus. Uansett hva dette koster å ordne opp i. Hvis det dreier seg om penger, hvis hun trenger penger for å være trygg, så forteller du henne at smedene i tre fylker skylder meg tjenester, og jeg skal kreve inn hver eneste en av dem uten å blunke. Det kan du også si til henne, når du forteller om de tyve kronene.</w:t>
+        <w:t xml:space="preserve">– Det kan jeg gjøre. Han tok tak i hånden min, hard som jern og varm. – Og fru Claus. Uansett hva dette koster å ordne opp i. Hvis det dreier seg om penger, hvis hun trenger penger for å være trygg, så forteller du henne at smedene i tre fylker skylder meg tjenester, og jeg skal kreve inn hver eneste en av dem uten å blunke. Det kan du også si til henne, når du forteller om de tjue dollarene.</w:t>
       </w:r>
     </w:p>
     <w:p/>
@@ -3398,7 +3398,7 @@
     <w:p/>
     <w:p>
       <w:r>
-        <w:t>«Skikkelig solid,» sa hun, før jeg i det hele tatt rakk å få frem et hei. «Gamlemåten, to stater unna, gjør nøyaktig det han din sier den gjør, skifteforvaltning og dødsboer og oppsporing av tapt eiendom for advokater som har mer penger enn tid. Og det finnes et Blackburn-bo, Jessica, et ekte, pågående ett. Den siste i Adelaide Blackburns linje døde nede i byen i vår, ingen barn, ikke noe testament verdt papiret det er skrevet på, og etterlot seg et gedigent rot. Ordføreren vår er fra fetter- og kusinesiden, den siden som fikk nesen og ikke en dritt av pengene. Han har ingenting med det å gjøre. Carter står i firmaets bøker som forskeren de leide inn for å gre ut i det. Jeg fikk det fra en saksbehandler som bekreftet hele greia uten en eneste gang å skjønne at hun bekreftet noe som helst. Han er nøyaktig, på prikken den han sa til deg at han er. En snoker med lisens og representasjonskonto.»</w:t>
+        <w:t xml:space="preserve">«Ekte firma,» sa hun, før jeg i det hele tatt rakk å få frem et hei. «Et gammelt et, to stater unna, gjør nøyaktig det han din sier det gjør, skifteforvaltning og dødsboer og oppsporing av tapt eiendom for advokater som har mer penger enn tid. Og det finnes et Blackburn-bo, Jessica, et ekte, pågående et. Den siste i Adelaide Blackburns linje døde nede i storbyen i vår, ingen barn, ikke noe testament verdt papiret det er skrevet på, og etterlot seg et gedigent rot. Ordføreren vår er fra fetter- og kusinesiden, den siden som fikk nesen og ingenting av pengene. Han har ingenting med det å gjøre. Carter står i firmaets bøker som forskeren de leide inn for å gre det ut. Jeg fikk det fra en saksbehandler som bekreftet hele greia uten en eneste gang å skjønne at hun bekreftet noe som helst. Han er nøyaktig, på prikken den han sa til deg at han er. En snoker med lisens og representasjonskonto.»</w:t>
       </w:r>
     </w:p>
     <w:p/>
@@ -3440,7 +3440,7 @@
     <w:p/>
     <w:p>
       <w:r>
-        <w:t>«En halv million.» Han lente seg tilbake og slapp ut et lavt fløytetone. «Herre min gud. Noen skviser etterkommeren. Over en ting loven ikke kan røre.» Han riste langsomt på hodet, og det var avsky i det, ekte avsky. «Det er grusomt, fru Claus, og det er dumt. Det er ingen tiltale noen kan reise over den brosjen nå. Blackburn-boet vil ikke ha venninnens dine penger, og det vil sannelig ikke ha huden hennes heller. Det vil ha én linje i en hovedbok som forteller hvor gjenstanden tok veien, slik at advokatene kan avslutte saken og slutte å sende regninger til hverandre. Den som blør venninnen din, selger henne en skrekk som ikke engang er ekte. Skammen er det eneste våpenet i den. Det finnes intet juridisk etterspill lenger, ikke etter hundre år.»</w:t>
+        <w:t xml:space="preserve">«En halv million.» Han lente seg tilbake og slapp ut en lav plystring. «Herre min gud. Noen skviser etterkommeren. Over en ting loven ikke kan røre.» Han ristet langsomt på hodet, og det var avsky i det, ekte avsky. «Det er grusomt, fru Claus, og det er dumt. Det er ingen tiltale noen kan reise over den brosjen nå. Blackburn-boet vil ikke ha pengene til venninnen din, og det vil sannelig ikke ha huden hennes heller. Det vil ha én linje i en hovedbok som forteller hvor gjenstanden tok veien, slik at advokatene kan avslutte saken og slutte å sende regninger til hverandre. Den som presser venninnen din, selger henne en skrekk som ikke engang er ekte. Skammen er det eneste våpenet i den. Det finnes intet juridisk etterspill lenger, ikke etter hundre år.»</w:t>
       </w:r>
     </w:p>
     <w:p/>
@@ -3464,13 +3464,13 @@
     <w:p/>
     <w:p>
       <w:r>
-        <w:t>Jeg åpnet den. Det var grundig arbeid, hundre år sporet side for side. Og den sa ikke det utpressingstrusselen sa. Den sa mer enn brevet, og den sa det snillere.</w:t>
-      </w:r>
-    </w:p>
-    <w:p/>
-    <w:p>
-      <w:r>
-        <w:t>«Hun hadde penger til gode,» sa Neil mens han så på at jeg leste. «Det er den biten slarvet alltid utelater, fordi slarv vil ha en ren og pen skurk og en ren og pen forbrytelse. Blackburn-familien hadde ikke betalt husholdningspersonalet sitt på måneder, den vinteren i tjuefire. Jeg har klagene der i, de andre tjenestefolkene som gikk sin veg, og et brev, fru Claus, et brev fra Constance selv, der hun ber, svært høflig, om den ubetalte lønnen sin, og får til svar at hun skal være takknemlig for at hun har et tak over hodet. Moren hennes lå for døden den samme vinteren, tre gater unna, og det fantes ikke penger til lege, ikke et øre. Og der var hun, dag etter dag, og støvsugde en brosje som var verdt mer enn hun ville tjene på tre livstider, mens familien som eide den, ba henne være takknemlig.» Han bredde ut hendene. «Jeg sier ikke at hun gjorde rett i å ta den. Jeg sier at hun ikke var en tyv på den enkle måten brevet vil ha venninnen din til å tro at hun var. Hun var en desperat jente, ranet først av rike mennesker som hadde råd til å betale henne og valgte å la være. Hun betalte seg selv tilbake med det eneste hun kunne nå, og bygget hundre år med ærlig gjestfrihet oppå det. Det finnes verre fundamenter for et herberge.»</w:t>
+        <w:t xml:space="preserve">Jeg åpnet den. Det var grundig arbeid, hundre år sporet side for side. Og den sa ikke det utpressingsbrevet sa. Den sa mer enn brevet, og den sa det snillere.</w:t>
+      </w:r>
+    </w:p>
+    <w:p/>
+    <w:p>
+      <w:r>
+        <w:t xml:space="preserve">«Hun hadde penger til gode,» sa Neil mens han så på at jeg leste. «Det er den biten slarvet alltid utelater, fordi slarv vil ha en ren og pen skurk og en ren og pen forbrytelse. Blackburn-familien hadde ikke betalt husholdningspersonalet sitt på måneder, den vinteren i tjuefire. Jeg har klagene der inne, de andre tjenestefolkene som gikk sin veg, og et brev, fru Claus, et brev fra Constance selv, der hun ber, svært høflig, om den ubetalte lønnen sin, og får til svar at hun skal være takknemlig for at hun har et tak over hodet. Moren hennes lå for døden den samme vinteren, tre gater unna, og det fantes ikke penger til lege, ikke et øre. Og der var hun, dag etter dag, og tørket støv av en brosje som var verdt mer enn hun ville tjene på tre livstider, mens familien som eide den, ba henne være takknemlig.» Han bredde ut hendene. «Jeg sier ikke at hun gjorde rett i å ta den. Jeg sier at hun ikke var en tyv på den enkle måten brevet vil ha venninnen din til å tro at hun var. Hun var en desperat jente, ranet først av rike mennesker som hadde råd til å betale henne og valgte å la være. Hun betalte seg selv tilbake med det eneste hun kunne nå, og bygget hundre år med ærlig gjestfrihet oppå det. Det finnes verre fundamenter for et vertshus.»</w:t>
       </w:r>
     </w:p>
     <w:p/>
@@ -3488,7 +3488,7 @@
     <w:p/>
     <w:p>
       <w:r>
-        <w:t>«Behold den. Jeg har kopier av hver eneste side.» Han stanset, og for en gangs skyld stilnet glansen i ham av og ble mild. «Si en ting til venninnen din, fra en mann som leser døde menneskers post til livets opphold. Hemmelighetene som ødelegger folk, er de halvt fortalte. Hver eneste gang. Det er fortielsen som setter tenner i dem, ikke sannheten. Jeg har gravd opp hundre begravde familiehemmeligheter i karrieren min, og hver eneste en av dem viste seg å være mindre og vondere enn familien hadde brukt livene sine på å frykte.»</w:t>
+        <w:t xml:space="preserve">«Behold den. Jeg har kopier av hver eneste side.» Han stanset, og for en gangs skyld stilnet glansen i ham av og ble mild. «Si en ting til venninnen din, fra en mann som leser døde menneskers post til livets opphold. Hemmelighetene som ødelegger folk, er de halvt fortalte. Hver eneste gang. Det er fortielsen som setter tenner i dem, ikke sannheten. Jeg har gravd opp hundre begravde familiehemmeligheter i karrieren min, og hver eneste en av dem viste seg å være mindre og tristere enn familien hadde brukt livene sine på å frykte.»</w:t>
       </w:r>
     </w:p>
     <w:p/>
@@ -3517,7 +3517,7 @@
     <w:p/>
     <w:p>
       <w:r>
-        <w:t>Arkivet var det lange bakrommet bak utstillingshallen, fylt fra gulv til tak med arkivbokser, og det var, slik Theo hadde tilstått hele byen under åpningen, et herlig forlis. Han møtte meg der, grå og takknemlig i det samme skjeve slipset, og satte meg til å sortere en bunke husholdningspapirer ved arbeidsbordet mens han arbeidet på den andre siden av rommet. Stort sett en hel time jobbet vi i den hyggelige stillheten til to mennesker som begge elsker orden, og som begge, på hver sin måte, finner ro i å skape den. Pip inntok en posisjon på en lav stabapel med esker ved siden av meg og holdt et årvåkent øye med bindersene i brettet mitt. Den timen lot jeg meg nesten glemme hva jeg var kommet for.</w:t>
+        <w:t xml:space="preserve">Arkivet var det lange bakrommet bak utstillingshallen, fylt fra gulv til tak med arkivbokser, og det var, slik Theo hadde tilstått hele byen under åpningen, et herlig forlis. Han møtte meg der, grå og takknemlig i det samme skjeve slipset, og satte meg til å sortere en bunke husholdningspapirer ved arbeidsbordet mens han arbeidet på den andre siden av rommet. Stort sett en hel time jobbet vi i den hyggelige stillheten til to mennesker som begge elsker orden, og som begge, på hver sin måte, finner ro i å skape den. Pip inntok en posisjon på en lav stabel med esker ved siden av meg og holdt et årvåkent øye med bindersene i brettet mitt. Den timen lot jeg meg nesten glemme hva jeg var kommet for.</w:t>
       </w:r>
     </w:p>
     <w:p/>
@@ -3535,7 +3535,7 @@
         <w:rPr>
           <w:i/>
         </w:rPr>
-        <w:t xml:space="preserve">Bakery Receipts</w:t>
+        <w:t xml:space="preserve">Bakerikvitteringer</w:t>
       </w:r>
       <w:r>
         <w:t xml:space="preserve">, </w:t>
@@ -3544,7 +3544,7 @@
         <w:rPr>
           <w:i/>
         </w:rPr>
-        <w:t xml:space="preserve">Bandstand Subscriptions</w:t>
+        <w:t xml:space="preserve">Bidrag til musikkpaviljongen</w:t>
       </w:r>
       <w:r>
         <w:t xml:space="preserve">, da jeg kom til kortene for Blackburn-familiens papirer, og blant dem fant jeg tre som var merket øverst med rød blyant: </w:t>
@@ -3553,7 +3553,7 @@
         <w:rPr>
           <w:i/>
         </w:rPr>
-        <w:t xml:space="preserve">MISSING – refile when found.</w:t>
+        <w:t xml:space="preserve">MANGLER – arkiveres når funnet.</w:t>
       </w:r>
     </w:p>
     <w:p/>
@@ -3571,19 +3571,19 @@
         <w:rPr>
           <w:i/>
         </w:rPr>
-        <w:t>Correspondence, Adelaide Blackburn to her sister, winter 1924. Re: the theft of the family brooch (the sapphire at its heart) by a household servant; the piece later pawned at Ridgeline. Of significant local interest.</w:t>
-      </w:r>
-    </w:p>
-    <w:p/>
-    <w:p>
-      <w:r>
-        <w:t>The sapphire at its heart.</w:t>
-      </w:r>
-    </w:p>
-    <w:p/>
-    <w:p>
-      <w:r>
-        <w:t>Jeg stivnet til. Jeg har lært meg gjennom et langt liv å ikke la kroppen røpe meg, og jeg trengte hver eneste smule av den treningen nå, der jeg satt ved Theos arbeidsbord med kortet hans i hånda, fordi utpressingsbrevet brettet i kåpa mi brukte akkurat de samme ordene. Ikke ord som liknet. De ordene. Jeg trengte ikke å ta fram lappen for å være sikker; jeg hadde lest den hundre ganger og hadde den brennmerket på netthinnen. The sapphire at its heart. Det er en merkelig måte å beskrive en brosje på, litt poetisk, en historikers formulering og ikke en tyvs. Det sto i utpressingsbrevet nøyaktig slik det sto på Theos kort, de samme fem ordene i samme rekkefølge. To mennesker beskriver ikke et smykke med de samme fem rare ordene ved en tilfeldighet.</w:t>
+        <w:t xml:space="preserve">Korrespondanse, Adelaide Blackburn til sin søster, vinteren 1924. Ang.: tyveriet av familiens brosje (safiren i hjertet) begått av en av tjenestefolkene; smykket senere pantsatt i Ridgeline. Av betydelig lokal interesse.</w:t>
+      </w:r>
+    </w:p>
+    <w:p/>
+    <w:p>
+      <w:r>
+        <w:t xml:space="preserve">Safiren i hjertet.</w:t>
+      </w:r>
+    </w:p>
+    <w:p/>
+    <w:p>
+      <w:r>
+        <w:t xml:space="preserve">Jeg stivnet til. Jeg har lært meg gjennom et langt liv å ikke la kroppen røpe meg, og jeg trengte hver eneste smule av den treningen nå, der jeg satt ved Theos arbeidsbord med kortet hans i hånda, fordi utpressingsbrevet brettet i kåpa mi brukte akkurat de samme ordene. Ikke ord som liknet. De ordene. Jeg trengte ikke å ta fram lappen for å være sikker; jeg hadde lest den hundre ganger og hadde den brennmerket på netthinnen. Safiren i hjertet. Det er en merkelig måte å beskrive en brosje på, litt poetisk, en historikers formulering og ikke en tyvs. Det sto i utpressingsbrevet nøyaktig slik det sto på Theos kort, de samme tre ordene i samme rekkefølge. To mennesker beskriver ikke et smykke med de samme tre rare ordene ved en tilfeldighet.</w:t>
       </w:r>
     </w:p>
     <w:p/>
@@ -3607,7 +3607,7 @@
         <w:rPr>
           <w:i/>
         </w:rPr>
-        <w:t xml:space="preserve">Bridge Tournament</w:t>
+        <w:t xml:space="preserve">Bridgeturnering</w:t>
       </w:r>
       <w:r>
         <w:t xml:space="preserve">, </w:t>
@@ -3616,7 +3616,7 @@
         <w:rPr>
           <w:i/>
         </w:rPr>
-        <w:t xml:space="preserve">Bunting</w:t>
+        <w:t xml:space="preserve">Bannerpynt</w:t>
       </w:r>
       <w:r>
         <w:t xml:space="preserve">, </w:t>
@@ -3625,10 +3625,10 @@
         <w:rPr>
           <w:i/>
         </w:rPr>
-        <w:t xml:space="preserve">Surplus</w:t>
-      </w:r>
-      <w:r>
-        <w:t xml:space="preserve">, som om gulvet i rommet ikke akkurat hadde åpnet seg stille under stolen min. Tvers over rommet nynnet Theo for seg selv, flyttet på en boks og sa noe om varmtvannsberederen som jeg svarte på uten å høre hva jeg svarte. Mannen på den andre siden av rommet, den snilleste mannen i Frost Falls, mannen som kjøpte inn den gode kakaoen med de små marshmallowsene for egne penger for at barna ikke skulle vokse opp uten å kjenne byens historier, hadde skrevet lappene som skremte vettet av Fiona. Eller omsorgen hans for disse brevene hadde latt en annen skrive dem, en annen fra en liste som var så kort at navnet hans tronet øverst på den, skrevet med hans egen omhyggelige hånd.</w:t>
+        <w:t xml:space="preserve">Overskudd</w:t>
+      </w:r>
+      <w:r>
+        <w:t xml:space="preserve">, som om gulvet i rommet ikke akkurat hadde åpnet seg stille under stolen min. Tvers over rommet nynnet Theo for seg selv, flyttet på en boks og sa noe om fyrkjelen som jeg svarte på uten å høre hva jeg svarte. Mannen på den andre siden av rommet, den snilleste mannen i Frost Falls, mannen som kjøpte inn den gode kakaoen med de små marshmallowsene for egne penger for at barna ikke skulle vokse opp uten å kjenne byens historier, hadde skrevet lappene som skremte vettet av Fiona. Eller omsorgen hans for disse brevene hadde latt en annen skrive dem, en annen fra en liste som var så kort at navnet hans tronet øverst på den, skrevet med hans egen omhyggelige hånd.</w:t>
       </w:r>
     </w:p>
     <w:p/>
@@ -3640,7 +3640,7 @@
     <w:p/>
     <w:p>
       <w:r>
-        <w:t>Jeg konfronterte ham ikke. Det var ikke tid for det. En ting som gjøres i hui og hast, blir dårlig gjort, og det gjensto fremdeles å finne ut nøyaktig hvordan det hadde skjedd, og om han hadde gjort det alene. Så jeg fullførte timen. Jeg sa til Theo at sorteringen gikk strålende, noe som var sant. Jeg lot ham trykke hendene mine ved døra, takke meg og fortelle meg, med et strålende blikk i de trette øynene, at utstillingen hadde skaffet førti nye medlemmer – førti, forsto jeg hva det kunne bety for Selskapet? Jeg svarte at det var fantastisk, og jeg mente det fantastiske ved håpet hans, selv om det knuste hjertet mitt. Så gikk jeg ned trappene ut i kulden med bein som ikke helt bar meg.</w:t>
+        <w:t xml:space="preserve">Jeg konfronterte ham ikke. Det var ikke tid for det. En ting som gjøres i hui og hast, blir dårlig gjort, og det gjensto fremdeles å finne ut nøyaktig hvordan det hadde skjedd, og om han hadde gjort det alene. Så jeg fullførte timen. Jeg sa til Theo at sorteringen gikk strålende, noe som var sant. Jeg lot ham trykke hendene mine ved døra, takke meg og fortelle meg, med et strålende blikk i de trette øynene, at utstillingen hadde skaffet førti nye medlemmer – førti, forsto jeg hva det kunne bety for Historielaget? Jeg svarte at det var fantastisk, og jeg mente det fantastiske ved håpet hans, selv om det knuste hjertet mitt. Så gikk jeg ned trappene ut i kulden med bein som ikke helt bar meg.</w:t>
       </w:r>
     </w:p>
     <w:p/>
@@ -3652,7 +3652,7 @@
     <w:p/>
     <w:p>
       <w:r>
-        <w:t>Nick kastet et blikk på meg i døråpningen og spurte ikke. Han satte meg ned, la et teppe over skuldrene mine og ventet. Etter en stund fortalte jeg ham det. Kortet. De tre kortene med røde blyantmerker. De fem ordene. Theos håndskrift. Han lyttet, og ansiktet hans ble sørgmodig og gammelt. Da jeg var ferdig, sa han ikke at det var leit, og han sa ikke er du sikker, for han kunne se at jeg var sikker, og han var for snill en mann til å få noen til å si en sånn ting to ganger.</w:t>
+        <w:t xml:space="preserve">Nick kastet et blikk på meg i døråpningen og spurte ikke. Han satte meg ned, la et teppe over skuldrene mine og ventet. Etter en stund fortalte jeg ham det. Kortet. De tre kortene med røde blyantmerker. De tre ordene. Theos håndskrift. Han lyttet, og ansiktet hans ble sørgmodig og gammelt. Da jeg var ferdig, sa han ikke at det var leit, og han sa ikke er du sikker, for han kunne se at jeg var sikker, og han var for snill en mann til å få noen til å si en sånn ting to ganger.</w:t>
       </w:r>
     </w:p>
     <w:p/>
@@ -3670,7 +3670,7 @@
     <w:p/>
     <w:p>
       <w:r>
-        <w:t>– På samme måte som hvem som helst som gjør noe forferdelig, sa Nick. – Ved å overbevise seg selv om at det er for noe godt, og gjenta det for seg selv, igjen og igjen, helt til han ikke ser annet enn det gode han innbiller seg, og skaden har blitt liten og fjern ytterst i synsranden. Det er kjærligheten som tillater ham det, Jess. Det er den grusomme delen av det. Theo ville aldri stjålet en øre for sin egen del. For Selskapet har han snakket seg inn i hva som helst.</w:t>
+        <w:t xml:space="preserve">– På samme måte som hvem som helst som gjør noe forferdelig, sa Nick. – Ved å overbevise seg selv om at det er for noe godt, og gjenta det for seg selv, igjen og igjen, helt til han ikke ser annet enn det gode han innbiller seg, og skaden har blitt liten og fjern ytterst i synsranden. Det er kjærligheten som tillater ham det, Jess. Det er den grusomme delen av det. Theo ville aldri stjålet en øre for sin egen del. For Historielaget har han snakket seg inn i nesten hva som helst.</w:t>
       </w:r>
     </w:p>
     <w:p/>
@@ -3712,25 +3712,25 @@
     <w:p/>
     <w:p>
       <w:r>
-        <w:t>Midt i rommet, der den gamle peisen på Pol-huset ville ha stått, hadde han bygd en stor peis av gråstein, runde elvestener som var stablet opp for hånd, den ene oppå den andre. Det brant ingen ild der. Risten sto kald og tom, og likevel glødet den. Den varme gullfargen strømmet ut fra selve steinen. Den husville magien som hadde gått fra dør til dør over hele Frost Falls, hadde kommet hit, delvis, og sirklet langsommelig rundt i den varme luften over den tomme peisristen, som et trett vesen som endelig har funnet et sted det en dag kanskje vil få lov til å legge seg ned.</w:t>
-      </w:r>
-    </w:p>
-    <w:p/>
-    <w:p>
-      <w:r>
-        <w:t>– En peis, sa jeg, knapt mer enn en hvitvisking.</w:t>
-      </w:r>
-    </w:p>
-    <w:p/>
-    <w:p>
-      <w:r>
-        <w:t>– En peis. Armen hans la seg rundt meg. – Den er ikke ferdig. Den kan ikke holde på den ennå, ikke helt, ikke for godt. Det er åresvis med arbeid, Jess. Men det er en begynnelse. Et sted den kan komme til. Så den slipper å jage i mørket lenger. Han så ned på meg, og gulllyset spilte i ansiktet hans. – Jeg ville at du skulle se det i kveld, fordi du bærer på noe forferdelig, og jeg ville ikke at du skulle gå omkring og tro at hele verden bare består av mennesker som gjør skade i mørket. Noen av oss er her ute i mørket òg, og bygger steder der varmen kan slå rot.</w:t>
-      </w:r>
-    </w:p>
-    <w:p/>
-    <w:p>
-      <w:r>
-        <w:t>Jeg sto i gløden fra den uante ilden og lot meg endelig gråte en skvett – for Theo, for Fiona og for hele det grusomme, flokete virvaret i det. Nick holdt rundt meg. Over oss kretset magien i trege gullringer, på jakt etter et hjem, og så vidt begynt å finne det.</w:t>
+        <w:t xml:space="preserve">Midt i rommet, der den gamle peisen på Nordpolen ville ha stått, hadde han bygd en stor peis av gråstein, runde elvestener som var stablet opp for hånd, den ene oppå den andre. Det brant ingen ild der. Risten sto kald og tom, og likevel glødet den. Den varme gullfargen strømmet ut fra selve steinen. Den husville magien som hadde gått fra dør til dør over hele Frost Falls, hadde kommet hit, delvis, og sirklet langsomt rundt i den varme luften over den tomme peisristen, som et trett vesen som endelig har funnet et sted det en dag kanskje vil få lov til å legge seg ned.</w:t>
+      </w:r>
+    </w:p>
+    <w:p/>
+    <w:p>
+      <w:r>
+        <w:t xml:space="preserve">– En peis, sa jeg, knapt mer enn en hvisking.</w:t>
+      </w:r>
+    </w:p>
+    <w:p/>
+    <w:p>
+      <w:r>
+        <w:t xml:space="preserve">– En peis. Armen hans la seg rundt meg. – Den er ikke ferdig. Den kan ikke holde på den ennå, ikke helt, ikke for godt. Det er åresvis med arbeid, Jess. Men det er en begynnelse. Et sted den kan komme til. Så den slipper å jage i mørket lenger. Han så ned på meg, og gullyset spilte i ansiktet hans. – Jeg ville at du skulle se det i kveld, fordi du bærer på noe forferdelig, og jeg ville ikke at du skulle gå omkring og tro at hele verden bare består av mennesker som gjør skade i mørket. Noen av oss er her ute i mørket òg, og bygger steder der varmen kan slå rot.</w:t>
+      </w:r>
+    </w:p>
+    <w:p/>
+    <w:p>
+      <w:r>
+        <w:t xml:space="preserve">Jeg sto i gløden fra den utente ilden og lot meg endelig gråte en skvett – for Theo, for Fiona og for hele det grusomme, flokete virvaret i det. Nick holdt rundt meg. Over oss kretset magien i trege gullringer, på jakt etter et hjem, og så vidt begynt å finne det.</w:t>
       </w:r>
     </w:p>
     <w:p/>
@@ -3759,7 +3759,7 @@
     <w:p/>
     <w:p>
       <w:r>
-        <w:t>Menn bar bukebord ut på allmenningen da jeg kom ned Evergreen. Ved vertshuset kom Vera Reed ut fra verandatrappen idet jeg gikk opp den, med en kanvastaske over skulderen og et skrivebrett under armen, knppet igjen i halsen mot kulden slik hun hadde vært på utstillingen.</w:t>
+        <w:t xml:space="preserve">Menn bar bukkebord ut på allmenningen da jeg kom ned Evergreen. Ved vertshuset kom Vera Reed ned verandatrappen idet jeg gikk opp den, med en kanvastaske over skulderen og et skrivebrett under armen, kneppet igjen i halsen mot kulden slik hun hadde vært på utstillingen.</w:t>
       </w:r>
     </w:p>
     <w:p/>
@@ -3825,7 +3825,7 @@
     <w:p/>
     <w:p>
       <w:r>
-        <w:t>– Nei, sa jeg mens jeg vendte lappen i hendene og leste den igjen. – Han vil at du skal være redd nok til å finne det som ikke finnes. Mennesker som aldri har vært virkelig desperate, tror at de desperate alltid kan trylle fram penger på et vis, bare man presser dem hardt nok. Han tror det finnes en riking av en slektning du har vært for stolt til å spørre. Han tror du vil selge noe, pantsette noe, gå til familien Worthington på kne. Han tror at selve frykten vil riste pengene løs, som småpenger ut av en lomme som holdes oppned. Jeg så opp på henne. – Og det forteller meg noe om ham, Fiona, enten han mente å fortelle det eller ikke. Det forteller meg at han er desperat, han også. Mennesker som har det greit, forestiller seg ikke at penger dukker opp under press, for penger har aldri trengt å dukke opp for dem, de har rett og slett alltid vært der. Bare en person som har måttet få det til å skje, på et vis, i en hard måned, tenker på den måten. Lappen har skremt meg på dine vegne i flere dager. Det er først nå det har falt meg inn å være litt redd for ham også, hvem enn han er.</w:t>
+        <w:t xml:space="preserve">– Nei, sa jeg mens jeg vendte lappen i hendene og leste den igjen. – Han vil at du skal være redd nok til å finne det som ikke finnes. Mennesker som aldri har vært virkelig desperate, tror at de desperate alltid kan trylle fram penger på et vis, bare man presser dem hardt nok. Han tror det finnes en riking av en slektning du har vært for stolt til å spørre. Han tror du vil selge noe, pantsette noe, gå til familien Worthington på kne. Han tror at selve frykten vil riste pengene løs, som småpenger ut av en lomme som holdes opp ned. Jeg så opp på henne. – Og det forteller meg noe om ham, Fiona, enten han mente å fortelle det eller ikke. Det forteller meg at han er desperat, han også. Mennesker som har det greit, forestiller seg ikke at penger dukker opp under press, for penger har aldri trengt å dukke opp for dem, de har rett og slett alltid vært der. Bare en person som har måttet få det til å skje, på et vis, i en hard måned, tenker på den måten. Lappen har skremt meg på dine vegne i flere dager. Det er først nå det har falt meg inn å være litt redd for ham også, hvem enn han er.</w:t>
       </w:r>
     </w:p>
     <w:p/>
@@ -3843,7 +3843,7 @@
     <w:p/>
     <w:p>
       <w:r>
-        <w:t>Jeg hadde et blikk. Jeg har alltid et blikk, å dømme etter. Og jeg visste det, eller nær nok til at usikkerheten bare dreide seg om hvordan og hvorvidt alene. Men jeg var ikke klar til å si navnet hans høyt i det lille rommet. Å si Theo Hussein høyt til Fiona ville sette i gang noe som rullet ned en bakke, og som jeg ikke kunne kalle opp igjen, og jeg ville være helt sikker, og sikker på hvordan jeg skulle gjøre det skånsomt, før jeg lot det rulle.</w:t>
+        <w:t xml:space="preserve">Jeg hadde et blikk. Jeg har alltid et blikk, etter alt å dømme. Og jeg visste det, eller nær nok til at usikkerheten bare dreide seg om hvordan og hvorvidt alene. Men jeg var ikke klar til å si navnet hans høyt i det lille rommet. Å si Theo Hussein høyt til Fiona ville sette i gang noe som rullet ned en bakke, og som jeg ikke kunne kalle opp igjen, og jeg ville være helt sikker, og sikker på hvordan jeg skulle gjøre det skånsomt, før jeg lot det rulle.</w:t>
       </w:r>
     </w:p>
     <w:p/>
@@ -3855,13 +3855,13 @@
     <w:p/>
     <w:p>
       <w:r>
-        <w:t>– Jeg har ingenting annet å gi deg enn tre dager. Hun sa det uten bitterhet, bare fullstendig utslitt. – Tre dager da. Festivalen. Hun ga fra seg en liten, knust latter. – Og jeg skal liksom drive den. Smile til gjestene. Være dommer ved kakebordet på lørdag. Reise meg og ønske alle velkommen til vertshusets åpne hus. Alt sammen, med dette liggende i brystet som en svelget stein.</w:t>
-      </w:r>
-    </w:p>
-    <w:p/>
-    <w:p>
-      <w:r>
-        <w:t>– Du kommer til å drive en vakker festival, sa jeg, og jeg skal bære denne delen av den for deg. Det er avtalen. Du smiler til gjestene. Jeg skal finne mannen som har vært ved skrivebordet ditt. Jeg holdt opp lappen. – Kan jeg beholde den? Sammen med den første?</w:t>
+        <w:t xml:space="preserve">– Jeg har ingenting annet å gi deg enn tre dager. Hun sa det uten bitterhet, bare fullstendig utslitt. – Tre dager da. Festivalen. Hun ga fra seg en liten, knust latter. – Og jeg skal liksom drive den. Smile til gjestene. Være dommer ved paibordet på lørdag. Reise meg og ønske alle velkommen til vertshusets åpne hus. Alt sammen, med dette liggende i brystet som en svelget stein.</w:t>
+      </w:r>
+    </w:p>
+    <w:p/>
+    <w:p>
+      <w:r>
+        <w:t xml:space="preserve">– Du kommer til å drive en vakker festival, sa jeg, – og jeg skal bære denne delen av den for deg. Det er avtalen. Du smiler til gjestene. Jeg skal finne mannen som har vært ved skrivebordet ditt. Jeg holdt opp lappen. – Kan jeg beholde den? Sammen med den første?</w:t>
       </w:r>
     </w:p>
     <w:p/>
@@ -3873,7 +3873,7 @@
     <w:p/>
     <w:p>
       <w:r>
-        <w:t>Men jeg hadde kommet for mer enn bare trøst. Jeg snudde lappen og så denne gangen ikke på de grusomme små ordene, men på papiret den lå på. Kremfarget. Litt tungt mellom fingrene. De svake vannmerkene presset inn i fibrene, fine og parallelle, som man bare legger merke til når man holder en ting opp i lyset. Akkurat som den første lappen, og akkurat som bunken jeg hadde sett ligge på et skrivebord ved døren til Det historiske selskaps lokaler om morgenen utstillingen åpnet. Den andre lappen bekreftet det bare. Utpresseren skrev fremdeles det Blackburn-brevene sa, på Selskapets papir.</w:t>
+        <w:t xml:space="preserve">Men jeg hadde kommet for mer enn bare trøst. Jeg snudde lappen og så denne gangen ikke på de grusomme små ordene, men på papiret den lå på. Kremfarget. Litt tungt mellom fingrene. De svake linjene presset inn i fibrene, fine og parallelle, som man bare legger merke til når man holder en ting opp i lyset. Akkurat som den første lappen, og akkurat som bunken jeg hadde sett ligge på et skrivebord ved døren til Historielagets lokaler om morgenen utstillingen åpnet. Den andre lappen bekreftet det bare. Utpresseren skrev fremdeles det Blackburn-brevene sa, på Historielagets papir.</w:t>
       </w:r>
     </w:p>
     <w:p/>
@@ -3900,7 +3900,7 @@
     <w:p/>
     <w:p>
       <w:r>
-        <w:t>Men noen kunne det. Noen som bevegde seg gjennom denne byen på en så upåfallende måte at intet øyekast noensinne ville henge seg opp i dem, som kunne stikke innom vertshuset i festivalmylderet, legge fra seg en ting, gå videre og ikke etterlate seg en eneste krusning på vannet. Jeg kunne ikke se for meg hvem det kunne være. Men med to lapper i hånden skimtet jeg det første hintet om at hånden som hadde skrevet disse, og hånden som hadde båret dem inn i foajeen, kanskje ikke var den samme hånden i det hele tatt.</w:t>
+        <w:t xml:space="preserve">Men noen kunne det. Noen som beveget seg gjennom denne byen på en så upåfallende måte at intet øyekast noensinne ville henge seg opp i dem, som kunne stikke innom vertshuset i festivalmylderet, legge fra seg en ting, gå videre og ikke etterlate seg en eneste krusning på vannet. Jeg kunne ikke se for meg hvem det kunne være. Men med to lapper i hånden skimtet jeg det første hintet om at hånden som hadde skrevet disse, og hånden som hadde båret dem inn i foajeen, kanskje ikke var den samme hånden i det hele tatt.</w:t>
       </w:r>
     </w:p>
     <w:p/>
@@ -3933,22 +3933,22 @@
     </w:p>
     <w:p>
       <w:r>
-        <w:t>Bymarken var ugjenkjennelig siden morgenen. Bukkbordene vi hadde båret ut og diltet rundt med, var nå fylt til bredden med byens egne bidrag: Gretas paier, hundre glass med syltetøy, fru Kims dumplings og et helt bord med votter fra syforeningen, sirlig lagt ut i rader etter størrelse. Scenen i nordenden hadde fått besøk av et band – et ekte et, tre eldre menn og en jente med fele – som spilte den sorten musikk som fikk selv folk som sverget på at de ikke danset, til å trampe takt mot den kalde marken. Lykter hang i de snaue trærne. Boder med eplesider og stekte kastanjer strakte seg langs allmenningen, og over det hele brant festivallysene. De brant i gull nå, hver eneste lyslenke, jevnt og varmt. Ikke en sjel bemerket det, for hele byen hadde bestemt seg i fellesskap, uten et ord, for at lysene alltid hadde vært av gull, og sånn var det med den saken.</w:t>
-      </w:r>
-    </w:p>
-    <w:p>
-      <w:r>
-        <w:t>Pip var en sensasjon. Jeg visste at hun kom til å bli det. Fiona hadde satt opp et hjørne av vertshusverandaen som fotostudio, med en stol, et malt vinterbakteppe og en kurv med strikkede skjerf, og for en dollar til historielaget kunne man bli avfotografert med Nordpolens egen pingvin. Køen strakte seg hele veien langs verandaen og ned trappene hele ettermiddagen. Pip hadde på seg et nytt skjerf på hvert eneste bilde og tok imot tilbedelsen som sin eldgamle rett. Hun avslo, med stor verdighet, hvert eneste stykke sandkake barna prøvde å snike til henne under bordet. Dollarene tårnet seg opp i glasset, og det var de første pengene foreningen hadde fått inn siden Olivias kasseapparat. Det kom ikke til å redde dem. Et glass med dollarer kunne ikke redde en bygning. Men det var noe, og det var varmt. Fiona stod ved siden av boden og tok imot dollarne med et ekte smil, og for én ettermiddag så hun ut som seg selv igjen.</w:t>
-      </w:r>
-    </w:p>
-    <w:p>
-      <w:r>
-        <w:t>Jeg bevegde meg gjennom alt sammen på to plan samtidig; jeg elsket dagen og fryktet for den i samme åndedrag.</w:t>
-      </w:r>
-    </w:p>
-    <w:p>
-      <w:r>
-        <w:t>På det ene planet var jeg der, en bykvinne på byens egen festival, og det var herlig. Emma Redfern fant meg ved sideren og viste frem kostymet sitt, som hun hadde insistert på å ha på seg en kveld for tidlig: et stjernebilde, Orion, sort med sølvstjerner sydd på der de hørte hjemme med farens omtenksomme hånd, og beltet helt nøyaktig. Hun fikk meg til å navngi hver enkelt stjerne, og det gjorde jeg, for jeg har kjent de stjernene lenge. Hun var fra seg av begeistring over at fru Claus kjente stjernebildene hennes. Mark stod like ved med to kopper sider og det slitte, blide uttrykket til en mann som ser datteren sin være åtte år høyt ut i en folkemengde. Martha presset på meg et par votter fra bordet, de grønne, «til de kalde hendene dine». Sam Patel løftet på hatten tvers over marken, fra posten sin nær vertshusverandaen, der han hadde stasjonert seg hele dagen med øynene festet på resepsjonsdisken rett innenfor døren, slik jeg hadde bedt ham om.</w:t>
+        <w:t xml:space="preserve">Allmenningen var ugjenkjennelig siden morgenen. Bukkebordene vi hadde båret ut og stelt med, var nå fylt til bredden med byens egne bidrag: Gretas paier, hundre glass med syltetøy, fru Kims dumplings og et helt bord med votter fra syklubben, sirlig lagt ut i rader etter størrelse. Scenen i nordenden hadde fått besøk av et band – et ekte et, tre eldre menn og en jente med fele – som spilte den sorten musikk som fikk selv folk som sverget på at de ikke danset, til å trampe takt mot den kalde marken. Lykter hang i de snaue trærne. Boder med eplesider og stekte kastanjer strakte seg langs allmenningen, og over det hele brant festivallysene. De brant i gull nå, hver eneste lyslenke, jevnt og varmt. Ikke en sjel bemerket det, for hele byen hadde bestemt seg i fellesskap, uten et ord, for at lysene alltid hadde vært av gull, og sånn var det med den saken.</w:t>
+      </w:r>
+    </w:p>
+    <w:p>
+      <w:r>
+        <w:t xml:space="preserve">Pip var en sensasjon. Jeg visste at hun kom til å bli det. Fiona hadde satt opp et hjørne av vertshusverandaen som fotostudio, med en stol, et malt vinterbakteppe og en kurv med strikkede skjerf, og for en dollar til historielaget kunne man bli avfotografert med Nordpolens egen pingvin. Køen strakte seg hele veien langs verandaen og ned trappene hele ettermiddagen. Pip hadde på seg et nytt skjerf på hvert eneste bilde og tok imot tilbedelsen som sin eldgamle rett. Hun avslo, med stor verdighet, hvert eneste stykke sandkake barna prøvde å snike til henne under bordet. Dollarene tårnet seg opp i glasset, og det var de første pengene laget hadde fått inn siden Olivias kasseapparat. Det kom ikke til å redde dem. Et glass med dollarer kunne ikke redde en bygning. Men det var noe, og det var varmt. Fiona stod ved siden av boden og tok imot dollarne med et ekte smil, og for én ettermiddag så hun ut som seg selv igjen.</w:t>
+      </w:r>
+    </w:p>
+    <w:p>
+      <w:r>
+        <w:t xml:space="preserve">Jeg beveget meg gjennom alt sammen på to plan samtidig; jeg elsket dagen og fryktet for den i samme åndedrag.</w:t>
+      </w:r>
+    </w:p>
+    <w:p>
+      <w:r>
+        <w:t xml:space="preserve">På det ene planet var jeg der, en bykvinne på byens egen festival, og det var herlig. Emma Redfern fant meg ved sideren og viste frem kostymet sitt, som hun hadde insistert på å ha på seg en kveld for tidlig: et stjernebilde, Orion, sort med sølvstjerner sydd på der de hørte hjemme med farens omtenksomme hånd, og beltet helt nøyaktig. Hun fikk meg til å navngi hver enkelt stjerne, og det gjorde jeg, for jeg har kjent de stjernene lenge. Hun var fra seg av begeistring over at fru Claus kjente stjernebildene hennes. Mark stod like ved med to kopper sider og det slitte, blide uttrykket til en mann som ser datteren sin være åtte år høyt ut i en folkemengde. Martha presset på meg et par votter fra bordet, de grønne, «til de kalde hendene dine». Sam Patel løftet på luen tvers over allmenningen, fra posten sin nær vertshusverandaen, der han hadde stasjonert seg hele dagen med øynene festet på resepsjonsdisken rett innenfor døren, slik jeg hadde bedt ham om.</w:t>
       </w:r>
     </w:p>
     <w:p>
@@ -3958,12 +3958,12 @@
     </w:p>
     <w:p>
       <w:r>
-        <w:t>Midt på ettermiddagen trodde jeg plutselig at det skjedde. En skikkelse gled opp på vertshusverandaen, stanset ved den åpne døren, kastet et blikk rundt seg og strakte seg mot resepsjonsdisken. Hjertet mitt sank i magen. Jeg satte i gang over marken i altfor høyt tempo, og Sam var allerede i bevegelse fra sin post. Så snudde skikkelsen seg, og det var bare fru Pelletier fra foreningsstyret som kom for å legge fra seg en bunke med medlemsbrosjyrer på disken der gjester ville få øye på dem. Sam og jeg kom frem i samme øyeklikk, fra hver vår retning, begge to altfor fort, og møtte hverandres blikk over brosjyrene. Fru Pelletier så uforstående mellom oss. Jeg tok tre brosjyrer jeg ikke trengte, Sam sa et eller annet om været, og vi trakk oss tilbake. Det var så nær dagen kom. En falsk alarm. Men det fortalte meg hvor stramt opptrekt jeg var, under felemusikken, og hvor tynn grensen var mellom varmen og frykten.</w:t>
-      </w:r>
-    </w:p>
-    <w:p>
-      <w:r>
-        <w:t>Noriko Tanaka hadde fått det med seg. Hun stod ved siderboden et par meter unna i parkasen sin med en pappkopp i hver hånd, og da jeg kom tilbake over marken, strakte hun frem den ene til meg.</w:t>
+        <w:t xml:space="preserve">Midt på ettermiddagen trodde jeg plutselig at det skjedde. En skikkelse gled opp på vertshusverandaen, stanset ved den åpne døren, kastet et blikk rundt seg og strakte seg mot resepsjonsdisken. Hjertet mitt sank i magen. Jeg satte i gang over allmenningen i altfor høyt tempo, og Sam var allerede i bevegelse fra sin post. Så snudde skikkelsen seg, og det var bare fru Pelletier fra styret i Historielaget som kom for å legge fra seg en bunke med medlemsbrosjyrer på disken der gjester ville få øye på dem. Sam og jeg kom frem i samme øyeklikk, fra hver vår retning, begge to altfor fort, og møtte hverandres blikk over brosjyrene. Fru Pelletier så uforstående mellom oss. Jeg tok tre brosjyrer jeg ikke trengte, Sam sa et eller annet om været, og vi trakk oss tilbake. Det var så nær dagen kom. En falsk alarm. Men det fortalte meg hvor stramt opptrekt jeg var, under felemusikken, og hvor tynn grensen var mellom varmen og frykten.</w:t>
+      </w:r>
+    </w:p>
+    <w:p>
+      <w:r>
+        <w:t xml:space="preserve">Noriko Tanaka hadde fått det med seg. Hun stod ved siderboden et par meter unna i parkasen sin med en pappkopp i hver hånd, og da jeg kom tilbake over allmenningen, strakte hun frem den ene til meg.</w:t>
       </w:r>
     </w:p>
     <w:p>
@@ -3993,7 +3993,7 @@
     </w:p>
     <w:p>
       <w:r>
-        <w:t>Hun nikket, som om det var et svar hun hørte nokså ofte. – Du vet hvor stasjonen er. Kaffen er dårlig, men døren er åpen. Søndager òg. Hun vippet koppen mot vertshusverandaen, der Pip poserte i rødt skjerf for en familie på fem. – Pingvinen din har spilt inn mer penger til foreningen i dag enn ordføreren har klart hele året.</w:t>
+        <w:t xml:space="preserve">Hun nikket, som om det var et svar hun hørte nokså ofte. – Du vet hvor stasjonen er. Kaffen er dårlig, men døren er åpen. Søndager òg. Hun vippet koppen mot vertshusverandaen, der Pip poserte i rødt skjerf for en familie på fem. – Pingvinen din har spilt inn mer penger til Historielaget i dag enn ordføreren har klart hele året.</w:t>
       </w:r>
     </w:p>
     <w:p>
@@ -4003,12 +4003,12 @@
     </w:p>
     <w:p>
       <w:r>
-        <w:t>Magien var overalt denne dagen, på små måter som byen kunne trekke på skuldrene av. Da bandet spilte en reel, svaiet lyktene i trærne litt, enda jeg ikke kjente til et vindpust. Frostbregner grodde oppover innsiden av vertshusvinduene i mønstre som var altfor nydelige til å være tilfeldige, smeltet og vokste ut igjen. Og den siste timen før det mørknet, idet solen gikk ned bak åsene og gulllysene kom til sin rett, begynte det å snø, forsiktig, for første gang siden uken da vi fant Snøball. Store, langsomme flak dalte ned over marken, over bandet, bodene og de oppvendte ansiktene. Hele byen stanset opp, på en gang, så opp og ble stille.</w:t>
-      </w:r>
-    </w:p>
-    <w:p>
-      <w:r>
-        <w:t>Jeg stod i det dalende snøværet blant naboene mine med Pip lent mot støvelen min, Emmas vottekledde hånd fant min på den ene siden og Fionas på den andre. Jeg så på alt sammen, lyktene, snøen, gulllyset, de hundre ansiktene vendt opp mot himmelen, og jeg forstod, på den brystdype måten som kommer før hodet rekker å henge med, nøyaktig hva som stod på spill. Ikke en bygning. Ikke en gang en hemmelighet. Dette. Denne samlingen, denne byen som viste seg fra sin aller beste side på en kald og strålende dag. En mann hadde strukket seg ut fra mørket for å kreve løsepenger for en bit av dette, for å forvandle det til et våpen og en skrekk. Der jeg stod i snøen, ble sinnet mitt hardt og klart som kulden. Uansett hva det kostet meg, skulle jeg ikke la ham beholde grepet om det. Jeg skulle bringe det ut i lyset, inn i en dag som denne, der ting kunne leges.</w:t>
+        <w:t xml:space="preserve">Magien var overalt denne dagen, på små måter som byen kunne trekke på skuldrene av. Da bandet spilte en reel, svaiet lyktene i trærne litt, enda jeg ikke kjente til et vindpust. Frostbregner grodde oppover innsiden av vertshusvinduene i mønstre som var altfor nydelige til å være tilfeldige, smeltet og vokste ut igjen. Og den siste timen før det mørknet, idet solen gikk ned bak åsene og gullysene kom til sin rett, begynte det å snø, forsiktig, for første gang siden uken da vi fant Snøball. Store, langsomme flak dalte ned over allmenningen, over bandet, bodene og de oppvendte ansiktene. Hele byen stanset opp, på en gang, så opp og ble stille.</w:t>
+      </w:r>
+    </w:p>
+    <w:p>
+      <w:r>
+        <w:t xml:space="preserve">Jeg stod i det dalende snøværet blant naboene mine med Pip lent mot støvelen min, Emmas vottekledde hånd fant min på den ene siden og Fionas på den andre. Jeg så på alt sammen, lyktene, snøen, gullyset, de hundre ansiktene vendt opp mot himmelen, og jeg forstod, på den brystdype måten som kommer før hodet rekker å henge med, nøyaktig hva som stod på spill. Ikke en bygning. Ikke en gang en hemmelighet. Dette. Denne samlingen, denne byen som viste seg fra sin aller beste side på en kald og strålende dag. En mann hadde strukket seg ut fra mørket for å kreve løsepenger for en bit av dette, for å forvandle det til et våpen og en skrekk. Der jeg stod i snøen, ble sinnet mitt hardt og klart som kulden. Uansett hva det kostet meg, skulle jeg ikke la ham beholde grepet om det. Jeg skulle bringe det ut i lyset, inn i en dag som denne, der ting kunne leges.</w:t>
       </w:r>
     </w:p>
     <w:p>
@@ -4062,10 +4062,10 @@
         <w:rPr>
           <w:i/>
         </w:rPr>
-        <w:t>the sapphire at its heart</w:t>
-      </w:r>
-      <w:r>
-        <w:t>: fem ord, en historikers formulering og ikke en tyvs, som lå i utpressingbrevet nøyaktig slik de lå på kortet i Theos omhyggelige, skråstilte håndskrift. Brevet var skrevet på Selskapets kremfargede brevpapir, det tykke linpapiret jeg hadde sett ligge i stabler på resepsjonsdisken under utstillingen. Mannen som drev arkivet, var i ferd med å drukne. Han hadde banket på hver eneste ærlige dør i tre delstater og sett dem bli lukket. Han hadde reist seg foran hele byen og fortalt, med et trist drag i munnen, at selve brevene som beskrev brosjen, hadde kommet på avveier.</w:t>
+        <w:t xml:space="preserve">Safiren i hjertet</w:t>
+      </w:r>
+      <w:r>
+        <w:t xml:space="preserve">: tre ord, en historikers formulering og ikke en tyvs, som lå i utpressingsbrevet nøyaktig slik de lå på kortet i Theos omhyggelige, skråstilte håndskrift. Brevet var skrevet på Historielagets kremfargede brevpapir, det tykke riflede papiret jeg hadde sett ligge i stabler på resepsjonsdisken under utstillingen. Mannen som drev arkivet, var i ferd med å drukne. Han hadde banket på hver eneste ærlige dør i tre delstater og sett dem bli lukket. Han hadde reist seg foran hele byen og fortalt, med et trist drag i munnen, at selve brevene som beskrev brosjen, hadde kommet på avveie.</w:t>
       </w:r>
     </w:p>
     <w:p/>
@@ -4077,13 +4077,13 @@
     <w:p/>
     <w:p>
       <w:r>
-        <w:t>Jeg tok det andre brevet og et ark fra Selskapets brevpapir – et blankt ark Theo hadde gitt meg i arkivet for å skrive på nye arkivfaner, som jeg hadde tatt med meg hjem i vesken. Jeg holdt de to opp mot lampen ved siden av hverandre. Samme kremfarge. Samme tyngde i fingrene. De samme svake linjene presset inn i papiret, de fine, parallelle rillene som papirmakerens ramme etterlater seg, lette å se hvis man vet at man skal holde et ark opp mot lyset og titte. De matchet. Selvfølgelig matchet de. Brevet var skrevet på papir fra Theos eget lager, stabelen på resepsjonsdisken i bygningen han ikke hadde forlatt på dager.</w:t>
-      </w:r>
-    </w:p>
-    <w:p/>
-    <w:p>
-      <w:r>
-        <w:t>Jeg lente meg tilbake og lot det være sant, endelig, hele greia, det jeg hadde holdt unna med begge hender i dagervis. Theo Hussein var utpresseren. Den snilleste mannen i Frost Falls. Mannen som hadde holdt hender med meg ved utstillingsdøren mens de trette øynene hans skinte over førti nye medlemmer. Han hadde funnet brosjrens historie i arkivet sitt og sett en halv million dollar i den, en sum som kanskje kunne redde det ene han elsket mer enn sin egen hvile. Han hadde tatt sorgen over et døende Selskap og vendt den mot en venn.</w:t>
+        <w:t xml:space="preserve">Jeg tok det andre brevet og et ark fra Historielagets brevpapir – et blankt ark Theo hadde gitt meg i arkivet for å skrive på nye arkivfaner, som jeg hadde tatt med meg hjem i vesken. Jeg holdt de to opp mot lampen ved siden av hverandre. Samme kremfarge. Samme tyngde i fingrene. De samme svake linjene presset inn i papiret, de fine, parallelle rillene som papirmakerens ramme etterlater seg, lette å se hvis man vet at man skal holde et ark opp mot lyset og titte. De matchet. Selvfølgelig matchet de. Brevet var skrevet på papir fra Theos eget lager, stabelen på resepsjonsdisken i bygningen han ikke hadde forlatt på dager.</w:t>
+      </w:r>
+    </w:p>
+    <w:p/>
+    <w:p>
+      <w:r>
+        <w:t xml:space="preserve">Jeg lente meg tilbake og lot det være sant, endelig, hele greia, det jeg hadde holdt unna med begge hender i dagervis. Theo Hussein var utpresseren. Den snilleste mannen i Frost Falls. Mannen som hadde holdt hendene mine ved utstillingsdøren mens de trette øynene hans skinte over førti nye medlemmer. Han hadde funnet brosjens historie i arkivet sitt og sett en halv million dollar i den, en sum som kanskje kunne redde det ene han elsket mer enn sin egen hvile. Han hadde tatt sorgen over et døende historielag og vendt den mot en venn.</w:t>
       </w:r>
     </w:p>
     <w:p/>
@@ -4095,7 +4095,7 @@
     <w:p/>
     <w:p>
       <w:r>
-        <w:t>Så tørket jeg meg i ansiktet og tvang meg til å se igjen på det som hadde murret i meg i Fionas stue. Theo hadde skrevet brevene. Men Theo kunne ikke ha båret det andre brevet inn i en vestibyle full av festivalgjester og gått igjen uten at et menneske la merke til det. Noen andre hadde levert det til vertshuset.</w:t>
+        <w:t xml:space="preserve">Så tørket jeg meg i ansiktet og tvang meg til å se igjen på det som hadde murret i meg i Fionas stue. Theo hadde skrevet brevene. Men Theo kunne ikke ha båret det andre brevet inn i en foajé full av festivalgjester og gått igjen uten at et menneske la merke til det. Noen andre hadde levert det til vertshuset.</w:t>
       </w:r>
     </w:p>
     <w:p/>
@@ -4122,7 +4122,7 @@
     <w:p/>
     <w:p>
       <w:r>
-        <w:t>Jeg satt helt stille i lampelyset. Brosjrens tyveri og vertshusets kjøp var to forskjellige hemmeligheter, oppbevart i to forskjellige bygninger. Theo hadde den ene. Han hadde arkivet, brevene, katalogkortet, papiret. Han hadde tyveriet. Men beviset på at stjålne penger hadde blitt til dette kjære vertshuset, fantes på rådhuset, i eiendomsarkivene som en stiv, trett kvinne hadde sett meg inn i øynene og sverget på at hun aldri leste.</w:t>
+        <w:t xml:space="preserve">Jeg satt helt stille i lampelyset. Brosjens tyveri og vertshusets kjøp var to forskjellige hemmeligheter, oppbevart i to forskjellige bygninger. Theo hadde den ene. Han hadde arkivet, brevene, katalogkortet, papiret. Han hadde tyveriet. Men beviset på at stjålne penger hadde blitt til dette kjære vertshuset, fantes på rådhuset, i eiendomsarkivene som en stiv, trett kvinne hadde sett meg inn i øynene og sverget på at hun aldri leste.</w:t>
       </w:r>
     </w:p>
     <w:p/>
@@ -4140,7 +4140,7 @@
     <w:p/>
     <w:p>
       <w:r>
-        <w:t xml:space="preserve">Jeg gikk opp i sengen med den tanken kvernende i meg, og for første gang på flere dager var det noe under frykten, et kaldt, rent løft. Formen hadde vært gal fordi en brikke manglet, og der jeg lå i mørket, visste jeg hvis brikke det var. Jeg hadde sett en kvinne stivne til ved lyden av et navn. Jeg hadde sett skuffene stå bak ryggen hennes. Og jeg hadde hørt henne fortelle meg, med skjøtet til </w:t>
+        <w:t xml:space="preserve">Jeg gikk opp og la meg med den tanken kvernende i meg, og for første gang på flere dager var det noe under frykten, et kaldt, rent løft. Formen hadde vært gal fordi en brikke manglet, og der jeg lå i mørket, visste jeg hvis brikke det var. Jeg hadde sett en kvinne stivne til ved lyden av et navn. Jeg hadde sett skuffene stå bak ryggen hennes. Og jeg hadde hørt henne fortelle meg, med skjøtet til </w:t>
       </w:r>
       <w:r>
         <w:t>&lt;bt&gt;</w:t>
@@ -4199,25 +4199,25 @@
         <w:rPr>
           <w:i/>
         </w:rPr>
-        <w:t>PROPERTY — EVERGREEN AVE — WINTER WONDERLAND INN.</w:t>
-      </w:r>
-    </w:p>
-    <w:p/>
-    <w:p>
-      <w:r>
-        <w:t>Innens skjøt. Ute av skuffen sin. Liggende i kurven for gjeninnplassering, nylig håndtert, på skrivebordet til en kvinne som hadde sett meg rett inn i øynene og sagt til meg, to ganger, at hun aldri leste i arkivene bak ryggen sin.</w:t>
-      </w:r>
-    </w:p>
-    <w:p/>
-    <w:p>
-      <w:r>
-        <w:t>Hun hadde lest denne. Hun hadde hatt den fremme. Skjøtet til innets eiendom, papiret som dokumenterte kjøpet fra 1924, den halvdelen av hemmeligheten som ikke sto i et eneste Blackburn-brev og aldri hadde gjort det. Det hadde vært i Vera Reeds hender, nylig nok til at hun ikke hadde lagt det vekk.</w:t>
-      </w:r>
-    </w:p>
-    <w:p/>
-    <w:p>
-      <w:r>
-        <w:t>Da hun kom tilbake med en kopi av allmenningens skjøt, takket jeg henne og kom med mitt kjedelige komitésnakk om boder og plassering av vogner. Så tok jeg meg god tid til å brette det sammen i vesken min. Jeg betraktet henne, og nå som jeg visste hva jeg så etter, kunne jeg lese henne klart og tydelig. Hun var ikke en hard kvinne. Det var det som grep tak i meg. Jeg hadde halvveis ventet, da jeg endelig fikk se det helhetlig, å finne noe kaldt og grisk under trettheten. Det var ingenting kaldt der i det hele tatt, bare frykt som var slitt ned til utmattelse, den beinvevsdype frykten til et menneske som har gjort noe som er altfor stort for henne, og som ligger våken hver eneste natt inni det. Hendene hennes var ikke stødige da hun rettet på kurven. To glemte kaffekopper stod kalde på skrivebordet. Hun så ut slik Fiona hadde sett ut hele uken, som et menneske som ble skviset, bortsett fra at hun var den som gjorde skvisingen, og på et vis var det enda vondere.</w:t>
+        <w:t xml:space="preserve">EIENDOM — EVERGREEN AVE — WINTER WONDERLAND INN.</w:t>
+      </w:r>
+    </w:p>
+    <w:p/>
+    <w:p>
+      <w:r>
+        <w:t xml:space="preserve">Vertshusets skjøte. Ute av skuffen sin. Liggende i kurven for gjeninnplassering, nylig håndtert, på skrivebordet til en kvinne som hadde sett meg rett inn i øynene og sagt til meg, to ganger, at hun aldri leste i arkivene bak ryggen sin.</w:t>
+      </w:r>
+    </w:p>
+    <w:p/>
+    <w:p>
+      <w:r>
+        <w:t xml:space="preserve">Hun hadde lest denne. Hun hadde hatt den fremme. Skjøtet til vertshusets eiendom, papiret som dokumenterte kjøpet fra 1924, den halvdelen av hemmeligheten som ikke sto i et eneste Blackburn-brev og aldri hadde gjort det. Det hadde vært i Vera Reeds hender, nylig nok til at hun ikke hadde lagt det vekk.</w:t>
+      </w:r>
+    </w:p>
+    <w:p/>
+    <w:p>
+      <w:r>
+        <w:t xml:space="preserve">Da hun kom tilbake med en kopi av allmenningens skjøte, takket jeg henne og kom med mitt kjedelige komitésnakk om boder og plassering av vogner. Så tok jeg meg god tid til å brette det sammen i vesken min. Jeg betraktet henne, og nå som jeg visste hva jeg så etter, kunne jeg lese henne klart og tydelig. Hun var ikke en hard kvinne. Det var det som grep tak i meg. Jeg hadde halvveis ventet, da jeg endelig fikk se det helhetlig, å finne noe kaldt og grisk under trettheten. Det var ingenting kaldt der i det hele tatt, bare frykt som var slitt ned til utmattelse, den beinvevsdype frykten til et menneske som har gjort noe som er altfor stort for henne, og som ligger våken hver eneste natt inni det. Hendene hennes var ikke stødige da hun rettet på kurven. To glemte kaffekopper stod kalde på skrivebordet. Hun så ut slik Fiona hadde sett ut hele uken, som et menneske som ble skviset, bortsett fra at hun var den som gjorde skvisingen, og på et vis var det enda tristere.</w:t>
       </w:r>
     </w:p>
     <w:p/>
@@ -4241,7 +4241,7 @@
     <w:p/>
     <w:p>
       <w:r>
-        <w:t>Øynene hennes hadde blitt blanke, og hun klarte ikke å heve dem for å møte mine, like lite som hun klarte det hver gang den gamle historien ble snakket høyt om. Jeg forsto, der jeg stod i kåpen min med allmenningens skjøt i vesken, at Vera Reed ikke var noen skurk. Hun var en skremt kvinne som hadde blitt dratt inn i noe av en mann hun stolte på, eller følte med, eller begge deler, og hun var kommet for langt inn til å klatre ut igjen. Hun visste det, og hun sov ikke bedre enn den kvinnen hun var med på å ødelegge.</w:t>
+        <w:t xml:space="preserve">Øynene hennes hadde blitt blanke, og hun klarte ikke å heve dem for å møte mine, like lite som hun klarte det hver gang den gamle historien ble snakket høyt om. Jeg forsto, der jeg stod i kåpen min med allmenningens skjøte i vesken, at Vera Reed ikke var noen skurk. Hun var en skremt kvinne som hadde blitt dratt inn i noe av en mann hun stolte på, eller følte med, eller begge deler, og hun var kommet for langt inn til å klatre ut igjen. Hun visste det, og hun sov ikke bedre enn den kvinnen hun var med på å ødelegge.</w:t>
       </w:r>
     </w:p>
     <w:p/>
@@ -4253,19 +4253,19 @@
     <w:p/>
     <w:p>
       <w:r>
-        <w:t>Theo hadde tyveriet. Han hadde funnet det i Blackburn-brevene, brosjen, stenen, pantelåneren. Han hadde katalogisert det med sin omstendelige hånd, safiren i dens indre, og så hadde han trukket de brevene ut fra arkivene og erklært dem forsvunnet. Men Theo, som druknet, overvåket av hele byen, aldri hjemme, kunne ikke ha gjort resten av det. Han kunne ikke ha bekreftet at innet hadde blitt kjøpt for de pengene, for det beviset fantes ikke i hans bygning. Og han kunne ikke ha båret notatene tvers over byen og lagt en på et fullstappet skrivebord i fullt dagslys under festivalen, for Theo Hussein kunne ikke gå ned Evergreen Avenue ubemerket om det så gjaldt liv og død.</w:t>
-      </w:r>
-    </w:p>
-    <w:p/>
-    <w:p>
-      <w:r>
-        <w:t>Vera kunne det. Vera hadde skjøtet, beviset på kjøpet, i skuffene bak stolen sin. Vera bar papirer fra ordførerens kontor over til arkivet, inn og ut, helt naturlig som været, med all den adgangen til Theo og brevpapiret hans som et menneske kunne ønske seg. Og Vera beveget seg gjennom byen uten at noen la merke til det, en kvinne som utførte byens ærend. Hun kunne legge fra seg en konvolutt på innets resepsjonsskranke midt i festivalmylderet uten at noen ville ense det en tanke, ordførerens sekretær som svingte innom innet. Jeg hadde gått forbi henne på innets trapp selv, den morgenen den andre beskjeden kom, og ikke ofret det en tanke.</w:t>
-      </w:r>
-    </w:p>
-    <w:p/>
-    <w:p>
-      <w:r>
-        <w:t>De hadde gjort det sammen. Theo for Selskapet han så dø tomme tommer for tommer. Vera for pengene hun så åpenbart trengte, en bylønn for en storbyjobb og regninger hun nesten hadde sagt til meg at hun ikke kunne betale. Eller for ham, delvis, av en eller annen lojalitet eller medlidenhet jeg ikke kunne se bunnen av. Jeg trengte ikke hennes nøyaktige grunner. Formen var solid.</w:t>
+        <w:t xml:space="preserve">Theo hadde tyveriet. Han hadde funnet det i Blackburn-brevene, brosjen, stenen, pantelåneren. Han hadde katalogisert det med sin omhyggelige hånd, safiren i hjertet, og så hadde han trukket de brevene ut fra arkivene og erklært dem forsvunnet. Men Theo, som druknet, overvåket av hele byen, aldri hjemme, kunne ikke ha gjort resten av det. Han kunne ikke ha bekreftet at vertshuset hadde blitt kjøpt for de pengene, for det beviset fantes ikke i hans bygning. Og han kunne ikke ha båret brevene tvers over byen og lagt en på et fullstappet skrivebord i fullt dagslys under festivalen, for Theo Hussein kunne ikke gå ned Evergreen Avenue ubemerket om det så gjaldt liv og død.</w:t>
+      </w:r>
+    </w:p>
+    <w:p/>
+    <w:p>
+      <w:r>
+        <w:t xml:space="preserve">Vera kunne det. Vera hadde skjøtet, beviset på kjøpet, i skuffene bak stolen sin. Vera bar papirer fra ordførerens kontor over til arkivet, inn og ut, helt naturlig som været, med all den adgangen til Theo og brevpapiret hans som et menneske kunne ønske seg. Og Vera beveget seg gjennom byen uten at noen la merke til det, en kvinne som utførte byens ærend. Hun kunne legge fra seg en konvolutt på vertshusets resepsjonsskranke midt i festivalmylderet uten at noen ville ense det en tanke, ordførerens sekretær som svingte innom vertshuset. Jeg hadde gått forbi henne på vertshustrappen selv, den morgenen det andre brevet kom, og ikke ofret det en tanke.</w:t>
+      </w:r>
+    </w:p>
+    <w:p/>
+    <w:p>
+      <w:r>
+        <w:t xml:space="preserve">De hadde gjort det sammen. Theo for Historielaget han så dø tomme for tomme. Vera for pengene hun så åpenbart trengte, en bylønn for en storbyjobb og regninger hun nesten hadde sagt til meg at hun ikke kunne betale. Eller for ham, delvis, av en eller annen lojalitet eller medlidenhet jeg ikke kunne se bunnen av. Jeg trengte ikke hennes nøyaktige grunner. Formen var solid.</w:t>
       </w:r>
     </w:p>
     <w:p/>
@@ -4289,7 +4289,7 @@
     <w:p/>
     <w:p>
       <w:r>
-        <w:t>Da jeg gikk resten av veien hjem i kulden, med allmenningens skjøt i vesken og begge navnene deres tungt i brystet, kunne jeg kjenne valget som lå foran meg. Det bar med seg vekten av den tøffeste sorten, den sorten jeg ikke hadde trengt å ta siden den dagen jeg kom ned fra toppen av verden.</w:t>
+        <w:t xml:space="preserve">Da jeg gikk resten av veien hjem i kulden, med allmenningens skjøte i vesken og begge navnene deres tungt i brystet, kunne jeg kjenne valget som lå foran meg. Det bar med seg vekten av den tøffeste sorten, den sorten jeg ikke hadde trengt å ta siden den dagen jeg kom ned fra toppen av verden.</w:t>
       </w:r>
     </w:p>
     <w:p>
@@ -4306,7 +4306,7 @@
     <w:p/>
     <w:p>
       <w:r>
-        <w:t>Det stilte seg slik. Jeg visste hvem. Jeg visste hvordan. Jeg hadde bevisene på det: katalogkortet, det matchede papiret holdt opp mot lampen, skjøtet til vertshuset som lå framme i stedet for i skuffen sin. Så jeg kunne gå til Theo og Vera i all stillhet, bare vi tre, ingen andre involvert i det hele tatt, og si: Jeg vet det. Stopp nå, og det slutter her, i kveld, uten at noen andre anar det. Aldri mer. Og det ville de, for de var redde mennesker og ikke forherdede. De ville gråte av lettelse over å slippe unna. Brevene ville slutte, og Fiona ville være trygg. Hemmeligheten ville legges tilbake i kisten på loftet. Theo ville beholde foreningen sin og sitt gode navn, og Vera jobben sin. Byen ville aldri behøve å få vite at to av egne hadde stelt seg ille i en eneste hard sesong. Alle jeg var glad i, ville bli skånet for sorgen over det.</w:t>
+        <w:t xml:space="preserve">Det stilte seg slik. Jeg visste hvem. Jeg visste hvordan. Jeg hadde bevisene på det: katalogkortet, det matchede papiret holdt opp mot lampen, skjøtet til vertshuset som lå framme i stedet for i skuffen sin. Så jeg kunne gå til Theo og Vera i all stillhet, bare vi tre, ingen andre involvert i det hele tatt, og si: Jeg vet det. Stopp nå, og det slutter her, i kveld, uten at noen andre anar det. Aldri mer. Og det ville de, for de var redde mennesker og ikke forherdede. De ville gråte av lettelse over å slippe unna. Brevene ville slutte, og Fiona ville være trygg. Hemmeligheten ville legges tilbake i kisten på loftet. Theo ville beholde historielaget sitt og sitt gode navn, og Vera jobben sin. Byen ville aldri behøve å få vite at to av dens egne hadde stelt seg ille i en eneste hard sesong. Alle jeg var glad i, ville bli skånet for sorgen over det.</w:t>
       </w:r>
     </w:p>
     <w:p/>
@@ -4324,19 +4324,19 @@
     <w:p/>
     <w:p>
       <w:r>
-        <w:t>Jeg satt ved peisen lenge og vurdere saken fram og tilbake. Nick lot meg gjøre det. Pip sov mot foten min, og til sist så jeg hvor den enkle utveien bar galt av sted.</w:t>
-      </w:r>
-    </w:p>
-    <w:p/>
-    <w:p>
-      <w:r>
-        <w:t>Et stille ord i mørket ville beskytte hver eneste person unntatt den som den var ment å beskytte mest. Det ville ikke frigjøre Fiona. Det ville bare forandre hvem som forvarte hemmeligheten hennes. Akkurat nå var det en utpresser som holdt på den. Etter min stille barmhjertighet ville jeg holde på den. Det ville også Nick, og det ville Theo og Vera, tilgitte og frie, de to menneskene i hele verden som visste nøyaktig hvordan man gjorde om den loftskisten til en formue. Fiona ville tilbringe resten av livet med å vite at to av naboene hennes en gang hadde forsøkt å utpresse henne og sluppet unna med det, og at de, på en hvilken som helst dårlig kveld, i en hvilken som helst desperat vinter i årene som kom, kunne prøve igjen. Frykten ville ikke ta slutt. Den ville bare stilne. Jeg hadde lest ti tusen brev på Nordpolen, og smerten i dem var så altfor ofte en hemmelighet man bar på alene i mørket.</w:t>
-      </w:r>
-    </w:p>
-    <w:p/>
-    <w:p>
-      <w:r>
-        <w:t>Og det lå en andre løgn foldet inn i den første. Den enkle utveien så ut som tilgivelse, og den var slett ikke det. Det jeg ville ha overlevert til Theo og Vera, var en måte å slippe å forholde seg til det på i det hele tatt, å hoppe glatt over den harde midtdelen der et menneske gjør opp regnskap for den skaden de har gjort, rett fra forbrytelsen til syndsforlatelsen uten noe ekte i mellomtiden. Det ville bare hjelpe dem med å fortsette å gjemme seg, for byen og for seg selv. Og hvis de slapp å kjenne tyngden av det, kunne de gjøre det igjen. Jeg ville ikke redde Theos sjel ved å grave ned forbrytelsen hans. Jeg ville frata ham den ene tingen som kunne lege den, og det var å eie den.</w:t>
+        <w:t xml:space="preserve">Jeg satt ved peisen lenge og vurderte saken fram og tilbake. Nick lot meg gjøre det. Pip sov mot foten min, og til sist så jeg hvor den enkle utveien bar galt av sted.</w:t>
+      </w:r>
+    </w:p>
+    <w:p/>
+    <w:p>
+      <w:r>
+        <w:t xml:space="preserve">Et stille ord i mørket ville beskytte hver eneste person unntatt den som den var ment å beskytte mest. Det ville ikke frigjøre Fiona. Det ville bare forandre hvem som oppbevarte hemmeligheten hennes. Akkurat nå var det en utpresser som holdt på den. Etter min stille barmhjertighet ville jeg holde på den. Det ville også Nick, og det ville Theo og Vera, tilgitte og frie, de to menneskene i hele verden som visste nøyaktig hvordan man gjorde om den loftskisten til en formue. Fiona ville tilbringe resten av livet med å vite at to av naboene hennes en gang hadde forsøkt å utpresse henne og sluppet unna med det, og at de, på en hvilken som helst dårlig kveld, i en hvilken som helst desperat vinter i årene som kom, kunne prøve igjen. Frykten ville ikke ta slutt. Den ville bare stilne. Jeg hadde lest ti tusen brev på Nordpolen, og smerten i dem var så altfor ofte en hemmelighet man bar på alene i mørket.</w:t>
+      </w:r>
+    </w:p>
+    <w:p/>
+    <w:p>
+      <w:r>
+        <w:t xml:space="preserve">Og det lå en annen løgn foldet inn i den første. Den enkle utveien så ut som tilgivelse, og den var slett ikke det. Det jeg ville ha overlevert til Theo og Vera, var en måte å slippe å forholde seg til det på i det hele tatt, å hoppe glatt over den harde midtdelen der et menneske gjør opp regnskap for den skaden de har gjort, rett fra forbrytelsen til syndsforlatelsen uten noe ekte i mellomtiden. Det ville bare hjelpe dem med å fortsette å gjemme seg, for byen og for seg selv. Og hvis de slapp å kjenne tyngden av det, kunne de gjøre det igjen. Jeg ville ikke redde Theos sjel ved å grave ned forbrytelsen hans. Jeg ville frata ham den ene tingen som kunne lege den, og det var å eie den.</w:t>
       </w:r>
     </w:p>
     <w:p/>
@@ -4372,13 +4372,13 @@
     <w:p/>
     <w:p>
       <w:r>
-        <w:t>Der var den, den siste frykten, den minste av dem og den mest fullstendig egne. Jeg var fremdeles halvt en fremmed i denne byen. Alle andre hadde kjent hverandre siden de var barn som lærte å gå på disse samme fortauene, og jeg hadde arbeidet meg inn tomme for tomme, med en gryterett her, et hundenavn utropt der, en stol dratt fram i strikkeringen. Å drage Theo Hussein fram i lyset kunne koste meg litt av den hardt vunnede tilliten. Folk elsker ikke alltid den som forteller den harde, sanne tingen. Jeg kunne gjøre nøyaktig det rette og være, heretter, en outsider som knuste en god mann og brakte byen sorg.</w:t>
-      </w:r>
-    </w:p>
-    <w:p/>
-    <w:p>
-      <w:r>
-        <w:t>Jeg satt med den frykten og lot den være ekte. Så lot jeg den fare, for Martha hadde allerede svart på den i ringen, med hånden på kneet mitt. Uansett hva det er du bærer på, må du ikke bære det alene. Det er hele vitsen med en ring. Jeg kunne elske et sted høyt nok til å gjøre det harde, rette for det, og stole på at det fremdeles ville være mitt på den andre siden.</w:t>
+        <w:t xml:space="preserve">Der var den, den siste frykten, den minste av dem og den mest fullstendig egne. Jeg var fremdeles halvt en fremmed i denne byen. Alle andre hadde kjent hverandre siden de var barn som lærte å gå på disse samme fortauene, og jeg hadde arbeidet meg inn tomme for tomme, med en gryterett her, en hundeleting der, en stol dratt fram i syklubben. Å drage Theo Hussein fram i lyset kunne koste meg litt av den hardt vunnede tilliten. Folk elsker ikke alltid den som forteller den harde, sanne tingen. Jeg kunne gjøre nøyaktig det rette og være, heretter, en outsider som knuste en god mann og brakte byen sorg.</w:t>
+      </w:r>
+    </w:p>
+    <w:p/>
+    <w:p>
+      <w:r>
+        <w:t xml:space="preserve">Jeg satt med den frykten og lot den være ekte. Så lot jeg den fare, for Martha hadde allerede svart på den i syklubben, med hånden på kneet mitt. Uansett hva det er du bærer på, behøver du ikke bære det alene. Det er hele poenget med en syklubb. Jeg kunne elske et sted høyt nok til å gjøre det harde, rette for det, og stole på at det fremdeles ville være mitt på den andre siden.</w:t>
       </w:r>
     </w:p>
     <w:p/>
@@ -4396,7 +4396,7 @@
     <w:p/>
     <w:p>
       <w:r>
-        <w:t>Nick strakte seg ut og tok hånden min. Øynene hans var stolte og sorgmuntre på en og samme gang. – Da finner vi den sammen, sa han. – Og Jess. Uansett hva det koster deg i forhold til byen, til slutt. Du kommer ikke til å være outsideren som knuste en god mann. Du kommer til å være den som elsket dette stedet høyt nok til å lege det. Noen av dem vil ikke se det på en stund. Men jeg ser det. Og de som betyr noe, kommer dit de og.</w:t>
+        <w:t xml:space="preserve">Nick strakte seg ut og tok hånden min. Øynene hans var stolte og sørgmodige på en og samme gang. – Da finner vi den sammen, sa han. – Og Jess. Uansett hva det koster deg i forhold til byen, til slutt. Du kommer ikke til å være outsideren som knuste en god mann. Du kommer til å være den som elsket dette stedet høyt nok til å lege det. Noen av dem vil ikke se det på en stund. Men jeg ser det. Og de som betyr noe, kommer dit de òg.</w:t>
       </w:r>
     </w:p>
     <w:p/>
@@ -4413,13 +4413,13 @@
     <w:p/>
     <w:p>
       <w:r>
-        <w:t>Det første jeg gjorde, var å oppsøke Noriko Tanaka. Jeg gikk til henne i stedet for å rigge til en felle, for dette var skremmende mennesker, ikke dyr, og jeg ville ha hele greia utført på en måte vi alle kunne leve med på den andre siden.</w:t>
-      </w:r>
-    </w:p>
-    <w:p/>
-    <w:p>
-      <w:r>
-        <w:t>Lensmann Tanaka lyttet til meg på det lille kontoret sitt på stasjonen, med den slitte notatboken åpen på skrivebordet foran seg og pennen liggende urørlig oppå. Hun skrev ikke mens hun avgjorde om hun skulle tro på deg. Jeg la alt på bordet, slik jeg hadde lagt det fram for meg selv ved kjøkkenbordet. De to brevene. Theos katalogkort med de fem matchende ordene. Selskapets brevpapir, med identisk papirstruktur under lampen. Innets skjøte som lå ute av skuffen i Veras mappeboks. Constance, brosjyren, pantelåneren i Ridgeline, hele den hundre år gamle roten til saken, og Neils mappe under alt sammen, den delen som gjorde roten til et menneskelig anliggende.</w:t>
+        <w:t xml:space="preserve">Det første jeg gjorde, var å oppsøke Noriko Tanaka. Jeg gikk til henne i stedet for å rigge til en felle, for dette var skremte mennesker, ikke dyr, og jeg ville ha hele greia utført på en måte vi alle kunne leve med på den andre siden.</w:t>
+      </w:r>
+    </w:p>
+    <w:p/>
+    <w:p>
+      <w:r>
+        <w:t xml:space="preserve">Politisjef Tanaka lyttet til meg på det lille kontoret sitt på stasjonen, med den slitte notatboken åpen på skrivebordet foran seg og pennen liggende urørlig oppå. Hun skrev ikke mens hun avgjorde om hun skulle tro på deg. Jeg la alt på bordet, slik jeg hadde lagt det fram for meg selv ved kjøkkenbordet. De to brevene. Theos katalogkort med de tre matchende ordene. Historielagets brevpapir, med identisk papirstruktur under lampen. Vertshusets skjøte som lå ute av skuffen i Veras mappeboks. Constance, brosjen, pantelåneren i Ridgeline, hele den hundre år gamle roten til saken, og Neils mappe under alt sammen, den delen som gjorde roten til et menneskelig anliggende.</w:t>
       </w:r>
     </w:p>
     <w:p/>
@@ -4461,13 +4461,13 @@
     <w:p/>
     <w:p>
       <w:r>
-        <w:t>– Da gjør vi det slik. Hun lukket notatboken. – Ingen felle. Ingen merkede penger, intet lokkeomslag stukket under trinnene til innet i mørket. Det der er på TV. Det setter vanlige mennesker i fare uten god grunn. Vi setter oss ned med dem. Du, jeg og Fiona, hvis hun er villig til å være der. Vi legger frem det vi vet, rett ut, på samme måte som du la det frem for meg nå nettopp, og vi gir dem sjansen til å være de menneskene denne byen alltid har trodd at de er. De fleste mennesker, når de stilles overfor sannheten servert mildt og helhetlig, griper den sjansen. De er lei av å bære på det. Mange av dem er halvveis glade, under frykten, for å kunne legge den fra seg.</w:t>
-      </w:r>
-    </w:p>
-    <w:p/>
-    <w:p>
-      <w:r>
-        <w:t>Det var riktig. Det var så mye bedre enn fellen jeg hadde sett for meg, en natt med lokkepenger, holdt pusten og noens hånd som strakte seg ut fra mørket. Det ville ikke være snakk om noe mørke her overhodet. Vi skulle gjøre det i et varmt rom i ettermiddagslyset, med nåde i hendene og lensmannen ved vår side, og vi skulle gi en god mann som hadde gått vill, den enkle verdigheten det er å stå oppreist på egne ben og se det i øynene.</w:t>
+        <w:t xml:space="preserve">– Da gjør vi det slik. Hun lukket notatboken. – Ingen felle. Ingen merkede penger, intet lokkeomslag stukket under trinnene til vertshuset i mørket. Det der er på TV. Det setter vanlige mennesker i fare uten god grunn. Vi setter oss ned med dem. Du, jeg og Fiona, hvis hun er villig til å være der. Vi legger frem det vi vet, rett ut, på samme måte som du la det frem for meg nå nettopp, og vi gir dem sjansen til å være de menneskene denne byen alltid har trodd at de er. De fleste mennesker, når de stilles overfor sannheten servert mildt og helhetlig, griper den sjansen. De er lei av å bære på det. Mange av dem er halvveis glade, under frykten, for å kunne legge den fra seg.</w:t>
+      </w:r>
+    </w:p>
+    <w:p/>
+    <w:p>
+      <w:r>
+        <w:t xml:space="preserve">Det var riktig. Det var så mye bedre enn fellen jeg hadde sett for meg, en natt med lokkepenger, holdt pusten og noens hånd som strakte seg ut fra mørket. Det ville ikke være snakk om noe mørke her overhodet. Vi skulle gjøre det i et varmt rom i ettermiddagslyset, med nåde i hendene og politisjefen ved vår side, og vi skulle gi en god mann som hadde gått vill, den enkle verdigheten det er å stå oppreist på egne ben og se det i øynene.</w:t>
       </w:r>
     </w:p>
     <w:p/>
@@ -4491,7 +4491,7 @@
     <w:p/>
     <w:p>
       <w:r>
-        <w:t>Hun leste det der ved det lille bordet mens bestefarsklokken tikket. Pip hadde plassert seg foran klokken for å se pendelen svinge bak glasset, og hun slapp den ikke av syne en eneste gang mens Fiona leste. Fiona gråt, men det var en annen gråt enn den jeg hadde sett hos henne i flere dager. Det var en dyp og gjennomgripende lettelse i den.</w:t>
+        <w:t xml:space="preserve">Hun leste det der ved det lille bordet mens gulvuret tikket. Pip hadde plassert seg foran klokken for å se pendelen svinge bak glasset, og hun slapp den ikke av syne en eneste gang mens Fiona leste. Fiona gråt, men det var en annen gråt enn den jeg hadde sett hos henne i flere dager. Det var en dyp og gjennomgripende lettelse i den.</w:t>
       </w:r>
     </w:p>
     <w:p/>
@@ -4527,7 +4527,7 @@
     <w:p/>
     <w:p>
       <w:r>
-        <w:t>Dermed avtalte vi det. Ingen felle. Et oppgjør, utført med varsomhet, i varmen, med loven og nåden samlet i samme rom. Den siste ettermiddagen under festivalen, når innet ville falle til ro en times tid før kvelden, med folkemengdene dratt hjem og oppryddingen ennå ikke påbegynt.</w:t>
+        <w:t xml:space="preserve">Dermed avtalte vi det. Ingen felle. Et oppgjør, utført med varsomhet, i varmen, med loven og nåden samlet i samme rom. Den siste ettermiddagen under festivalen, når vertshuset ville falle til ro en times tid før kvelden, med folkemengdene dratt hjem og oppryddingen ennå ikke påbegynt.</w:t>
       </w:r>
     </w:p>
     <w:p/>
@@ -4544,13 +4544,13 @@
     <w:p/>
     <w:p>
       <w:r>
-        <w:t>Vi gjorde det den siste ettermiddagen av festivalen, i Fionas lille stue, mens lydene av tivoliet som pakket sammen, drev inn gjennom vinduet, en unge som klaget over å måtte gå hjem, skrapingen av bukkeordene som ble foldet sammen på gresset. Noriko hadde bedt Theo om å komme for å snakke om det hun kalte en sak for Selskapet, og bedt Vera om å komme i det hun kalte et ærend fra ordførerens kontor. Så de to ankom med noen minutters mellomrom, hver for seg, uten å vite at den andre kom.</w:t>
-      </w:r>
-    </w:p>
-    <w:p/>
-    <w:p>
-      <w:r>
-        <w:t>Jeg så på det hele fra stolen min i hjørnet. Pip hadde lagt seg under den, og holdt for en gang skyld meningene sine for seg selv. Vera kom inn først, og rakk å ta to skritt inn i rommet før hun fikk øye på Theo som allerede satt der. Hun tok inn meg, Fiona som var blek og rakrygget ved vinduet, lensmannen på den andre siden av rommet med den slitte notatboken sin åpen på fanget. Hun forsto det. Fargen forsvant fra ansiktet hennes på en gang, som vann som renner ut av et glass som velter.</w:t>
+        <w:t xml:space="preserve">Vi gjorde det den siste ettermiddagen av festivalen, i Fionas lille stue, mens lydene av tivoliet som pakket sammen, drev inn gjennom vinduet, en unge som klaget over å måtte gå hjem, skrapingen av bukkebordene som ble foldet sammen på allmenningen. Noriko hadde bedt Theo om å komme for å snakke om det hun kalte en sak for Historielaget, og bedt Vera om å komme i det hun kalte et ærend fra ordførerens kontor. Så de to ankom med noen minutters mellomrom, hver for seg, uten å vite at den andre kom.</w:t>
+      </w:r>
+    </w:p>
+    <w:p/>
+    <w:p>
+      <w:r>
+        <w:t xml:space="preserve">Jeg så på det hele fra stolen min i hjørnet. Pip hadde lagt seg under den, og holdt for en gang skyld meningene sine for seg selv. Vera kom inn først, og rakk å ta to skritt inn i rommet før hun fikk øye på Theo som allerede satt der. Hun tok inn meg, Fiona som var blek og rakrygget ved vinduet, politisjefen på den andre siden av rommet med den slitte notatboken sin åpen på fanget. Hun forsto det. Fargen forsvant fra ansiktet hennes på en gang, som vann som renner ut av et glass som velter.</w:t>
       </w:r>
     </w:p>
     <w:p/>
@@ -4580,7 +4580,7 @@
     <w:p/>
     <w:p>
       <w:r>
-        <w:t>– Theo, sa jeg. – Utpressingsbrevene til Fiona ble skrevet på Selskapets brevpapir. Det tykke, kremfargede arket med filtkant. Jeg matchet det korn for korn mot et ark fra lageret ditt. Han skvatt til, men jeg fortsatte, stødig. – Og dere beskriver brosjen som safiren i dens hjerte. Det er dine ord, Theo. De står på katalogkortet ditt, med din egen håndskrift, kortet for Blackburn-brevene som du fortalte hele byen under åpningen at hadde blitt borte. Brevene ble ikke borte. Du fjernet dem fordi de holdt på hemmeligheten, og så kalte du dem savnet slik at ingen skulle komme på å spørre hva som sto i dem. Jeg stanset, og lot den neste delen komme mykt. – Du fant en måte å redde Selskapet i de brevene. Og du grep den. Ikke sant?</w:t>
+        <w:t xml:space="preserve">– Theo, sa jeg. – Utpressingsbrevene til Fiona ble skrevet på Historielagets brevpapir. Det tykke, kremfargede papiret med de fine linjene. Jeg matchet det korn for korn mot et ark fra lageret ditt. Han skvatt til, men jeg fortsatte, stødig. – Og de beskriver brosjen som safiren i hjertet. Det er dine ord, Theo. De står på katalogkortet ditt, med din egen håndskrift, kortet for Blackburn-brevene som du fortalte hele byen under åpningen at hadde blitt borte. Brevene ble ikke borte. Du fjernet dem fordi de holdt på hemmeligheten, og så kalte du dem savnet slik at ingen skulle komme på å spørre hva som sto i dem. Jeg stanset, og lot den neste delen komme mykt. – Du fant en måte å redde Historielaget i de brevene. Og du grep den. Ikke sant?</w:t>
       </w:r>
     </w:p>
     <w:p/>
@@ -4592,7 +4592,7 @@
     <w:p/>
     <w:p>
       <w:r>
-        <w:t>– Jeg overbeviste meg selv om at det ikke var ordentlig stjålet, sa han. – Ikke fra Fiona. Jeg overbeviste meg selv om at vertshuset var kjøpt med stjålne penger i utgangspunktet, så å ta litt av det tilbake var ikke tyveri, det var, jeg vet ikke, historien som korrigerer seg selv, en regning som endelig ble gjort opp. Jeg er så flink til å få fortiden til å bety akkurat det jeg trenger at den skal bety. Det er hele opplæringen min, å få fortiden til å gi mening. Han presset knyttnevene mot øynene som et barn. – Taket faller inn. Kjelen holder på å ryke. Hundre år med denne byens minner, hvert brev og fotografi og skjøte, alt sammen går til grunne, og hver eneste ærlige dør jeg banket på, ble smekket igjen i ansiktet på meg, ordføreren, stipendene, stiftelsene, hver eneste en. Og så fant jeg de brevene, og der var det, en halv million dollar, som bare satt der i fortiden, og jeg tenkte, jeg kan redde det. Jeg kan redde alt sammen, hver eneste flik, og ingen tar egentlig skade av det, for pengene var skitne i utgangspunktet. Han så opp, ulykkelig. – Og så så jeg hva det gjorde med henne. Med Fiona. Jeg så henne bli grå. Og jeg sa til meg selv at jeg skulle slutte, og jeg sluttet ikke, for innen den tid var jeg allerede i det, og da jeg først hadde gjort det, sa jeg til meg selv at en til ikke kom til å spille noen rolle. Han snudde seg mot Fiona, og stemmen hans knakk. – Jeg er så lei meg. Jeg er så lei meg, Fiona. Jeg mistet meg selv et sted oppi det hele. Jeg elsker denne byens historie så høyt at jeg glemte at byen består av levende mennesker.</w:t>
+        <w:t xml:space="preserve">– Jeg overbeviste meg selv om at det ikke var ordentlig stjålet, sa han. – Ikke fra Fiona. Jeg overbeviste meg selv om at vertshuset var kjøpt med stjålne penger i utgangspunktet, så å ta litt av det tilbake var ikke tyveri, det var, jeg vet ikke, historien som korrigerer seg selv, en regning som endelig ble gjort opp. Jeg er så flink til å få fortiden til å bety akkurat det jeg trenger at den skal bety. Det er hele opplæringen min, å få fortiden til å gi mening. Han presset knyttnevene mot øynene som et barn. – Taket faller inn. Fyrkjelen holder på å ryke. Hundre år med denne byens minner, hvert brev og fotografi og skjøte, alt sammen går til grunne, og hver eneste ærlige dør jeg banket på, ble smekket igjen i ansiktet på meg, ordføreren, stipendene, stiftelsene, hver eneste en. Og så fant jeg de brevene, og der var det, en halv million dollar, som bare satt der i fortiden, og jeg tenkte, jeg kan redde det. Jeg kan redde alt sammen, hver eneste flik, og ingen tar egentlig skade av det, for pengene var skitne i utgangspunktet. Han så opp, ulykkelig. – Og så så jeg hva det gjorde med henne. Med Fiona. Jeg så henne bli grå. Og jeg sa til meg selv at jeg skulle slutte, og jeg sluttet ikke, for innen den tid var jeg allerede i det, og da jeg først hadde gjort det, sa jeg til meg selv at en til ikke kom til å spille noen rolle. Han snudde seg mot Fiona, og stemmen hans knakk. – Jeg er så lei meg. Jeg er så lei meg, Fiona. Jeg mistet meg selv et sted oppi det hele. Jeg elsker denne byens historie så høyt at jeg glemte at byen består av levende mennesker.</w:t>
       </w:r>
     </w:p>
     <w:p/>
@@ -4622,7 +4622,7 @@
     <w:p/>
     <w:p>
       <w:r>
-        <w:t>– Han kom til meg, sa hun. – For flere uker siden. Halvt fra veret av det, og snakket om Selskapet, om hvordan han hadde funnet denne greia og ikke kunne klare det alene. Og jeg burde ha sagt nei. Jeg vet at jeg burde ha sagt nei, jeg visste det da også. Hun gynget litt frem og tilbake, med armene stramt rundt seg selv. – Men jeg henger så langt etter, fru Claus. Ordføreren betaler meg ingenting og arbeider meg i senk, og jeg har gjeld du ikke ville tro på, den typen som ikke lar deg sove, og Theo sa at det var penger som var stjålet i utgangspunktet, fra en rik familie for hundre år siden, og at det ville redde Selskapet, og at en bit av det ville tilfalle meg, og at jeg endelig ville komme meg ovenpå. Han fikk det til å høres nesten edelt ut. Han er flink til det, å få en sak til å høres ut som historie i stedet for en forbrytelse. Og jeg ville så sårt komme meg ovenpå at jeg lot ham få det til å høres slik ut, for jeg ville så gjerne tro på det. Hun så på Fiona, knust. – Jeg tenkte aldri på deg som et menneske. Det er det verste av alt, det er den saken jeg kommer til å bære med meg. Jeg tenkte bare på pengene og på det å slippe å ligge våken. Beklager. Jeg er så lei meg, Fiona.</w:t>
+        <w:t xml:space="preserve">– Han kom til meg, sa hun. – For flere uker siden. Halvt fra seg av det, og snakket om Historielaget, om hvordan han hadde funnet denne greia og ikke kunne klare det alene. Og jeg burde ha sagt nei. Jeg vet at jeg burde ha sagt nei, jeg visste det da også. Hun gynget litt frem og tilbake, med armene stramt rundt seg selv. – Men jeg henger så langt etter, fru Claus. Ordføreren betaler meg ingenting og arbeider meg i senk, og jeg har gjeld du ikke ville tro på, den typen som ikke lar deg sove, og Theo sa at det var penger som var stjålet i utgangspunktet, fra en rik familie for hundre år siden, og at det ville redde Historielaget, og at en bit av det ville tilfalle meg, og at jeg endelig ville komme meg ovenpå. Han fikk det til å høres nesten edelt ut. Han er flink til det, å få en sak til å høres ut som historie i stedet for en forbrytelse. Og jeg ville så sårt komme meg ovenpå at jeg lot ham få det til å høres slik ut, for jeg ville så gjerne tro på det. Hun så på Fiona, knust. – Jeg tenkte aldri på deg som et menneske. Det er det verste av alt, det er den saken jeg kommer til å bære med meg. Jeg tenkte bare på pengene og på det å slippe å ligge våken. Beklager. Jeg er så lei meg, Fiona.</w:t>
       </w:r>
     </w:p>
     <w:p/>
@@ -4663,19 +4663,19 @@
     <w:p/>
     <w:p>
       <w:r>
-        <w:t>Begge to hadde lagt alt på bordet momentant da de ble konfrontert, ingen av dem hadde noen historikk med svik bak seg, og kvinnen de hadde forgrepet seg på, ba om oppreisning framfor ødeleggelse. Dermed staket Noriko ut en kurs for dem som verken var en fengselscelle eller en betinget dom.</w:t>
-      </w:r>
-    </w:p>
-    <w:p/>
-    <w:p>
-      <w:r>
-        <w:t>«Gjenopprettende rettferdighet», forklarte hun oss alle sammen etterpå, på enklere ord, over en kopp kaffe på kroa. «Det fungerer bare når den som har gjort feilen, ser skaden i øynene og hjelper til med å reparere den med egne hender. Så det er det de skal gjøre. Ikke en celle. Noe som på sin måte er hardere enn en celle. De skal gjøre det godt igjen, foran menneskene de såret, over lang tid. Og hvis de mislykkes med det, står den hardere døren fremdeles der like bak ryggen på dem.»</w:t>
-      </w:r>
-    </w:p>
-    <w:p/>
-    <w:p>
-      <w:r>
-        <w:t>Pip, under stolen min, hadde funnet en sukkerbit på gulvet og snudde og vridde på den med største alvor, i tilfelle den skulle vise seg å være en fisk.</w:t>
+        <w:t xml:space="preserve">Begge to hadde lagt alt på bordet momentant da de ble konfrontert, ingen av dem hadde noen historikk med svik bak seg, og kvinnen de hadde forgrepet seg på, ba om oppreisning framfor ødeleggelse. Dermed staket Noriko ut en kurs for dem som verken var en fengselscelle eller en full benådning.</w:t>
+      </w:r>
+    </w:p>
+    <w:p/>
+    <w:p>
+      <w:r>
+        <w:t xml:space="preserve">«Gjenopprettende rettferdighet», forklarte hun oss alle sammen etterpå, på enklere ord, over en kopp kaffe på vertshuset. «Det fungerer bare når den som har gjort feilen, ser skaden i øynene og hjelper til med å reparere den med egne hender. Så det er det de skal gjøre. Ikke en celle. Noe som på sin måte er hardere enn en celle. De skal gjøre det godt igjen, foran menneskene de såret, over lang tid. Og hvis de mislykkes med det, står den hardere døren fremdeles der like bak ryggen på dem.»</w:t>
+      </w:r>
+    </w:p>
+    <w:p/>
+    <w:p>
+      <w:r>
+        <w:t xml:space="preserve">Pip, under stolen min, hadde funnet en sukkerpose på gulvet og snudde og vridde på den med største alvor, i tilfelle den skulle vise seg å være en fisk.</w:t>
       </w:r>
     </w:p>
     <w:p/>
@@ -4687,25 +4687,25 @@
     <w:p/>
     <w:p>
       <w:r>
-        <w:t>For Theo var det verre, ettersom Selskapet var hele hans hjerte, og Selskapet var det ene han var nødt til å gi opp.</w:t>
-      </w:r>
-    </w:p>
-    <w:p/>
-    <w:p>
-      <w:r>
-        <w:t>Han trakk seg. Ikke for en stakket stund, for i det stille å kunne gli inn i stolen igjen så fort byen var ferdig med sin vrede. Han sa fra seg ledervervet i Frost Falls historielag, og styret, da det først kjente til hele historien, godtok avgangen og mente det alvorlig. En mann kunne ikke utpresse en nabo ved hjelp av Selskapets samling og brevpapir for deretter å beholde nøklene til stedet.</w:t>
-      </w:r>
-    </w:p>
-    <w:p/>
-    <w:p>
-      <w:r>
-        <w:t>Men de støtte ham ikke ut. De lot ikke som om en mann som hadde elsket denne byens historie i tretti år, aldri hadde elsket den. Noriko, styret og Fiona – som hadde all verdens rett til å kreve hodet hans, men lot være – skapte i stedet en dør han kanskje kunne gå gjennom igjen en dag, over år, på kne om det krevdes. Han kunne få være frivillig i Selskapet. Under oppsyn. Utføre det enkleste arbeidet som fantes, lapping og sortering, de tålmodige oppgavene ingen noensinne takker deg for. Ikke ha ansvaret for noen ting. Ikke bli betrodd nøklene. Bare få lov til, langsomt, å begynne å fortjene tilbake en millimeter av gangen den plassen han hadde kastet bort. Om han beviste hva han var god for over tilstrekkelig lang tid, ville byen se det. Hvis ikke, fikk det stå på hans regning.</w:t>
-      </w:r>
-    </w:p>
-    <w:p/>
-    <w:p>
-      <w:r>
-        <w:t>«Det er mer enn jeg fortjener», sa Theo da de fortalte ham det. Han gråt, og det var gråten til en mann som hadde stålsettt seg for galgen og i stedet fått utlevert en lang og hard vei.</w:t>
+        <w:t xml:space="preserve">For Theo var det verre, ettersom Historielaget var hele hans hjerte, og Historielaget var det ene han var nødt til å gi opp.</w:t>
+      </w:r>
+    </w:p>
+    <w:p/>
+    <w:p>
+      <w:r>
+        <w:t xml:space="preserve">Han trakk seg. Ikke for en stakket stund, for i det stille å kunne gli inn i stolen igjen så fort byen var ferdig med sin vrede. Han sa fra seg ledervervet i Frost Falls historielag, og styret, da det først kjente til hele historien, godtok avgangen og mente det alvorlig. En mann kunne ikke utpresse en nabo ved hjelp av Historielagets samling og brevpapir for deretter å beholde nøklene til stedet.</w:t>
+      </w:r>
+    </w:p>
+    <w:p/>
+    <w:p>
+      <w:r>
+        <w:t xml:space="preserve">Men de støtte ham ikke ut. De lot ikke som om en mann som hadde elsket denne byens historie i tretti år, aldri hadde elsket den. Noriko, styret og Fiona – som hadde all verdens rett til å kreve hodet hans, men lot være – skapte i stedet en dør han kanskje kunne gå gjennom igjen en dag, over år, på kne om det krevdes. Han kunne få være frivillig i Historielaget. Under oppsyn. Utføre det enkleste arbeidet som fantes, lapping og sortering, de tålmodige oppgavene ingen noensinne takker deg for. Ikke ha ansvaret for noen ting. Ikke bli betrodd nøklene. Bare få lov til, langsomt, å begynne å fortjene tilbake en millimeter av gangen den plassen han hadde kastet bort. Om han beviste hva han var god for over tilstrekkelig lang tid, ville byen se det. Hvis ikke, fikk det stå på hans regning.</w:t>
+      </w:r>
+    </w:p>
+    <w:p/>
+    <w:p>
+      <w:r>
+        <w:t xml:space="preserve">«Det er mer enn jeg fortjener», sa Theo da de fortalte ham det. Han gråt, og det var gråten til en mann som hadde stålsatt seg for galgen og i stedet fått utlevert en lang og hard vei.</w:t>
       </w:r>
     </w:p>
     <w:p/>
@@ -4735,19 +4735,19 @@
     <w:p/>
     <w:p>
       <w:r>
-        <w:t>Hun gråt. Hun klemte meg, denne stive kvinnen jeg aldri hadde sett klemme et levende menneske, og sa takk mot skulderen min. Deretter kjørte hun av sted mot søsteren sin, og Pip og je spaserte hjemover i tidlig skumring. Det var ikke snakk om noen som helst triumf. Jeg var tung og tvers igjennom trett, som om jeg hadde renset et sår helt inn til bunns: Det gjorde så mye vondere enn å la det være i fred, men nå kunne det gro.</w:t>
-      </w:r>
-    </w:p>
-    <w:p/>
-    <w:p>
-      <w:r>
-        <w:t>Fiona var fri. Brevene hadde stanset. Hemmeligheten var ute av mørket, og ute av mørket hadde den ikke lenger noen tenner i behold. To mennesker som hadde gått seg vill, sto overfor det nå, og begynte, bare så vidt hadde begynt, på den lange marsjen tilbake til seg selv.</w:t>
-      </w:r>
-    </w:p>
-    <w:p/>
-    <w:p>
-      <w:r>
-        <w:t>Det burde ha vært slutten på det. Men det gjensto fremdeles saken om selve Selskapet, akkurat det Theo hadde ruinert seg for å berge. Han var borte derfra nå. Taket lakk fremdeles inn regn, og fyrkjelen holdt fremdeles på å ta kvelden, og ingenting i hele dette oppgjøret hadde bevilget en eneste dollar til noen av delene.</w:t>
+        <w:t xml:space="preserve">Hun gråt. Hun klemte meg, denne stive kvinnen jeg aldri hadde sett klemme et levende menneske, og sa takk mot skulderen min. Deretter kjørte hun av sted mot søsteren sin, og Pip og jeg spaserte hjemover i tidlig skumring. Det var ikke snakk om noen som helst triumf. Jeg var tung og tvers igjennom trett, som om jeg hadde renset et sår helt inn til bunns: Det gjorde så mye vondere enn å la det være i fred, men nå kunne det gro.</w:t>
+      </w:r>
+    </w:p>
+    <w:p/>
+    <w:p>
+      <w:r>
+        <w:t xml:space="preserve">Fiona var fri. Brevene hadde stanset. Hemmeligheten var ute av mørket, og ute av mørket hadde den ikke lenger noen tenner i behold. To mennesker som hadde gått seg vill, sto overfor det nå, og begynte, bare så vidt begynte, på den lange marsjen tilbake til seg selv.</w:t>
+      </w:r>
+    </w:p>
+    <w:p/>
+    <w:p>
+      <w:r>
+        <w:t xml:space="preserve">Det burde ha vært slutten på det. Men det gjensto fremdeles saken om selve Historielaget, akkurat det Theo hadde ruinert seg for å berge. Han var borte derfra nå. Taket lakk fremdeles inn regn, og fyrkjelen holdt fremdeles på å ta kvelden, og ingenting i hele dette oppgjøret hadde bevilget en eneste dollar til noen av delene.</w:t>
       </w:r>
     </w:p>
     <w:p/>
@@ -4764,19 +4764,19 @@
     <w:p/>
     <w:p>
       <w:r>
-        <w:t>Worthington-ekteparet kom for å finne meg før de reiste fra byen, noe som overraskede meg, og tilbød seg å ordne opp i alt, noe som overrasket meg enda mer.</w:t>
-      </w:r>
-    </w:p>
-    <w:p/>
-    <w:p>
-      <w:r>
-        <w:t>De hadde hørt det, selvfølgelig. Ingenting slikt holdt seg skjult i Frost Falls lenger enn en formiddag. De velpolerte, velmenende Worthington-paret hadde skjønt det, ut fra festivalens summing og vertshusets stillhet, at Historielaget var i alvorlige problemer, og at disse problemene hadde drevet en god mann ut på et skråplan. Mr. Worthington fant meg på vertshusets veranda den siste morgenen de var der, med sin kone ved sin side i sin kremgule kashmirgenser og med sin fine kappe over armen, og han kom rett til sak med den selvfølgeligheten som kjenner en mann for hvem penger aldri har vært et vanskelig samtaleemne.</w:t>
-      </w:r>
-    </w:p>
-    <w:p/>
-    <w:p>
-      <w:r>
-        <w:t xml:space="preserve">– Mrs. Claus, sa han. – Vi har blitt glade i denne byen i ukene vi har vært her. Virkelig glade. Og vi forstår at Historielaget er i en viss økonomisk knipe. Alvorlig knipe, etter det vi hører. </w:t>
+        <w:t xml:space="preserve">Worthington-ekteparet kom for å finne meg før de reiste fra byen, noe som overrasket meg, og tilbød seg å ordne opp i alt, noe som overrasket meg enda mer.</w:t>
+      </w:r>
+    </w:p>
+    <w:p/>
+    <w:p>
+      <w:r>
+        <w:t xml:space="preserve">De hadde hørt det, selvfølgelig. Ingenting slikt holdt seg skjult i Frost Falls lenger enn en formiddag. Det velpolerte, velmenende Worthington-paret hadde skjønt det, ut fra festivalens summing og vertshusets stillhet, at Historielaget var i alvorlige problemer, og at disse problemene hadde drevet en god mann ut på et skråplan. Herr Worthington fant meg på vertshusets veranda den siste morgenen de var der, med sin kone ved sin side i sin kremfargede kashmirgenser og med sin fine kåpe over armen, og han kom rett til sak med den selvfølgeligheten som kjennetegner en mann for hvem penger aldri har vært et vanskelig samtaleemne.</w:t>
+      </w:r>
+    </w:p>
+    <w:p/>
+    <w:p>
+      <w:r>
+        <w:t xml:space="preserve">– Fru Claus, sa han. – Vi har blitt glade i denne byen i ukene vi har vært her. Virkelig glade. Og vi forstår at Historielaget er i en viss økonomisk knipe. Alvorlig knipe, etter det vi hører. </w:t>
       </w:r>
     </w:p>
     <w:p/>
@@ -4788,7 +4788,7 @@
     <w:p/>
     <w:p>
       <w:r>
-        <w:t>– Vi er i en posisjon til å hjelpe. Sjenerøst. Nok til å ordne opp i hele greia med et enkelt pennestrøk – taket, kjelen, og et legat på kjøpet for å holde stedet trygt for en generasjon framover. Jeg vil gjerne skrive ut sjekken før vi drar i formiddag. Det vil koste oss svært lite og bety veldig mye her, og ærlig talt, etter alt det stygge som har skjedd, tror jeg byen kunne ha godt av noen gode nyheter å avrunde sesongen med.</w:t>
+        <w:t xml:space="preserve">– Vi er i en posisjon til å hjelpe. Sjenerøst. Nok til å ordne opp i hele greia med et enkelt pennestrøk – taket, fyrkjelen, og et legat på kjøpet for å holde stedet trygt for en generasjon framover. Jeg vil gjerne skrive ut sjekken før vi drar i formiddag. Det vil koste oss svært lite og bety veldig mye her, og ærlig talt, etter alt det stygge som har skjedd, tror jeg byen kunne ha godt av noen gode nyheter å avrunde sesongen med.</w:t>
       </w:r>
     </w:p>
     <w:p/>
@@ -4812,7 +4812,7 @@
     <w:p/>
     <w:p>
       <w:r>
-        <w:t>– Det er et storsinnet hjerte bak det der, Mr. Worthington, sa jeg. – Og nå skal jeg si deg noe som kanskje høres rart ut, og jeg håper du tar det slik det er ment, for det er ikke et nei til godheten din. Jeg synes du skal beholde sjekken din. Foreløpig.</w:t>
+        <w:t xml:space="preserve">– Det er et storsinnet hjerte bak det der, herr Worthington, sa jeg. – Og nå skal jeg si deg noe som kanskje høres rart ut, og jeg håper du tar det slik det er ment, for det er ikke et nei til godheten din. Jeg synes du skal beholde sjekken din. Foreløpig.</w:t>
       </w:r>
     </w:p>
     <w:p/>
@@ -4824,7 +4824,7 @@
     <w:p/>
     <w:p>
       <w:r>
-        <w:t xml:space="preserve">– Denne byen har nettopp opplevd noe stygt, sa jeg, fordi en god mann bestemte seg for at det å redde laget rettferdiggjorde hva som helst, at en redningsaksjon var verdt et feiltrinn, at målet ville hellige middelet. Vel. Hvis laget blir reddet neste uke av sjekkheftet til en forbipasserende fremmed, uansett hvor velmenende, så er lærdommen hele byen i det stille trekker, at Theo hadde rett i det minste i én ting. At bygningens overlevelse er noe som kommer utenfra, gjennom penger, gjennom en snarvei, gjennom en velgjører, og ikke noe byen selv må ønske seg, jobbe for og gjøre seg fortjent til. </w:t>
+        <w:t xml:space="preserve">– Denne byen har nettopp opplevd noe stygt, sa jeg, – fordi en god mann bestemte seg for at det å redde laget rettferdiggjorde hva som helst, at en redningsaksjon var verdt et feiltrinn, at målet ville hellige middelet. Vel. Hvis laget blir reddet neste uke av sjekkheftet til en forbipasserende fremmed, uansett hvor velmenende, så er lærdommen hele byen i det stille trekker, at Theo hadde rett i det minste i én ting. At bygningens overlevelse er noe som kommer utenfra, gjennom penger, gjennom en snarvei, gjennom en velgjører, og ikke noe byen selv må ønske seg, jobbe for og gjøre seg fortjent til. </w:t>
       </w:r>
     </w:p>
     <w:p/>
@@ -4836,19 +4836,19 @@
     <w:p/>
     <w:p>
       <w:r>
-        <w:t>– Et lag som reddes av en generøs gjest, er bare utsatt, Mr. Worthington. Det vil være i samme uføre om fem år, og vente på at den neste rike gjesten skal få et godt øye til lappeteppene. Den eneste måten stedet noen gang er trygg på, er om Frost Falls selv bestemmer at det er verdt å redde, og redder det med egne hender, av egne lommer, uansett hvor skrinne de er. Det tar lengre tid. Det er mye vanskeligere. Men det er den versjonen som varer, og den leger det som nettopp skjedde her, i stedet for å klistre en lystig plakat over det.</w:t>
-      </w:r>
-    </w:p>
-    <w:p/>
-    <w:p>
-      <w:r>
-        <w:t xml:space="preserve">Mr. Worthington så på meg et langt øyeblikk, og ham til ære forandret ansiktet hans uttrykk, fra undring til en slags respekt. </w:t>
-      </w:r>
-    </w:p>
-    <w:p/>
-    <w:p>
-      <w:r>
-        <w:t>– Du takker nei til veldig mye penger, Mrs. Claus.</w:t>
+        <w:t xml:space="preserve">– Et lag som reddes av en generøs gjest, er bare utsatt, herr Worthington. Det vil være i samme uføre om fem år, og vente på at den neste rike gjesten skal få et godt øye til lappeteppene. Den eneste måten stedet noen gang er trygg på, er om Frost Falls selv bestemmer at det er verdt å redde, og redder det med egne hender, av egne lommer, uansett hvor skrinne de er. Det tar lengre tid. Det er mye vanskeligere. Men det er den versjonen som varer, og den leger det som nettopp skjedde her, i stedet for å klistre en lystig plakat over det.</w:t>
+      </w:r>
+    </w:p>
+    <w:p/>
+    <w:p>
+      <w:r>
+        <w:t xml:space="preserve">Herr Worthington så på meg et langt øyeblikk, og ham til ære forandret ansiktet hans uttrykk, fra undring til en slags respekt. </w:t>
+      </w:r>
+    </w:p>
+    <w:p/>
+    <w:p>
+      <w:r>
+        <w:t xml:space="preserve">– Du takker nei til veldig mye penger, fru Claus.</w:t>
       </w:r>
     </w:p>
     <w:p/>
@@ -4860,7 +4860,7 @@
     <w:p/>
     <w:p>
       <w:r>
-        <w:t xml:space="preserve">Mrs. Worthington smilte da, det første genuint varme smilet jeg hadde sett fra henne i alle de ukene, og hun la sin hanskeledde hånd på armen til mannen sin. </w:t>
+        <w:t xml:space="preserve">Fru Worthington smilte da, det første genuint varme smilet jeg hadde sett fra henne i alle de ukene, og hun la sin hanskeledde hånd på armen til mannen sin. </w:t>
       </w:r>
     </w:p>
     <w:p/>
@@ -4872,7 +4872,7 @@
     <w:p/>
     <w:p>
       <w:r>
-        <w:t>Så de lot det bli med det. Ingen sjekk. Et løfte i stedet, holdt i bakhånd mot nød. Og laget ble værende akkurat der det hadde vært, på stupet, med sviktende tak og døende kjel, bare at nå var ikke engang Theo igjen til å kjempe for det, noe som gjorde det enda mer usikkert enn før, ikke mindre.</w:t>
+        <w:t xml:space="preserve">Så de lot det bli med det. Ingen sjekk. Et løfte i stedet, holdt i bakhånd mot nød. Og laget ble værende akkurat der det hadde vært, på stupet, med sviktende tak og døende fyrkjele, bare at nå var ikke engang Theo igjen til å kjempe for det, noe som gjorde det enda mer usikkert enn før, ikke mindre.</w:t>
       </w:r>
     </w:p>
     <w:p/>
@@ -4890,7 +4890,7 @@
     <w:p/>
     <w:p>
       <w:r>
-        <w:t>Oppgjørets time var over. Legetiden for menneskene oppi det hele hadde begynt. Men laget svevde fortsatt i uvisshet, og vi kom til å få vite hva Frost Falls var laget av den dagen det gjaldt som mest.</w:t>
+        <w:t xml:space="preserve">Oppgjørets time var over. Helingen av menneskene oppi det hele hadde begynt. Men laget svevet fortsatt i uvisshet, og vi kom til å få vite hva Frost Falls var laget av den dagen det gjaldt som mest.</w:t>
       </w:r>
     </w:p>
     <w:p/>
@@ -4937,7 +4937,7 @@
     <w:p/>
     <w:p>
       <w:r>
-        <w:t>Og det gjorde Fiona. Hun lot Claire skrive den for avisen, den sanne og hele versjonen, med Neils dokumenter lagt frem som bakteppe. Ikke sladderversjonen med den pene lille skurken og den pene lille forbrytelsen, men den ekte. Constance Okafor, en nitten år gammel tjenestejente i vintre 1924, ubetalt i måneder, moren som døde tre gater unna uten penger til legehjelp, fortalt at hun skulle være takknemlig for et tak over hodet mens hun tørket støv, hver eneste dag, av en brosje verdt mer enn hun ville tjene på tre liv. En fortvilet jente som tok det ene hun kunne nå, fra en familie som hadde røvet fra henne først, og forvandlet det til hundre år med ærlig gjestfrihet for de reisende som passerte gjennom Frost Falls i kulden.</w:t>
+        <w:t xml:space="preserve">Og det gjorde Fiona. Hun lot Claire skrive den for avisen, den sanne og hele versjonen, med Neils dokumenter lagt frem som bakteppe. Ikke sladderversjonen med den pene lille skurken og den pene lille forbrytelsen, men den ekte. Constance Okafor, en nitten år gammel tjenestejente vinteren 1924, ubetalt i måneder, moren som døde tre gater unna uten penger til legehjelp, fortalt at hun skulle være takknemlig for et tak over hodet mens hun tørket støv, hver eneste dag, av en brosje verdt mer enn hun ville tjene på tre liv. En fortvilet jente som tok det ene hun kunne nå, fra en familie som hadde røvet fra henne først, og forvandlet det til hundre år med ærlig gjestfrihet for de reisende som passerte gjennom Frost Falls i kulden.</w:t>
       </w:r>
     </w:p>
     <w:p/>
@@ -4949,7 +4949,7 @@
     <w:p/>
     <w:p>
       <w:r>
-        <w:t>Martha sa det sanneste om det, i strikkeringen, med pinnene gående uavbrutt og blikket festet på arbeidet.</w:t>
+        <w:t xml:space="preserve">Martha sa det sanneste om det, i syklubben, med pinnene gående uavbrutt og blikket festet på arbeidet.</w:t>
       </w:r>
     </w:p>
     <w:p/>
@@ -4973,25 +4973,25 @@
     <w:p/>
     <w:p>
       <w:r>
-        <w:t>Jeg hadde belaget meg på å bli en outsider som knuste en god mann. Jeg hadde mer enn halvveis regnet med at byen ville kjølne mot meg, ønske at jeg hadde latt saken ligge, huske, hver gang de så på meg, at jeg var den som hadde dratt Theo Hussein ut i lyset og brakt vanry over stedet. Og det var litt av det, her og der, en stund. Noen få som ikke helt klarte å møte blikket mitt, som ble litt stille når jeg kom inn i en butikk. Jeg forsto det og lot det ligge. Jeg presset ikke på.</w:t>
-      </w:r>
-    </w:p>
-    <w:p/>
-    <w:p>
-      <w:r>
-        <w:t>Men mest av alt skjedde det motsatte. Folk begynte, i det stille, på skrå, slik denne byen gjorde sine dypeste ting, å komme og takke meg. Dot stappet et glass med syltetøyet sitt i hendene mine på markedet og sa, litt brått, med blikket på eplene og ikke på meg: – Du gjorde det rette for Fiona. De fleste ville ha sett den andre veien. Sam Patel løftet på capsen tvers over Evergreen Avenue. Til og med Noriko, som var knipen med rosen sin, fortalte meg over en kopp kaffe at jeg hadde håndtert saken bedre enn de fleste profesjonelle hun hadde jobbet med i karrieren sin, at jeg hadde funnet en varm måte gjennom noe som nesten alltid bare har kalde løsninger ved seg.</w:t>
-      </w:r>
-    </w:p>
-    <w:p/>
-    <w:p>
-      <w:r>
-        <w:t>Og Martha. Martha tok tak i hånden min i strikkeringen en grå ettermiddag, holdt den og sa: – Husker du, for en stund siden, da jeg sa at du ikke trengte å bære ting alene? At en ring er til for å lene seg på? Jeg sa at jeg husket det godt. – Vel, sa hun, – du dro jammen og beviste at du er en av oss, som bar det på den måten du gjorde. Du lente deg ikke bare på ringen da du trengte det. Du var ringen, for Fiona, da hun ikke hadde noen andre. En fremmed gjør ikke slikt, Jessica. En av våre egne gjør det. Og hun klappet hånden min raskt og gikk rett tilbake til votten sin, som om hun ikke akkurat hadde knust meg fullstendig der jeg satt.</w:t>
-      </w:r>
-    </w:p>
-    <w:p/>
-    <w:p>
-      <w:r>
-        <w:t>Jeg hadde kommet ned fra toppen av verden som en halvt fremmed, og strukket meg hver kalde morgen etter en kappe som ikke var gått til ennå. Og et sted i den verste affæren jeg hadde sett i Frost Falls, i utførelsen av en vanskelig ting på riktig måte, hadde kappen gått seg til. Ingen hadde satt seg ned og bestemt det. Jeg hadde elsket stedet høyt nok til å gjøre det vanskelige og rette for det. Folk her hadde sett meg gjøre det og bestemt seg, på sin langsomme, skrå måte, for at jeg var en av deres.</w:t>
+        <w:t xml:space="preserve">Jeg hadde belaget meg på å bli en outsider som knuste en god mann. Jeg hadde mer enn halvveis regnet med at byen ville kjølne mot meg, ønske at jeg hadde latt saken ligge, huske, hver gang de så på meg, at jeg var den som hadde dratt Theo Hussein ut i lyset og brakt sorg over stedet. Og det var litt av det, her og der, en stund. Noen få som ikke helt klarte å møte blikket mitt, som ble litt stille når jeg kom inn i en butikk. Jeg forsto det og lot det ligge. Jeg presset ikke på.</w:t>
+      </w:r>
+    </w:p>
+    <w:p/>
+    <w:p>
+      <w:r>
+        <w:t xml:space="preserve">Men mest av alt skjedde det motsatte. Folk begynte, i det stille, på skrå, slik denne byen gjorde sine dypeste ting, å komme og takke meg. Dot stappet et glass med syltetøyet sitt i hendene mine på markedet og sa, litt brått, med blikket på eplene og ikke på meg: – Du gjorde det rette for Fiona. De fleste ville ha sett en annen vei. Sam Patel løftet på capsen tvers over Evergreen Avenue. Til og med Noriko, som var knipen med rosen sin, fortalte meg over en kopp kaffe at jeg hadde håndtert saken bedre enn de fleste profesjonelle hun hadde jobbet med i karrieren sin, at jeg hadde funnet en varm måte gjennom noe som nesten alltid bare har kalde løsninger ved seg.</w:t>
+      </w:r>
+    </w:p>
+    <w:p/>
+    <w:p>
+      <w:r>
+        <w:t xml:space="preserve">Og Martha. Martha tok tak i hånden min i syklubben en grå ettermiddag, holdt den og sa: – Husker du, for en stund siden, da jeg sa at du ikke trengte å bære ting alene? At en syklubb er til for å lene seg på? Jeg sa at jeg husket det godt. – Vel, sa hun, – du dro jammen og beviste at du er en av oss, som bar det på den måten du gjorde. Du lente deg ikke bare på syklubben da du trengte det. Du var syklubben, for Fiona, da hun ikke hadde noen andre. En fremmed gjør ikke slikt, Jessica. En av våre egne gjør det. Og hun klappet hånden min raskt og gikk rett tilbake til votten sin, som om hun ikke akkurat hadde knust meg fullstendig der jeg satt.</w:t>
+      </w:r>
+    </w:p>
+    <w:p/>
+    <w:p>
+      <w:r>
+        <w:t xml:space="preserve">Jeg hadde kommet ned fra toppen av verden som en halvt fremmed, og strukket meg hver kalde morgen etter en kåpe som ikke hadde gått seg til ennå. Og et sted i den verste affæren jeg hadde sett i Frost Falls, i utførelsen av en vanskelig ting på riktig måte, hadde kåpen gått seg til. Ingen hadde satt seg ned og bestemt det. Jeg hadde elsket stedet høyt nok til å gjøre det vanskelige og rette for det. Folk her hadde sett meg gjøre det og bestemt seg, på sin langsomme, skrå måte, for at jeg var en av deres.</w:t>
       </w:r>
     </w:p>
     <w:p/>
@@ -5008,7 +5008,7 @@
     <w:p/>
     <w:p>
       <w:r>
-        <w:t>Selskapet trengte litt opprydding etter Theo, så vennegjengen og godt og vel halvparten av Evergreen Avenue stilte opp de neste dagene for å få skikk på arkivet igjen.</w:t>
+        <w:t xml:space="preserve">Historielaget trengte litt opprydding etter Theo, så syklubben og godt og vel halvparten av Evergreen Avenue stilte opp de neste dagene for å få skikk på arkivet igjen.</w:t>
       </w:r>
     </w:p>
     <w:p/>
@@ -5026,19 +5026,19 @@
     <w:p/>
     <w:p>
       <w:r>
-        <w:t>Et kart lå brettet sammen inni. Et lite blekksvart kart der almen var merket av med et nøyaktig kryss, og et par oppmålte skritt var notert ned fra stammen og østover.</w:t>
-      </w:r>
-    </w:p>
-    <w:p/>
-    <w:p>
-      <w:r>
-        <w:t>Vi satt alle tre og så på det i lampelyset. Det var en slags rettferdighet i det som falt i smak hos meg: de aller brevene som hadde satt i gang hele bråket, hadde ledet oss rett til tidskapselen.</w:t>
-      </w:r>
-    </w:p>
-    <w:p/>
-    <w:p>
-      <w:r>
-        <w:t>– Tidskapselen, sa Olivia lavt. – Theo har revet seg i håret over den. Hvert eneste arkivnotat han hadde, sa bare at den var gravd ned på allmenningen, og allmenningen er på fire mål. Den ligger under almen. Den har vært der hele tiden.</w:t>
+        <w:t xml:space="preserve">Et kart lå brettet sammen inni. Et lite blekktegnet kart der almen var merket av med et nøyaktig kryss, og et par oppmålte skritt var notert ned fra stammen og østover.</w:t>
+      </w:r>
+    </w:p>
+    <w:p/>
+    <w:p>
+      <w:r>
+        <w:t xml:space="preserve">Vi satt alle tre og så på det i lampelyset. Det var en slags rettferdighet i det som falt i smak hos meg: de samme brevene som hadde satt i gang hele bråket, hadde ledet oss rett til tidskapselen.</w:t>
+      </w:r>
+    </w:p>
+    <w:p/>
+    <w:p>
+      <w:r>
+        <w:t xml:space="preserve">– Tidskapselen, sa Olivia lavt. – Theo har revet seg i håret over den. Hvert eneste arkivnotat han hadde, sa bare at den var gravd ned på allmenningen, og allmenningen er på seksten mål. Den ligger under almen. Den har vært der hele tiden.</w:t>
       </w:r>
     </w:p>
     <w:p/>
@@ -5050,7 +5050,7 @@
     <w:p/>
     <w:p>
       <w:r>
-        <w:t>Sam Patel tok seg av gravingen, for Sam likte det ærlige og tunge arbeidet. Vi sto i ring rundt ham i skinnet fra lyktene og lyslenkene, og pusten vår skylte opp som en sky i kulden. Emma Redfern holdt meg i hånden på den ene siden, og Pip lente seg varmt mot støvelen min på den andre. Snøball hadde på seg gevirhatten. Mark sto bak datteren sin med hendene på skuldrene hennes. Hele vennegjengen var der, i tillegg til Neil Carter, som hadde blitt værende litt lenger enn planlagt og sto bakerst med notatboken sin for en gangs skyld stukket dypt i lommen. Da Sams spade traff noe som ga en matt, fast og metallisk lyd, laget hele allmenningen én felles lyd – et mykt, forbløffet åh som hang igjen i den kalde luften.</w:t>
+        <w:t xml:space="preserve">Sam Patel tok seg av gravingen, for Sam likte det ærlige og tunge arbeidet. Vi sto i ring rundt ham i skinnet fra lyktene og lyslenkene, og pusten vår steg opp som en sky i kulden. Emma Redfern holdt meg i hånden på den ene siden, og Pip lente seg varmt mot støvelen min på den andre. Snøball hadde på seg gevirhatten. Mark sto bak datteren sin med hendene på skuldrene hennes. Hele syklubben var der, i tillegg til Neil Carter, som hadde blitt værende litt lenger enn planlagt og sto bakerst med notatboken sin for en gangs skyld stukket dypt i lommen. Da Sams spade traff noe som ga en matt, fast og metallisk lyd, laget hele allmenningen én felles lyd – et mykt, forbløffet åh som hang igjen i den kalde luften.</w:t>
       </w:r>
     </w:p>
     <w:p/>
@@ -5074,7 +5074,7 @@
     <w:p/>
     <w:p>
       <w:r>
-        <w:t>– Han fant tross alt halve veien dit, fortsatte Noriko, – om han så gikk feil vei da han lette. Han har brukt tretti år på å vite hvor denne byen har gravd ned tingene sine. Han bør få være med når denne kommer opp i lyset. Det kan kanskje være det første gode ting han får stå i nærheten av igjen. Og det å stå nær en god ting som han ikke kan ta æren for, kan være akkurat den medisin han trenger.</w:t>
+        <w:t xml:space="preserve">– Han fant tross alt halve veien dit, fortsatte Noriko, – om han så gikk feil vei da han lette. Han har brukt tretti år på å vite hvor denne byen har gravd ned tingene sine. Han bør få være med når denne kommer opp i lyset. Det kan kanskje være den første gode tingen han får stå i nærheten av igjen. Og det å stå nær en god ting som han ikke kan ta æren for, kan være akkurat den medisinen han trenger.</w:t>
       </w:r>
     </w:p>
     <w:p/>
@@ -5098,7 +5098,7 @@
     <w:p/>
     <w:p>
       <w:r>
-        <w:t>– Låsen, fru Claus! ropte Bram andpusten da han kom frem. – Fra feil side igjen! Jeg gir opp, jeg gir hele greia opp, dyrene går dit folk er, og hver eneste sjel i byen er her ute i kveld, hva skal en formann gjøre med sånt, spør jeg bare!</w:t>
+        <w:t xml:space="preserve">– Klinken, fru Claus! ropte Bram andpusten da han kom frem. – Fra feil side igjen! Jeg gir opp, jeg gir hele greia opp, dyrene går dit folk er, og hver eneste sjel i byen er her ute i kveld, hva skal en formann gjøre med sånt, spør jeg bare!</w:t>
       </w:r>
     </w:p>
     <w:p/>
@@ -5110,19 +5110,19 @@
     <w:p/>
     <w:p>
       <w:r>
-        <w:t>Jeg sto der på allmenningen og så meg rundt på alt sammen: almen og gulllysene, den grønne kobberboksen, reinsdyret, det leende barnet og hele byen som sto samlet i lykteskjæret. Pip hadde gått bort for å stille seg like under snuten til Dancer og ga reinsdyret et langt, strengt blikk, som for å minne henne på hvem som eide denne pingvinen. Nicks hånd fant min. Utenfor innhegningen lå ildstedet han hadde bygget for magien, og jeg lurte på hvor mye mer av den som ville sirkulere der innen vi kom oss hjem.</w:t>
-      </w:r>
-    </w:p>
-    <w:p/>
-    <w:p>
-      <w:r>
-        <w:t>Vi bar boksen opp til Selskapet i fellesskap, et dusin kalde hender på en og samme grønne kobberboks, og satte den på hedersplassen i det fremste rommet, fortsatt forseglet, full av alt det en by for hundre år siden hadde ment var verdt å ta vare på for oss. Et mysterium å åpne i det nye året. En god grunn til å holde Selskapets dører åpne i alle fall så lenge.</w:t>
-      </w:r>
-    </w:p>
-    <w:p/>
-    <w:p>
-      <w:r>
-        <w:t>Så gikk vi hjem under gulllysene. Bak oss sto almen over et tomt hull, med rim fortsatt hengende på de nederste kvistene. I det nye året ville byen åpne boksen, og Theo ville være der for å se det.</w:t>
+        <w:t xml:space="preserve">Jeg sto der på allmenningen og så meg rundt på alt sammen: almen og gullysene, den grønne kobberboksen, reinsdyret, det leende barnet og hele byen som sto samlet i lykteskjæret. Pip hadde gått bort for å stille seg like under snuten til Dancer og ga reinsdyret et langt, strengt blikk, som for å minne henne på hvem som eide denne pingvinen. Nicks hånd fant min. Utenfor innhegningen lå ildstedet han hadde bygget for magien, og jeg lurte på hvor mye mer av den som ville sirkulere der innen vi kom oss hjem.</w:t>
+      </w:r>
+    </w:p>
+    <w:p/>
+    <w:p>
+      <w:r>
+        <w:t xml:space="preserve">Vi bar boksen opp til Historielaget i fellesskap, et dusin kalde hender på en og samme grønne kobberboks, og satte den på hedersplassen i det fremste rommet, fortsatt forseglet, full av alt det en by for hundre år siden hadde ment var verdt å ta vare på for oss. Et mysterium å åpne i det nye året. En god grunn til å holde Historielagets dører åpne i alle fall så lenge.</w:t>
+      </w:r>
+    </w:p>
+    <w:p/>
+    <w:p>
+      <w:r>
+        <w:t xml:space="preserve">Så gikk vi hjem under gullysene. Bak oss sto almen over et tomt hull, med rim fortsatt hengende på de nederste kvistene. I det nye året ville byen åpne boksen, og Theo ville være der for å se det.</w:t>
       </w:r>
     </w:p>
     <w:p>
@@ -5133,13 +5133,13 @@
     <w:p/>
     <w:p>
       <w:r>
-        <w:t>Festivalbordene var for lengst blitt slått sammen og ryddet vekk, det grønne gresset var feid, og de innleide stolene var kjørt tilbake dit de kom fra. Men de gule lysene hang fremdeles oppe over hele byen. Ingen tok dem ned, og ingen spurte hvorfor de hadde blitt gule.</w:t>
-      </w:r>
-    </w:p>
-    <w:p/>
-    <w:p>
-      <w:r>
-        <w:t>Jeg fulgte Emma og Snowball hjem en kveld den uken, med Pip luskende foran oss og Mark ved siden av meg. Emma skravlet uavbrutt hele veien, slik hun pleide nå til dags, om kobberboksen og hva som kunne befinne seg oppi den. Mynter, trodde hun. Eller et brev. Eller en skatt, en ekte skatt, gull, håpet hun, og kom hele byen til å få se, og kunne hun få stå langt framme når de åpnet den, for hun hadde vært der da den kom opp av jorden, og det måtte da telle for noe, ikke sant?</w:t>
+        <w:t xml:space="preserve">Festivalbordene var for lengst blitt slått sammen og ryddet vekk, allmenningen var feid, og de lånte stolene var kjørt tilbake dit de kom fra. Men de gylne lysene hang fremdeles oppe over hele byen. Ingen tok dem ned, og ingen spurte hvorfor de hadde blitt gylne.</w:t>
+      </w:r>
+    </w:p>
+    <w:p/>
+    <w:p>
+      <w:r>
+        <w:t xml:space="preserve">Jeg fulgte Emma og Snowball hjem en kveld den uken, med Pip vraltende foran oss og Mark ved siden av meg. Emma skravlet uavbrutt hele veien, slik hun pleide nå til dags, om kobberboksen og hva som kunne befinne seg oppi den. Mynter, trodde hun. Eller et brev. Eller en skatt, en ekte skatt, gull, håpet hun, og kom hele byen til å få se, og kunne hun få stå langt framme når de åpnet den, for hun hadde vært der da den kom opp av jorden, og det måtte da telle for noe, ikke sant?</w:t>
       </w:r>
     </w:p>
     <w:p/>
@@ -5151,7 +5151,7 @@
     <w:p/>
     <w:p>
       <w:r>
-        <w:t>Mark fanget blikket mitt over hodet på datteren sin. Det lå fremdeles et sting av vemod i blikket hans, men det hadde blitt slitt mykt, som en stein i elv.</w:t>
+        <w:t xml:space="preserve">Mark fanget blikket mitt over hodet på datteren sin. Det lå fremdeles et sting av vemod i blikket hans, men det hadde blitt slitt mykt, som en stein i en elv.</w:t>
       </w:r>
     </w:p>
     <w:p/>
@@ -5217,13 +5217,13 @@
     <w:p/>
     <w:p>
       <w:r>
-        <w:t>Kristtornen sto oppi der, kvisten fra gresskaret, stående i en tomme vann. De tre bladene var mørke og blanke, og bærene var like røde som den ettermiddagen den kom opp av jorden.</w:t>
-      </w:r>
-    </w:p>
-    <w:p/>
-    <w:p>
-      <w:r>
-        <w:t>– Det har ikke en gang hengt med hodet, hvisket hun, med et blikk bort på faren, som hadde stanset for å snakke med en nabo over gjerdet. – Jeg skifter vannet hver eneste morgen. Pappa tror jeg tok den fra kransen på innsektet.</w:t>
+        <w:t xml:space="preserve">Kristtornen sto oppi der, kvisten fra gresskaret, stående i et par centimeter vann. De tre bladene var mørke og blanke, og bærene var like røde som den ettermiddagen den kom opp av jorden.</w:t>
+      </w:r>
+    </w:p>
+    <w:p/>
+    <w:p>
+      <w:r>
+        <w:t xml:space="preserve">– Det har ikke en gang hengt med hodet, hvisket hun, med et blikk bort på faren, som hadde stanset for å snakke med en nabo over gjerdet. – Jeg skifter vannet hver eneste morgen. Pappa tror jeg tok den fra kransen på vertshuset.</w:t>
       </w:r>
     </w:p>
     <w:p/>
@@ -5247,7 +5247,7 @@
     <w:p/>
     <w:p>
       <w:r>
-        <w:t>Jeg så Theo en gang til den uken. Han var på Selskapet, i det innerste rommet, der han holdt på å bøte på et revnet gammelt kart, det enkleste arbeidet han noensinne hadde blitt satt til, og åpenbart takknemlig for det. Han hørte meg ikke komme inn. Da han så opp, rettet han seg opp og strammet seg til, som en mann som forventet å bli minnet på nøyaktig hva han var.</w:t>
+        <w:t xml:space="preserve">Jeg så Theo en gang til den uken. Han var på Historielaget, i det innerste rommet, der han holdt på å bøte på et revnet gammelt kart, det enkleste arbeidet han noensinne hadde blitt satt til, og åpenbart takknemlig for det. Han hørte meg ikke komme inn. Da han så opp, rettet han seg opp og strammet seg til, som en mann som forventet å bli minnet på nøyaktig hva han var.</w:t>
       </w:r>
     </w:p>
     <w:p/>
@@ -5355,13 +5355,13 @@
     <w:p/>
     <w:p>
       <w:r>
-        <w:t>Jeg lente meg inn mot ham og så på hvordan gullet snurret i langsomme sirkler over ildstedet, og jeg tenkte på vinteren som var i anmarsj. Selskapet sto fremdeles på kanten av stupet, og skulle enten reddes på riktig måte eller ikke i det hele tatt, med en hel sesong med kakesalg og sta, liten sjenerøsitet foran seg før noen ville få vite det. Kobberboksen forseglet i Selskapets forrom til nyttår. Vera og Theo som begge gikk sine lange veier tilbake, tomme for hard tomme. Magien som nå la seg til ro, men ennå ikke hadde falt helt til ro, og som fremdeles gnistret i lys og dørvinkler over hele byen. Så mye av det som fremdeles var uferdig. Så mye som gjensto å gjøre.</w:t>
-      </w:r>
-    </w:p>
-    <w:p/>
-    <w:p>
-      <w:r>
-        <w:t>Men lysene var gyldne over Frost Falls. Et barn som hadde blitt stilt, skravlet igjen om skatter. Fiona hadde omsider rettet ryggen inne i sin egen sanne historie, og Theo hadde blitt rakt en vei tilbake. Jeg var ikke lenger en fremmed her. Jeg var hjemme. Vi var det begge to. Og julemagien, som hadde fulgt oss hele veien fra Polhavet, hadde begynt, så vidt begynt, å finne sin ro.</w:t>
+        <w:t xml:space="preserve">Jeg lente meg inn mot ham og så på hvordan gullet snurret i langsomme sirkler over ildstedet, og jeg tenkte på vinteren som var i anmarsj. Historielaget sto fremdeles på kanten av stupet, og skulle enten reddes på riktig måte eller ikke i det hele tatt, med en hel sesong med kakesalg og sta, liten sjenerøsitet foran seg før noen ville få vite det. Kobberboksen forseglet i Historielagets forrom til nyttår. Vera og Theo som begge gikk sine lange veier tilbake, tomme for hard tomme. Magien som nå la seg til ro, men ennå ikke hadde falt helt til ro, og som fremdeles gnistret i lys og dørklinker over hele byen. Så mye av det som fremdeles var uferdig. Så mye som gjensto å gjøre.</w:t>
+      </w:r>
+    </w:p>
+    <w:p/>
+    <w:p>
+      <w:r>
+        <w:t xml:space="preserve">Men lysene var gyldne over Frost Falls. Et barn som hadde blitt stilt, skravlet igjen om skatter. Fiona hadde omsider rettet ryggen inne i sin egen sanne historie, og Theo hadde blitt rakt en vei tilbake. Jeg var ikke lenger en fremmed her. Jeg var hjemme. Vi var det begge to. Og julemagien, som hadde fulgt oss hele veien fra Nordpolen, hadde begynt, så vidt begynt, å finne sin ro.</w:t>
       </w:r>
     </w:p>
     <w:p/>
@@ -5379,7 +5379,7 @@
     <w:p/>
     <w:p>
       <w:r>
-        <w:t>Vi gikk inn sammen ut fra den gyldne natten. Pip slo oss begge til kjøkkendøren og ble stående og kreve å bli slipt inn i varmen, og bak oss, over gårdsplassen, fortsatte arnen å gløde inne i verkstedet.</w:t>
+        <w:t xml:space="preserve">Vi gikk inn sammen ut fra den gyldne natten. Pip slo oss begge til kjøkkendøren og ble stående og kreve å bli sluppet inn i varmen, og bak oss, over gårdsplassen, fortsatte arnen å gløde inne i verkstedet.</w:t>
       </w:r>
     </w:p>
     <w:p/>
@@ -5424,7 +5424,7 @@
     <w:p/>
     <w:p>
       <w:r>
-        <w:t>Greta ha bakt nøyaktig den samme kanelbollen i førti år. Hun bakte den morgenen etter ektemannens begravelse fordi hun ikke visste hva annet hun skulle gjøre med hendene sine. Denne uken kommer den ut av ovnen og smaker surt, og det gjør den neste omgangen også, og den etter den igjen.</w:t>
+        <w:t xml:space="preserve">Greta har bakt nøyaktig den samme kanelbollen i førti år. Hun bakte den morgenen etter ektemannens begravelse fordi hun ikke visste hva annet hun skulle gjøre med hendene sine. Denne uken kommer den ut av ovnen og smaker surt, og det gjør den neste omgangen også, og den etter den igjen.</w:t>
       </w:r>
     </w:p>
     <w:p/>
@@ -5436,19 +5436,19 @@
     <w:p/>
     <w:p>
       <w:r>
-        <w:t>Så kommer det en stein gjennom vinduet, og et ord dukker opp med rød maling på kledningen der hvert eneste barn på Evergreen Avenue vil lese det når de går forbi.</w:t>
-      </w:r>
-    </w:p>
-    <w:p/>
-    <w:p>
-      <w:r>
-        <w:t>Byen griper etter de enkle forklaringene: slakteren som lenket fast lasteporten, familien som lå etter med oljeregningen, en kjedelig gutt med en stjålet boks. Jessica griper etter det som passer – for hvem enn som gjorde dette, kjøpte pulveret, kjente doseringen og viste til en helseforskrift med underparagraf. Det er ikke et raserianfall. Det er en handel.</w:t>
-      </w:r>
-    </w:p>
-    <w:p/>
-    <w:p>
-      <w:r>
-        <w:t>Og i den lyse enden av alléen har et nytt konditori datert sin storslåtte åpning til den ene uken hvor Holly Jolly vil være mørklagt.</w:t>
+        <w:t xml:space="preserve">Så kommer det en murstein gjennom vinduet, og et ord dukker opp med rød maling på kledningen der hvert eneste barn på Evergreen Avenue vil lese det når de går forbi.</w:t>
+      </w:r>
+    </w:p>
+    <w:p/>
+    <w:p>
+      <w:r>
+        <w:t xml:space="preserve">Byen griper etter de enkle forklaringene: slakteren som lenket fast lasteporten, familien som lå etter med oljeregningen, en gutt som kjedet seg, med en stjålet boks. Jessica griper etter det som passer – for hvem enn som gjorde dette, kjøpte pulveret, kjente doseringen og sendte inn en klage som viste til helseforskriften med underparagraf. Det er ikke et raserianfall. Det er et fag.</w:t>
+      </w:r>
+    </w:p>
+    <w:p/>
+    <w:p>
+      <w:r>
+        <w:t xml:space="preserve">Og i den lyse enden av alléen har et nytt konditori lagt sin storslåtte åpning til den ene uken hvor Holly Jolly vil være mørklagt.</w:t>
       </w:r>
     </w:p>
     <w:p/>
@@ -5463,7 +5463,7 @@
         <w:rPr>
           <w:i/>
         </w:rPr>
-        <w:t xml:space="preserve">Det vrimler av nye mysterier for Jessica Claus! </w:t>
+        <w:t xml:space="preserve">Det venter flere mysterier for Jessica Claus! </w:t>
       </w:r>
       <w:r>
         <w:t>&lt;bt&gt;</w:t>
@@ -5502,13 +5502,13 @@
     <w:p/>
     <w:p>
       <w:r>
-        <w:t>Hver eneste kvinne i sirkelen hadde tatt med sin egen edelgran, og jeg hadde tatt med Nordpolens måte å binde den sammen på, noe Olivia hadde sverget på å stjele fra meg før jul. Jeg festet ståltråden til rammen langsomt, slik at alle kunne henge med. Først da strakte jeg meg etter den første håndfullen med granbar. Lukten steg kald og grønn opp, skarp nok til å rense hodet. Den fylte forrommet i Yarn Tales på en måte som butikkens egen ull aldri helt klarte. Jeg satt der med sevje på fingrene og en bar ramme i fanget, en av syv kvinner bøyd over det samme arbeidet. Det finnes verre måter å tilbringe den første ledige morgenen i november på.</w:t>
-      </w:r>
-    </w:p>
-    <w:p/>
-    <w:p>
-      <w:r>
-        <w:t>Snøen hadde kommet i løpet av natten. Ikke den tidlige oktober-snøen som var borte igjen på et blunk med noen milde dager. Ekte snø. Den dype årstidssnøen som hadde begynt på Halloween og ville ligge helt til våren. Den lå langs Evergreen Avenue nå i et solid, rent lag på femten centimeter, og knirket under føttene når noen kom inn og stampet av seg. I løpet av helgen hadde butikkene byttet ut skjelettene og lyktene med maissstenger og papirkalkuner, selv om de vanlige gresskarene lå igjen på trappene, like fine til Thanksgiving. Alléen hadde blitt stille etter Halloween, i dødvannet før det lange, lyse trykket mot julen.</w:t>
+        <w:t xml:space="preserve">Hver eneste kvinne i syklubben hadde tatt med sin egen edelgran, og jeg hadde tatt med Nordpolens måte å binde den sammen på, noe Olivia hadde sverget på å stjele fra meg før jul. Jeg festet ståltråden til rammen langsomt, slik at alle kunne henge med. Først da strakte jeg meg etter den første håndfullen med granbar. Lukten steg kald og grønn opp, skarp nok til å rense hodet. Den fylte forrommet i Yarn Tales på en måte som butikkens egen ull aldri helt klarte. Jeg satt der med sevje på fingrene og en bar ramme i fanget, en av syv kvinner bøyd over det samme arbeidet. Det finnes verre måter å tilbringe den første ledige morgenen i november på.</w:t>
+      </w:r>
+    </w:p>
+    <w:p/>
+    <w:p>
+      <w:r>
+        <w:t xml:space="preserve">Snøen hadde kommet i løpet av natten. Ikke den tidlige oktober-snøen som var borte igjen på et blunk med noen milde dager. Ekte snø. Den dype årstidssnøen som hadde begynt på Halloween og ville ligge helt til våren. Den lå langs Evergreen Avenue nå i et solid, rent lag på femten centimeter, og knirket under føttene når noen kom inn og stampet av seg. I løpet av helgen hadde butikkene byttet ut skjelettene og lyktene med maisstengler og papirkalkuner, selv om de vanlige gresskarene lå igjen på trappene, like fine til Thanksgiving. Alléen hadde blitt stille etter Halloween, i dødvannet før det lange, lyse trykket mot julen.</w:t>
       </w:r>
     </w:p>
     <w:p/>
@@ -5520,7 +5520,7 @@
     <w:p/>
     <w:p>
       <w:r>
-        <w:t xml:space="preserve">Jeg roet ned tempoet for henne. Jeg la tre kvister mot rammen, bandt dem fast med to tørn med ståltråd og la den neste bunt over den første slik at den skjulte bindingen. </w:t>
+        <w:t xml:space="preserve">Jeg roet ned tempoet for henne. Jeg la tre kvister mot rammen, bandt dem fast med to tørn med ståltråd og la den neste bunten over den første slik at den skjulte bindingen. </w:t>
       </w:r>
     </w:p>
     <w:p>
@@ -5557,12 +5557,12 @@
     <w:p/>
     <w:p>
       <w:r>
-        <w:t xml:space="preserve">Dot lo sin korte, tørre latter fra den andre siden av sirkelen, uten å se opp fra sin egen krans, som allerede var halvparten så stor igjen som andres og dobbelt så tett. </w:t>
-      </w:r>
-    </w:p>
-    <w:p>
-      <w:r>
-        <w:t xml:space="preserve">– Hun har vært ute etter knepet ditt siden den dagen du kom inn døren. Hun var ute etter mitt i nitten åttifem eller noe sånt. </w:t>
+        <w:t xml:space="preserve">Dot lo sin korte, tørre latter fra den andre siden av ringen, uten å se opp fra sin egen krans, som allerede var halvannen gang så stor som de andres og dobbelt så tett. </w:t>
+      </w:r>
+    </w:p>
+    <w:p>
+      <w:r>
+        <w:t xml:space="preserve">– Hun har vært ute etter knepet ditt siden den dagen du kom inn døren. Hun var ute etter mitt en gang på åttitallet. </w:t>
       </w:r>
     </w:p>
     <w:p/>
@@ -5574,19 +5574,19 @@
     <w:p/>
     <w:p>
       <w:r>
-        <w:t>Vi var der alle sammen den morgenen. Hele sirkelen, når ingen var slått ut av forkjølelse eller passet barnebarn. Olivia i spissen for det hele i sin egen butikk, med garnnøster stablet opp bak seg i alle farger en vinter kan ønske seg. Dot ved siden av henne, enkel og rask. Så Claire Bennett, som skrev for avisa, med en notatbok åpen på armlenet på stolen fordi Claire aldri hadde ordentlig fri. Hun la stadig fra seg kransen for å skrive ned en linje og plukket den opp igjen et tak senere enn resten av oss. Ivy ved siden av, hvis låt var så stor og så lett at butikken virket lysere av å ha henne i den. Hun hadde på et eller vis fått granbar i håret uten å merke det. Martha, den pensjonerte læreren, enke gjennom mange år, med sin lille, hvite hund Snowball sovende inntil ankelen. Hånden hennes sank ned med jevne mellomrom for å røre ved øret hans. For å forsikre seg om at han fremdeles var der. Og Ellie, snill og ukynnet, som gjorde frivillig arbeid på sykehuset tre dager i uken. Hun tok med seg den samme stødige ømheten inn i en ståltrådramme. Kransen hennes så mindre ut som om den var laget, og mer som om den hadde grodd.</w:t>
-      </w:r>
-    </w:p>
-    <w:p/>
-    <w:p>
-      <w:r>
-        <w:t>Og Pip, som ikke var en del av sirkelen, men ville ha blitt dypt fornærmet over å bli utelatt fra en opptelling over hvem som var til stede. Hun hadde installert seg under vinduet i den ene flekken med lav novembersol, i et rede hun hadde bygd av et falt rødt garnnøste som Olivia, la jeg merke til, ikke hadde forsøkt særlig hardt å få tilbake. Hun lå der og skinte og var fornøyd, med det ene øyet halvåpent for det som foregikk. For alt som skinte, spesielt. Og det var en hel del som skinte. Olivia hadde et glass med forgylte kongler på bordet, og en spole med gullbånd ved siden av. Pip hadde allerede blitt snakket til om begge deler. To ganger.</w:t>
-      </w:r>
-    </w:p>
-    <w:p/>
-    <w:p>
-      <w:r>
-        <w:t>– Nå er trikset med konglene, sa jeg og holdt en opp, – at du setter ståltråd på dem før du stikker dem fast, ellers så drysser de rett ut av den innen nyttår og du kommer til å finne gullkonger i sofaen helt til våren – Pip. Pip, jeg ser deg. Den er ikke til deg.</w:t>
+        <w:t xml:space="preserve">Vi var der alle sammen den morgenen. Hele syklubben, når ingen var slått ut av forkjølelse eller passet barnebarn. Olivia i spissen for det hele i sin egen butikk, med garnnøster stablet opp bak seg i alle farger en vinter kan ønske seg. Dot ved siden av henne, enkel og rask. Så Claire Bennett, som skrev for avisa, med en notatbok åpen på armlenet på stolen fordi Claire aldri hadde ordentlig fri. Hun la stadig fra seg kransen for å skrive ned en linje og plukket den opp igjen et øyeblikk etter resten av oss. Ivy ved siden av, hvis latter var så stor og så lett at butikken virket lysere av å ha henne i den. Hun hadde på et eller vis fått granbar i håret uten å merke det. Martha, den pensjonerte læreren, enke gjennom mange år, med sin lille, hvite hund Snowball sovende inntil ankelen. Hånden hennes sank ned med jevne mellomrom for å røre ved øret hans. For å forsikre seg om at han fremdeles var der. Og Ellie, snill og rolig, som gjorde frivillig arbeid på sykehuset tre dager i uken. Hun tok med seg den samme stødige ømheten inn i en ståltrådramme. Kransen hennes så mindre ut som om den var laget, og mer som om den hadde grodd.</w:t>
+      </w:r>
+    </w:p>
+    <w:p/>
+    <w:p>
+      <w:r>
+        <w:t xml:space="preserve">Og Pip, som ikke var en del av syklubben, men ville ha blitt dypt fornærmet over å bli utelatt fra en opptelling over hvem som var til stede. Hun hadde installert seg under vinduet i den ene flekken med lav novembersol, i et rede hun hadde bygd av et falt rødt garnnøste som Olivia, la jeg merke til, ikke hadde forsøkt særlig hardt å få tilbake. Hun lå der og skinte og var fornøyd, med det ene øyet halvåpent for det som foregikk. For alt som skinte, spesielt. Og det var en hel del som skinte. Olivia hadde et glass med forgylte kongler på bordet, og en spole med gullbånd ved siden av. Pip hadde allerede blitt snakket til om begge deler. To ganger.</w:t>
+      </w:r>
+    </w:p>
+    <w:p/>
+    <w:p>
+      <w:r>
+        <w:t xml:space="preserve">– Nå er trikset med konglene, sa jeg og holdt en opp, – at du setter ståltråd på dem før du stikker dem fast, ellers så drysser de rett ut av den innen nyttår og du kommer til å finne gullkongler i sofaen helt til våren – Pip. Pip, jeg ser deg. Den er ikke til deg.</w:t>
       </w:r>
     </w:p>
     <w:p/>
@@ -5616,7 +5616,7 @@
     <w:p/>
     <w:p>
       <w:r>
-        <w:t>Det slo meg der jeg satt og la de små kvistene oppå hverandre, hvor langt jeg hadde reist for å sitte der. Ikke milene. Det var veldig mange av dem, men det var ikke milene jeg mente. For ikke lenge siden hadde jeg vært nykommeren i Frost Falls. Kvinnen fra Nordpolen med den berømte mannen og den pussige pingvinen. Folk hadde vært snille mot meg slik en by er snill mot en gjest, det vil si at de ryddet plass og så på hva jeg kom til å gjøre med den. Og nå prøvde Olivia å stjele min måte å binde en krans på. Marthas hund sov mot stolen min like selvfølgelig som mot hennes. Ingen forklarte meg noe lenger. Det ble tatt for gitt at jeg visste det. Jeg hadde fortjent meg det raskt i løpet av en hard høst, over en tapt hund og en tidskapsel.</w:t>
+        <w:t xml:space="preserve">Det slo meg der jeg satt og la de små kvistene oppå hverandre, hvor langt jeg hadde reist for å sitte der. Ikke milene. Det var veldig mange av dem, men det var ikke milene jeg mente. For ikke lenge siden hadde jeg vært nykommeren i Frost Falls. Kvinnen fra Nordpolen med den berømte mannen og den pussige pingvinen. Folk hadde vært snille mot meg slik en by er snill mot en gjest, det vil si at de ryddet plass og så på hva jeg kom til å gjøre med den. Og nå prøvde Olivia å stjele min måte å binde en krans på. Marthas hund sov mot stolen min like selvfølgelig som mot hennes. Ingen forklarte meg noe lenger. Det ble tatt for gitt at jeg visste det. Jeg hadde gjort meg fortjent til det raskt i løpet av en hard høst, over en tapt hund og en tidskapsel.</w:t>
       </w:r>
     </w:p>
     <w:p/>
@@ -5639,7 +5639,7 @@
     </w:p>
     <w:p>
       <w:r>
-        <w:t>– Jeg tok et brett med sjokolade- og pekannøttmuffins ut av ovnen for ikke en time siden, og jeg sa til meg selv: Greta, hvem er det som sitter i en kald butikk og gjør seg nyttige i dag? Svaret var dere alle sammen, så værs god.</w:t>
+        <w:t xml:space="preserve">– Jeg tok et brett med sjokolade- og pekannøttmuffins ut av ovnen for ikke en time siden, og jeg sa til meg selv: Greta, hvem er det som sitter i en kald butikk og gjør seg nyttige i dag? Svaret var dere alle sammen, så vær så god.</w:t>
       </w:r>
     </w:p>
     <w:p/>
@@ -5698,13 +5698,13 @@
     <w:p/>
     <w:p>
       <w:r>
-        <w:t>Vi kastet oss over arbeidet igjen med liv og lyst, åtte kvinner, en boks med muffins, en pingvin og en sovende hund. Praten gikk ut og inn av arbeidet slik sirkelprat gjerne gjør, en hel morgens små nyheter holdt i rommene mellom bundne kvister. Ivys datter hadde fått ny jobb i Concord. Claire hadde en artikkel på trykk på torsdag om plogrutinen som hun lovet oss på tro og ære var mye mer interessant enn det hørtes ut som. Martha sa at dagene trakk seg så fort sammen nå at Emma kom og gikk med Snowball nesten i mørket, og jeg ba henne hilse så mye til jenta. Martha sa at Emma alltid spurte etter Pip. Og Pip, som hørte navnet sitt og tok det som ros, puffet seg opp med fjær og så fornøyd ut.</w:t>
-      </w:r>
-    </w:p>
-    <w:p/>
-    <w:p>
-      <w:r>
-        <w:t>Det var Claire som bragte på banen dette med butikken, fordi det var Claires oppgave å merke seg at noe har endret seg, og andres bare å slarve om det etterpå.</w:t>
+        <w:t xml:space="preserve">Vi kastet oss over arbeidet igjen med liv og lyst, åtte kvinner, en boks med muffins, en pingvin og en sovende hund. Praten gikk ut og inn av arbeidet slik syklubbprat gjerne gjør, en hel morgens små nyheter holdt i rommene mellom bundne kvister. Ivys datter hadde fått ny jobb i Concord. Claire hadde en artikkel på trykk på torsdag om plogrutinen som hun lovet oss på tro og ære var mye mer interessant enn det hørtes ut som. Martha sa at dagene trakk seg så fort sammen nå at Emma kom og gikk med Snowball nesten i mørket, og jeg ba henne hilse så mye til jenta. Martha sa at Emma alltid spurte etter Pip. Og Pip, som hørte navnet sitt og tok det som ros, puffet seg opp med fjær og så fornøyd ut.</w:t>
+      </w:r>
+    </w:p>
+    <w:p/>
+    <w:p>
+      <w:r>
+        <w:t xml:space="preserve">Det var Claire som brakte på bane dette med butikken, fordi det var Claires oppgave å merke seg at noe har endret seg, og andres bare å slarve om det etterpå.</w:t>
       </w:r>
     </w:p>
     <w:p/>
@@ -5716,7 +5716,7 @@
     <w:p/>
     <w:p>
       <w:r>
-        <w:t>Det fanget sirkelens oppmerksomhet bort fra ståltråden. Det gamle Fenwick-lokalet hadde stått tomt i et godt år, med mørke vinduer i enden av en lys kvartal. Det var den typen tomrom i en rekke med butikker som folk lærer seg å la være å se på, for ikke å kjenne det lille stikket av vemod.</w:t>
+        <w:t xml:space="preserve">Det fanget syklubbens oppmerksomhet bort fra ståltråden. Det gamle Fenwick-lokalet hadde stått tomt i et godt år, med mørke vinduer i enden av et lyst kvartal. Det var den typen tomrom i en rekke med butikker som folk lærer seg å la være å se på, for ikke å kjenne det lille stikket av vemod.</w:t>
       </w:r>
     </w:p>
     <w:p/>
@@ -5751,13 +5751,13 @@
     <w:p/>
     <w:p>
       <w:r>
-        <w:t>Det kom et samstemt mumling av enighet, for folk i en by som Frost Falls ser på et tomt butikkvindu som en liten personlig sorg og et nytt som en liten personlig gave.</w:t>
-      </w:r>
-    </w:p>
-    <w:p/>
-    <w:p>
-      <w:r>
-        <w:t>Jeg snudde en granbarbunt mellom mine sevjeklebrige fingre, og kjente, uten noen åpenbar grunn jeg kunne ha oppgitt for sirkelen, et lite, kjølig grøss av nysgjerrighet i nakken. Jeg la det til side, slik jeg hadde lært meg i løpet av mange år med å legge til side ting som ennå ikke betydde noe, i tilfelle de kom til å gjøre det.</w:t>
+        <w:t xml:space="preserve">Det kom en samstemt mumling av enighet, for folk i en by som Frost Falls ser på et tomt butikkvindu som en liten personlig sorg og et nytt som en liten personlig gave.</w:t>
+      </w:r>
+    </w:p>
+    <w:p/>
+    <w:p>
+      <w:r>
+        <w:t xml:space="preserve">Jeg snudde en granbarbunt mellom mine sevjeklebrige fingre, og kjente, uten noen åpenbar grunn jeg kunne ha oppgitt for syklubben, et lite, kjølig grøss av nysgjerrighet i nakken. Jeg la det til side, slik jeg hadde lært meg i løpet av mange år med å legge til side ting som ennå ikke betydde noe, i tilfelle de kom til å gjøre det.</w:t>
       </w:r>
     </w:p>
     <w:p/>
@@ -5775,13 +5775,13 @@
     <w:p/>
     <w:p>
       <w:r>
-        <w:t>– Nå var da rart, sa hun på sin milde måte, og noe i denne mildheten fikk oss alle til å se opp. – Sto ikke barnas snømenn vendt ut mot veien i går?</w:t>
-      </w:r>
-    </w:p>
-    <w:p/>
-    <w:p>
-      <w:r>
-        <w:t>Gressplenen lå tvers overfor Yarn Tales, et bredt, hvitt fellesareal med musikkpaviljongen i den ene enden og krigsminnesmerket i den andre. Skolebarna hadde bygd en rekke med snømenn der i løpet av det første ordentlige snøfallet. Tre stykker, tjukke og skjeve og kronet med det ungene kunne oppdrive. I går, slik Ellie sa det, hadde de snudd seg mot veien, med kulløyne og et lunt uttrykk, og fulgt med på trafikken som snømenn gjerne gjør. Jeg hadde gått forbi dem selv kvelden før. De hadde vendt ansiktene mot gaten.</w:t>
+        <w:t xml:space="preserve">– Nå var det da rart, sa hun på sin milde måte, og noe i denne mildheten fikk oss alle til å se opp. – Sto ikke barnas snømenn vendt ut mot veien i går?</w:t>
+      </w:r>
+    </w:p>
+    <w:p/>
+    <w:p>
+      <w:r>
+        <w:t xml:space="preserve">Allmenningen lå tvers overfor Yarn Tales, et bredt, hvitt fellesareal med musikkpaviljongen i den ene enden og krigsminnesmerket i den andre. Skolebarna hadde bygd en rekke med snømenn der i løpet av det første ordentlige snøfallet. Tre stykker, tjukke og skjeve og kronet med det ungene kunne oppdrive. I går, slik Ellie sa det, hadde de snudd seg mot veien, med kulløyne og et lunt uttrykk, og fulgt med på trafikken som snømenn gjerne gjør. Jeg hadde gått forbi dem selv kvelden før. De hadde vendt ansiktene mot gaten.</w:t>
       </w:r>
     </w:p>
     <w:p/>
@@ -5793,7 +5793,7 @@
     <w:p/>
     <w:p>
       <w:r>
-        <w:t>Den sto med ryggen til veien nå, med pinjearmene slått ut til sidene, det klumpete kullansiktet vendt vekk oppover plenen mot butikkene. Mot, om man skulle være helt nøyaktig på det, den fjerne enden av kvartalet der det gamle Fenwick-lokalet lå bak sitt brune papir. De to andre snudde fremdeles ansiktet mot gaten. Bare den i midten hadde flyttet på seg. Dreid seg rundt på sin egen sokkel for å se den andre veien. Og det var ikke et eneste fotavtrykk i nærheten av den. Snøen rundt alle tre lå glatt og urørt. Femten centimeter med ren snø fra natten før, uten annet skrevet i den enn musikkpaviljongrekkverkets lange, blå skygger.</w:t>
+        <w:t xml:space="preserve">Den sto med ryggen til veien nå, med pinnearmene slått ut til sidene, det klumpete kullansiktet vendt vekk oppover allmenningen mot butikkene. Mot, om man skulle være helt nøyaktig på det, den fjerne enden av kvartalet der det gamle Fenwick-lokalet lå bak sitt brune papir. De to andre snudde fremdeles ansiktet mot gaten. Bare den i midten hadde flyttet på seg. Dreid seg rundt på sin egen sokkel for å se den andre veien. Og det var ikke et eneste fotavtrykk i nærheten av den. Snøen rundt alle tre lå glatt og urørt. Femten centimeter med ren snø fra natten før, uten annet skrevet i den enn musikkpaviljongrekkverkets lange, blå skygger.</w:t>
       </w:r>
     </w:p>
     <w:p/>
@@ -5834,25 +5834,25 @@
     <w:p/>
     <w:p>
       <w:r>
-        <w:t>Og det var jo det fornuftige synet, og sirkelen kjøpte det, og noen sa at unger i dag og en annen sa at det aldri snødde slik som dette da jeg var jente, og praten gikk videre, som sirkelprat gjerne gjør, og Ivy hentet en ny sirupsnipp. Men jeg ble stående ved vinduet et øyeblikk lenger enn de andre, med den halvferdige kransen i hånden. Jeg så på den snømannen i midten som vendte oppover kvartalet. Jeg så på den glatte, urørte snøen som ingen skøyeraktige støvler hadde rørt ved. Og jeg sa ikke høyt det jeg tenkte.</w:t>
-      </w:r>
-    </w:p>
-    <w:p/>
-    <w:p>
-      <w:r>
-        <w:t>For jeg kjenner forskjellen. Jeg har levd lenge nå side om side med julemagien. Lenge nok til å kjenne den i marg og bein, like tydelig som et fotavtrykk i min egen trapp. Dette var ikke et barn med kalde fingre. Magien var løs i Frost Falls. Den hadde vært løs siden vi kom, på jakt etter et hjem. Mannen min holdt på å bygge et til den. Langsomt og tålmodig i verkstedet sitt, et ildsted for den å finne hvile i, og den kom nærmere ilden for hver dag som gikk. Men den hadde ikke funnet roen ennå. Den var fremdeles ute i byen om natten, varm og klumsete og helt uten ondskap, og gjorde de små, umulige tingene som magi gjør når den har mer følelser enn fornuft. Gjorde festivallysene om fra oransje til gule. Og nå, å dømme etter dette, gikk den rundt og snudde barns snømenn i mørket slik at de så mot det som hadde fanget dens omflakkende oppmerksomhet.</w:t>
-      </w:r>
-    </w:p>
-    <w:p/>
-    <w:p>
-      <w:r>
-        <w:t>Jeg så fra den snudde snømannen oppover kvartalet mot de papirkledde vinduene i det gamle Fenwick-lokalet, akkurat dit pinjearmene dens pekte, og tenkte at magien, uansett hva annet man måtte si om den, alltid hadde hatt en nese for hva som betød noe før jeg selv hadde det.</w:t>
-      </w:r>
-    </w:p>
-    <w:p/>
-    <w:p>
-      <w:r>
-        <w:t>Men jeg sa ikke noe av dette til sirkelen. Jeg tok en sirupsnipp, sa nei til Pip da hun kastet et blikk på smulene, og satte meg ned igjen med kransen min. Jeg bandt granbaret på plass, kvist for kvist, alle pekende i samme retning. Bak meg knitret det i en vedkubbe i ovnen, og kvinnene skravlet. Snøen lå lys på plenen med en enkelt snømann snudd feil vei. Noe var i emning. Jeg stolte på det kjølige grøsset i nakken, og det ble værende hos meg hele morgenen.</w:t>
+        <w:t xml:space="preserve">Og det var jo det fornuftige synet, og syklubben kjøpte det, og noen sa at unger i dag og en annen sa at det aldri snødde slik som dette da jeg var jente, og praten gikk videre, som syklubbprat gjerne gjør, og Ivy hentet en ny sirupsnipp. Men jeg ble stående ved vinduet et øyeblikk lenger enn de andre, med den halvferdige kransen i hånden. Jeg så på den snømannen i midten som vendte oppover kvartalet. Jeg så på den glatte, urørte snøen som ingen skøyeraktige støvler hadde rørt ved. Og jeg sa ikke høyt det jeg tenkte.</w:t>
+      </w:r>
+    </w:p>
+    <w:p/>
+    <w:p>
+      <w:r>
+        <w:t xml:space="preserve">For jeg kjenner forskjellen. Jeg har levd lenge nå side om side med julemagien. Lenge nok til å kjenne den i marg og bein, like tydelig som et fotavtrykk i min egen trapp. Dette var ikke et barn med kalde fingre. Magien var løs i Frost Falls. Den hadde vært løs siden vi kom, på jakt etter et hjem. Mannen min holdt på å bygge et til den. Langsomt og tålmodig i verkstedet sitt, et ildsted for den å finne hvile i, og den kom nærmere ilden for hver dag som gikk. Men den hadde ikke funnet roen ennå. Den var fremdeles ute i byen om natten, varm og klumsete og helt uten ondskap, og gjorde de små, umulige tingene som magi gjør når den har mer følelser enn fornuft. Gjorde festivallysene om fra oransje til gylne. Og nå, å dømme etter dette, gikk den rundt og snudde barns snømenn i mørket slik at de så mot det som hadde fanget dens omflakkende oppmerksomhet.</w:t>
+      </w:r>
+    </w:p>
+    <w:p/>
+    <w:p>
+      <w:r>
+        <w:t xml:space="preserve">Jeg så fra den snudde snømannen oppover kvartalet mot de papirkledde vinduene i det gamle Fenwick-lokalet, akkurat dit pinnearmene dens pekte, og tenkte at magien, uansett hva annet man måtte si om den, alltid hadde hatt en nese for hva som betydde noe før jeg selv hadde det.</w:t>
+      </w:r>
+    </w:p>
+    <w:p/>
+    <w:p>
+      <w:r>
+        <w:t xml:space="preserve">Men jeg sa ikke noe av dette til syklubben. Jeg tok en sirupsnipp, sa nei til Pip da hun kastet et blikk på smulene, og satte meg ned igjen med kransen min. Jeg bandt granbaret på plass, kvist for kvist, alle pekende i samme retning. Bak meg knitret det i en vedkubbe i ovnen, og kvinnene skravlet. Snøen lå lys på allmenningen med en enkelt snømann snudd feil vei. Noe var i emning. Jeg stolte på det kjølige grøsset i nakken, og det ble værende hos meg hele morgenen.</w:t>
       </w:r>
     </w:p>
     <w:p/>

</xml_diff>